<commit_message>
Manual docx: bake real TOC page numbers (was showing 1 for every entry)
docx-js emits the TOC as an empty field, so before the reader pressed F9
every entry showed page 1. Replace the empty field with a pre-built TOC:
heading bookmarks + per-entry hyperlinks with computed page numbers and dot
leaders. Now correct on first open in any viewer; still updatable in Word.
Page numbers computed from the rendered PDF (Title=1 ... section 9=15).
</commit_message>
<xml_diff>
--- a/docs/USER_MANUAL.docx
+++ b/docs/USER_MANUAL.docx
@@ -7,9 +7,11 @@
         <w:pStyle w:val="Title"/>
         <w:spacing w:after="240"/>
       </w:pPr>
+      <w:bookmarkStart w:id="9000" w:name="_Toc_cu_0"/>
       <w:r>
         <w:t xml:space="preserve">CUupdateTool — User Manual</w:t>
       </w:r>
+      <w:bookmarkEnd w:id="9000"/>
     </w:p>
     <w:p>
       <w:pPr>
@@ -52,10 +54,1772 @@
       <w:sdtContent>
         <w:p>
           <w:r>
-            <w:fldChar w:fldCharType="begin" w:dirty="true"/>
+            <w:fldChar w:fldCharType="begin"/>
+          </w:r>
+          <w:r>
             <w:instrText xml:space="preserve">TOC \h \o "1-3"</w:instrText>
+          </w:r>
+          <w:r>
             <w:fldChar w:fldCharType="separate"/>
           </w:r>
+        </w:p>
+        <w:p>
+          <w:pPr>
+            <w:tabs>
+              <w:tab w:val="right" w:leader="dot" w:pos="9360"/>
+            </w:tabs>
+            <w:spacing w:after="40"/>
+            <w:rPr>
+              <w:noProof/>
+            </w:rPr>
+          </w:pPr>
+          <w:hyperlink w:anchor="_Toc_cu_0">
+            <w:r>
+              <w:rPr>
+                <w:noProof/>
+              </w:rPr>
+              <w:t xml:space="preserve">CUupdateTool — User Manual</w:t>
+            </w:r>
+          </w:hyperlink>
+          <w:r>
+            <w:rPr>
+              <w:noProof/>
+            </w:rPr>
+            <w:tab/>
+          </w:r>
+          <w:hyperlink w:anchor="_Toc_cu_0">
+            <w:r>
+              <w:rPr>
+                <w:noProof/>
+              </w:rPr>
+              <w:t>1</w:t>
+            </w:r>
+          </w:hyperlink>
+        </w:p>
+        <w:p>
+          <w:pPr>
+            <w:tabs>
+              <w:tab w:val="right" w:leader="dot" w:pos="9360"/>
+            </w:tabs>
+            <w:spacing w:after="40"/>
+            <w:rPr>
+              <w:noProof/>
+            </w:rPr>
+          </w:pPr>
+          <w:hyperlink w:anchor="_Toc_cu_1">
+            <w:r>
+              <w:rPr>
+                <w:noProof/>
+              </w:rPr>
+              <w:t xml:space="preserve">1. What the tool does</w:t>
+            </w:r>
+          </w:hyperlink>
+          <w:r>
+            <w:rPr>
+              <w:noProof/>
+            </w:rPr>
+            <w:tab/>
+          </w:r>
+          <w:hyperlink w:anchor="_Toc_cu_1">
+            <w:r>
+              <w:rPr>
+                <w:noProof/>
+              </w:rPr>
+              <w:t>2</w:t>
+            </w:r>
+          </w:hyperlink>
+        </w:p>
+        <w:p>
+          <w:pPr>
+            <w:tabs>
+              <w:tab w:val="right" w:leader="dot" w:pos="9360"/>
+            </w:tabs>
+            <w:spacing w:after="40"/>
+            <w:ind w:left="360"/>
+            <w:rPr>
+              <w:noProof/>
+            </w:rPr>
+          </w:pPr>
+          <w:hyperlink w:anchor="_Toc_cu_2">
+            <w:r>
+              <w:rPr>
+                <w:noProof/>
+              </w:rPr>
+              <w:t xml:space="preserve">1.1 The problem it solves</w:t>
+            </w:r>
+          </w:hyperlink>
+          <w:r>
+            <w:rPr>
+              <w:noProof/>
+            </w:rPr>
+            <w:tab/>
+          </w:r>
+          <w:hyperlink w:anchor="_Toc_cu_2">
+            <w:r>
+              <w:rPr>
+                <w:noProof/>
+              </w:rPr>
+              <w:t>2</w:t>
+            </w:r>
+          </w:hyperlink>
+        </w:p>
+        <w:p>
+          <w:pPr>
+            <w:tabs>
+              <w:tab w:val="right" w:leader="dot" w:pos="9360"/>
+            </w:tabs>
+            <w:spacing w:after="40"/>
+            <w:ind w:left="360"/>
+            <w:rPr>
+              <w:noProof/>
+            </w:rPr>
+          </w:pPr>
+          <w:hyperlink w:anchor="_Toc_cu_3">
+            <w:r>
+              <w:rPr>
+                <w:noProof/>
+              </w:rPr>
+              <w:t xml:space="preserve">1.2 The A / B to C model</w:t>
+            </w:r>
+          </w:hyperlink>
+          <w:r>
+            <w:rPr>
+              <w:noProof/>
+            </w:rPr>
+            <w:tab/>
+          </w:r>
+          <w:hyperlink w:anchor="_Toc_cu_3">
+            <w:r>
+              <w:rPr>
+                <w:noProof/>
+              </w:rPr>
+              <w:t>2</w:t>
+            </w:r>
+          </w:hyperlink>
+        </w:p>
+        <w:p>
+          <w:pPr>
+            <w:tabs>
+              <w:tab w:val="right" w:leader="dot" w:pos="9360"/>
+            </w:tabs>
+            <w:spacing w:after="40"/>
+            <w:ind w:left="360"/>
+            <w:rPr>
+              <w:noProof/>
+            </w:rPr>
+          </w:pPr>
+          <w:hyperlink w:anchor="_Toc_cu_4">
+            <w:r>
+              <w:rPr>
+                <w:noProof/>
+              </w:rPr>
+              <w:t xml:space="preserve">1.3 What the tool does not do</w:t>
+            </w:r>
+          </w:hyperlink>
+          <w:r>
+            <w:rPr>
+              <w:noProof/>
+            </w:rPr>
+            <w:tab/>
+          </w:r>
+          <w:hyperlink w:anchor="_Toc_cu_4">
+            <w:r>
+              <w:rPr>
+                <w:noProof/>
+              </w:rPr>
+              <w:t>2</w:t>
+            </w:r>
+          </w:hyperlink>
+        </w:p>
+        <w:p>
+          <w:pPr>
+            <w:tabs>
+              <w:tab w:val="right" w:leader="dot" w:pos="9360"/>
+            </w:tabs>
+            <w:spacing w:after="40"/>
+            <w:ind w:left="360"/>
+            <w:rPr>
+              <w:noProof/>
+            </w:rPr>
+          </w:pPr>
+          <w:hyperlink w:anchor="_Toc_cu_5">
+            <w:r>
+              <w:rPr>
+                <w:noProof/>
+              </w:rPr>
+              <w:t xml:space="preserve">1.4 The safety rule that governs everything: the whole-object gate</w:t>
+            </w:r>
+          </w:hyperlink>
+          <w:r>
+            <w:rPr>
+              <w:noProof/>
+            </w:rPr>
+            <w:tab/>
+          </w:r>
+          <w:hyperlink w:anchor="_Toc_cu_5">
+            <w:r>
+              <w:rPr>
+                <w:noProof/>
+              </w:rPr>
+              <w:t>2</w:t>
+            </w:r>
+          </w:hyperlink>
+        </w:p>
+        <w:p>
+          <w:pPr>
+            <w:tabs>
+              <w:tab w:val="right" w:leader="dot" w:pos="9360"/>
+            </w:tabs>
+            <w:spacing w:after="40"/>
+            <w:rPr>
+              <w:noProof/>
+            </w:rPr>
+          </w:pPr>
+          <w:hyperlink w:anchor="_Toc_cu_6">
+            <w:r>
+              <w:rPr>
+                <w:noProof/>
+              </w:rPr>
+              <w:t xml:space="preserve">2. Starting the tool</w:t>
+            </w:r>
+          </w:hyperlink>
+          <w:r>
+            <w:rPr>
+              <w:noProof/>
+            </w:rPr>
+            <w:tab/>
+          </w:r>
+          <w:hyperlink w:anchor="_Toc_cu_6">
+            <w:r>
+              <w:rPr>
+                <w:noProof/>
+              </w:rPr>
+              <w:t>3</w:t>
+            </w:r>
+          </w:hyperlink>
+        </w:p>
+        <w:p>
+          <w:pPr>
+            <w:tabs>
+              <w:tab w:val="right" w:leader="dot" w:pos="9360"/>
+            </w:tabs>
+            <w:spacing w:after="40"/>
+            <w:ind w:left="360"/>
+            <w:rPr>
+              <w:noProof/>
+            </w:rPr>
+          </w:pPr>
+          <w:hyperlink w:anchor="_Toc_cu_7">
+            <w:r>
+              <w:rPr>
+                <w:noProof/>
+              </w:rPr>
+              <w:t xml:space="preserve">2.1 The application</w:t>
+            </w:r>
+          </w:hyperlink>
+          <w:r>
+            <w:rPr>
+              <w:noProof/>
+            </w:rPr>
+            <w:tab/>
+          </w:r>
+          <w:hyperlink w:anchor="_Toc_cu_7">
+            <w:r>
+              <w:rPr>
+                <w:noProof/>
+              </w:rPr>
+              <w:t>3</w:t>
+            </w:r>
+          </w:hyperlink>
+        </w:p>
+        <w:p>
+          <w:pPr>
+            <w:tabs>
+              <w:tab w:val="right" w:leader="dot" w:pos="9360"/>
+            </w:tabs>
+            <w:spacing w:after="40"/>
+            <w:ind w:left="360"/>
+            <w:rPr>
+              <w:noProof/>
+            </w:rPr>
+          </w:pPr>
+          <w:hyperlink w:anchor="_Toc_cu_8">
+            <w:r>
+              <w:rPr>
+                <w:noProof/>
+              </w:rPr>
+              <w:t xml:space="preserve">2.2 The window</w:t>
+            </w:r>
+          </w:hyperlink>
+          <w:r>
+            <w:rPr>
+              <w:noProof/>
+            </w:rPr>
+            <w:tab/>
+          </w:r>
+          <w:hyperlink w:anchor="_Toc_cu_8">
+            <w:r>
+              <w:rPr>
+                <w:noProof/>
+              </w:rPr>
+              <w:t>3</w:t>
+            </w:r>
+          </w:hyperlink>
+        </w:p>
+        <w:p>
+          <w:pPr>
+            <w:tabs>
+              <w:tab w:val="right" w:leader="dot" w:pos="9360"/>
+            </w:tabs>
+            <w:spacing w:after="40"/>
+            <w:rPr>
+              <w:noProof/>
+            </w:rPr>
+          </w:pPr>
+          <w:hyperlink w:anchor="_Toc_cu_9">
+            <w:r>
+              <w:rPr>
+                <w:noProof/>
+              </w:rPr>
+              <w:t xml:space="preserve">3. Preparing a job folder</w:t>
+            </w:r>
+          </w:hyperlink>
+          <w:r>
+            <w:rPr>
+              <w:noProof/>
+            </w:rPr>
+            <w:tab/>
+          </w:r>
+          <w:hyperlink w:anchor="_Toc_cu_9">
+            <w:r>
+              <w:rPr>
+                <w:noProof/>
+              </w:rPr>
+              <w:t>4</w:t>
+            </w:r>
+          </w:hyperlink>
+        </w:p>
+        <w:p>
+          <w:pPr>
+            <w:tabs>
+              <w:tab w:val="right" w:leader="dot" w:pos="9360"/>
+            </w:tabs>
+            <w:spacing w:after="40"/>
+            <w:ind w:left="360"/>
+            <w:rPr>
+              <w:noProof/>
+            </w:rPr>
+          </w:pPr>
+          <w:hyperlink w:anchor="_Toc_cu_10">
+            <w:r>
+              <w:rPr>
+                <w:noProof/>
+              </w:rPr>
+              <w:t xml:space="preserve">3.1 The required folder structure</w:t>
+            </w:r>
+          </w:hyperlink>
+          <w:r>
+            <w:rPr>
+              <w:noProof/>
+            </w:rPr>
+            <w:tab/>
+          </w:r>
+          <w:hyperlink w:anchor="_Toc_cu_10">
+            <w:r>
+              <w:rPr>
+                <w:noProof/>
+              </w:rPr>
+              <w:t>4</w:t>
+            </w:r>
+          </w:hyperlink>
+        </w:p>
+        <w:p>
+          <w:pPr>
+            <w:tabs>
+              <w:tab w:val="right" w:leader="dot" w:pos="9360"/>
+            </w:tabs>
+            <w:spacing w:after="40"/>
+            <w:ind w:left="360"/>
+            <w:rPr>
+              <w:noProof/>
+            </w:rPr>
+          </w:pPr>
+          <w:hyperlink w:anchor="_Toc_cu_11">
+            <w:r>
+              <w:rPr>
+                <w:noProof/>
+              </w:rPr>
+              <w:t xml:space="preserve">3.2 Strip the language layer before export</w:t>
+            </w:r>
+          </w:hyperlink>
+          <w:r>
+            <w:rPr>
+              <w:noProof/>
+            </w:rPr>
+            <w:tab/>
+          </w:r>
+          <w:hyperlink w:anchor="_Toc_cu_11">
+            <w:r>
+              <w:rPr>
+                <w:noProof/>
+              </w:rPr>
+              <w:t>5</w:t>
+            </w:r>
+          </w:hyperlink>
+        </w:p>
+        <w:p>
+          <w:pPr>
+            <w:tabs>
+              <w:tab w:val="right" w:leader="dot" w:pos="9360"/>
+            </w:tabs>
+            <w:spacing w:after="40"/>
+            <w:ind w:left="360"/>
+            <w:rPr>
+              <w:noProof/>
+            </w:rPr>
+          </w:pPr>
+          <w:hyperlink w:anchor="_Toc_cu_12">
+            <w:r>
+              <w:rPr>
+                <w:noProof/>
+              </w:rPr>
+              <w:t xml:space="preserve">3.3 What to leave out of a job</w:t>
+            </w:r>
+          </w:hyperlink>
+          <w:r>
+            <w:rPr>
+              <w:noProof/>
+            </w:rPr>
+            <w:tab/>
+          </w:r>
+          <w:hyperlink w:anchor="_Toc_cu_12">
+            <w:r>
+              <w:rPr>
+                <w:noProof/>
+              </w:rPr>
+              <w:t>5</w:t>
+            </w:r>
+          </w:hyperlink>
+        </w:p>
+        <w:p>
+          <w:pPr>
+            <w:tabs>
+              <w:tab w:val="right" w:leader="dot" w:pos="9360"/>
+            </w:tabs>
+            <w:spacing w:after="40"/>
+            <w:rPr>
+              <w:noProof/>
+            </w:rPr>
+          </w:pPr>
+          <w:hyperlink w:anchor="_Toc_cu_13">
+            <w:r>
+              <w:rPr>
+                <w:noProof/>
+              </w:rPr>
+              <w:t xml:space="preserve">4. Running a merge</w:t>
+            </w:r>
+          </w:hyperlink>
+          <w:r>
+            <w:rPr>
+              <w:noProof/>
+            </w:rPr>
+            <w:tab/>
+          </w:r>
+          <w:hyperlink w:anchor="_Toc_cu_13">
+            <w:r>
+              <w:rPr>
+                <w:noProof/>
+              </w:rPr>
+              <w:t>5</w:t>
+            </w:r>
+          </w:hyperlink>
+        </w:p>
+        <w:p>
+          <w:pPr>
+            <w:tabs>
+              <w:tab w:val="right" w:leader="dot" w:pos="9360"/>
+            </w:tabs>
+            <w:spacing w:after="40"/>
+            <w:ind w:left="360"/>
+            <w:rPr>
+              <w:noProof/>
+            </w:rPr>
+          </w:pPr>
+          <w:hyperlink w:anchor="_Toc_cu_14">
+            <w:r>
+              <w:rPr>
+                <w:noProof/>
+              </w:rPr>
+              <w:t xml:space="preserve">4.1 Steps</w:t>
+            </w:r>
+          </w:hyperlink>
+          <w:r>
+            <w:rPr>
+              <w:noProof/>
+            </w:rPr>
+            <w:tab/>
+          </w:r>
+          <w:hyperlink w:anchor="_Toc_cu_14">
+            <w:r>
+              <w:rPr>
+                <w:noProof/>
+              </w:rPr>
+              <w:t>5</w:t>
+            </w:r>
+          </w:hyperlink>
+        </w:p>
+        <w:p>
+          <w:pPr>
+            <w:tabs>
+              <w:tab w:val="right" w:leader="dot" w:pos="9360"/>
+            </w:tabs>
+            <w:spacing w:after="40"/>
+            <w:ind w:left="360"/>
+            <w:rPr>
+              <w:noProof/>
+            </w:rPr>
+          </w:pPr>
+          <w:hyperlink w:anchor="_Toc_cu_15">
+            <w:r>
+              <w:rPr>
+                <w:noProof/>
+              </w:rPr>
+              <w:t xml:space="preserve">4.2 What "Run merge" does</w:t>
+            </w:r>
+          </w:hyperlink>
+          <w:r>
+            <w:rPr>
+              <w:noProof/>
+            </w:rPr>
+            <w:tab/>
+          </w:r>
+          <w:hyperlink w:anchor="_Toc_cu_15">
+            <w:r>
+              <w:rPr>
+                <w:noProof/>
+              </w:rPr>
+              <w:t>5</w:t>
+            </w:r>
+          </w:hyperlink>
+        </w:p>
+        <w:p>
+          <w:pPr>
+            <w:tabs>
+              <w:tab w:val="right" w:leader="dot" w:pos="9360"/>
+            </w:tabs>
+            <w:spacing w:after="40"/>
+            <w:ind w:left="360"/>
+            <w:rPr>
+              <w:noProof/>
+            </w:rPr>
+          </w:pPr>
+          <w:hyperlink w:anchor="_Toc_cu_16">
+            <w:r>
+              <w:rPr>
+                <w:noProof/>
+              </w:rPr>
+              <w:t xml:space="preserve">4.3 The two date formats</w:t>
+            </w:r>
+          </w:hyperlink>
+          <w:r>
+            <w:rPr>
+              <w:noProof/>
+            </w:rPr>
+            <w:tab/>
+          </w:r>
+          <w:hyperlink w:anchor="_Toc_cu_16">
+            <w:r>
+              <w:rPr>
+                <w:noProof/>
+              </w:rPr>
+              <w:t>6</w:t>
+            </w:r>
+          </w:hyperlink>
+        </w:p>
+        <w:p>
+          <w:pPr>
+            <w:tabs>
+              <w:tab w:val="right" w:leader="dot" w:pos="9360"/>
+            </w:tabs>
+            <w:spacing w:after="40"/>
+            <w:ind w:left="360"/>
+            <w:rPr>
+              <w:noProof/>
+            </w:rPr>
+          </w:pPr>
+          <w:hyperlink w:anchor="_Toc_cu_17">
+            <w:r>
+              <w:rPr>
+                <w:noProof/>
+              </w:rPr>
+              <w:t xml:space="preserve">4.4 The customer tags are determined automatically</w:t>
+            </w:r>
+          </w:hyperlink>
+          <w:r>
+            <w:rPr>
+              <w:noProof/>
+            </w:rPr>
+            <w:tab/>
+          </w:r>
+          <w:hyperlink w:anchor="_Toc_cu_17">
+            <w:r>
+              <w:rPr>
+                <w:noProof/>
+              </w:rPr>
+              <w:t>6</w:t>
+            </w:r>
+          </w:hyperlink>
+        </w:p>
+        <w:p>
+          <w:pPr>
+            <w:tabs>
+              <w:tab w:val="right" w:leader="dot" w:pos="9360"/>
+            </w:tabs>
+            <w:spacing w:after="40"/>
+            <w:rPr>
+              <w:noProof/>
+            </w:rPr>
+          </w:pPr>
+          <w:hyperlink w:anchor="_Toc_cu_18">
+            <w:r>
+              <w:rPr>
+                <w:noProof/>
+              </w:rPr>
+              <w:t xml:space="preserve">5. Reading the results</w:t>
+            </w:r>
+          </w:hyperlink>
+          <w:r>
+            <w:rPr>
+              <w:noProof/>
+            </w:rPr>
+            <w:tab/>
+          </w:r>
+          <w:hyperlink w:anchor="_Toc_cu_18">
+            <w:r>
+              <w:rPr>
+                <w:noProof/>
+              </w:rPr>
+              <w:t>7</w:t>
+            </w:r>
+          </w:hyperlink>
+        </w:p>
+        <w:p>
+          <w:pPr>
+            <w:tabs>
+              <w:tab w:val="right" w:leader="dot" w:pos="9360"/>
+            </w:tabs>
+            <w:spacing w:after="40"/>
+            <w:ind w:left="360"/>
+            <w:rPr>
+              <w:noProof/>
+            </w:rPr>
+          </w:pPr>
+          <w:hyperlink w:anchor="_Toc_cu_19">
+            <w:r>
+              <w:rPr>
+                <w:noProof/>
+              </w:rPr>
+              <w:t xml:space="preserve">5.1 Use Dry run first</w:t>
+            </w:r>
+          </w:hyperlink>
+          <w:r>
+            <w:rPr>
+              <w:noProof/>
+            </w:rPr>
+            <w:tab/>
+          </w:r>
+          <w:hyperlink w:anchor="_Toc_cu_19">
+            <w:r>
+              <w:rPr>
+                <w:noProof/>
+              </w:rPr>
+              <w:t>7</w:t>
+            </w:r>
+          </w:hyperlink>
+        </w:p>
+        <w:p>
+          <w:pPr>
+            <w:tabs>
+              <w:tab w:val="right" w:leader="dot" w:pos="9360"/>
+            </w:tabs>
+            <w:spacing w:after="40"/>
+            <w:ind w:left="360"/>
+            <w:rPr>
+              <w:noProof/>
+            </w:rPr>
+          </w:pPr>
+          <w:hyperlink w:anchor="_Toc_cu_20">
+            <w:r>
+              <w:rPr>
+                <w:noProof/>
+              </w:rPr>
+              <w:t xml:space="preserve">5.2 Where the files go after a merge</w:t>
+            </w:r>
+          </w:hyperlink>
+          <w:r>
+            <w:rPr>
+              <w:noProof/>
+            </w:rPr>
+            <w:tab/>
+          </w:r>
+          <w:hyperlink w:anchor="_Toc_cu_20">
+            <w:r>
+              <w:rPr>
+                <w:noProof/>
+              </w:rPr>
+              <w:t>7</w:t>
+            </w:r>
+          </w:hyperlink>
+        </w:p>
+        <w:p>
+          <w:pPr>
+            <w:tabs>
+              <w:tab w:val="right" w:leader="dot" w:pos="9360"/>
+            </w:tabs>
+            <w:spacing w:after="40"/>
+            <w:ind w:left="360"/>
+            <w:rPr>
+              <w:noProof/>
+            </w:rPr>
+          </w:pPr>
+          <w:hyperlink w:anchor="_Toc_cu_21">
+            <w:r>
+              <w:rPr>
+                <w:noProof/>
+              </w:rPr>
+              <w:t xml:space="preserve">5.3 The manual-review report</w:t>
+            </w:r>
+          </w:hyperlink>
+          <w:r>
+            <w:rPr>
+              <w:noProof/>
+            </w:rPr>
+            <w:tab/>
+          </w:r>
+          <w:hyperlink w:anchor="_Toc_cu_21">
+            <w:r>
+              <w:rPr>
+                <w:noProof/>
+              </w:rPr>
+              <w:t>7</w:t>
+            </w:r>
+          </w:hyperlink>
+        </w:p>
+        <w:p>
+          <w:pPr>
+            <w:tabs>
+              <w:tab w:val="right" w:leader="dot" w:pos="9360"/>
+            </w:tabs>
+            <w:spacing w:after="40"/>
+            <w:ind w:left="360"/>
+            <w:rPr>
+              <w:noProof/>
+            </w:rPr>
+          </w:pPr>
+          <w:hyperlink w:anchor="_Toc_cu_22">
+            <w:r>
+              <w:rPr>
+                <w:noProof/>
+              </w:rPr>
+              <w:t xml:space="preserve">5.4 What the report tells you about the customer tags</w:t>
+            </w:r>
+          </w:hyperlink>
+          <w:r>
+            <w:rPr>
+              <w:noProof/>
+            </w:rPr>
+            <w:tab/>
+          </w:r>
+          <w:hyperlink w:anchor="_Toc_cu_22">
+            <w:r>
+              <w:rPr>
+                <w:noProof/>
+              </w:rPr>
+              <w:t>8</w:t>
+            </w:r>
+          </w:hyperlink>
+        </w:p>
+        <w:p>
+          <w:pPr>
+            <w:tabs>
+              <w:tab w:val="right" w:leader="dot" w:pos="9360"/>
+            </w:tabs>
+            <w:spacing w:after="40"/>
+            <w:rPr>
+              <w:noProof/>
+            </w:rPr>
+          </w:pPr>
+          <w:hyperlink w:anchor="_Toc_cu_23">
+            <w:r>
+              <w:rPr>
+                <w:noProof/>
+              </w:rPr>
+              <w:t xml:space="preserve">6. After the merge</w:t>
+            </w:r>
+          </w:hyperlink>
+          <w:r>
+            <w:rPr>
+              <w:noProof/>
+            </w:rPr>
+            <w:tab/>
+          </w:r>
+          <w:hyperlink w:anchor="_Toc_cu_23">
+            <w:r>
+              <w:rPr>
+                <w:noProof/>
+              </w:rPr>
+              <w:t>9</w:t>
+            </w:r>
+          </w:hyperlink>
+        </w:p>
+        <w:p>
+          <w:pPr>
+            <w:tabs>
+              <w:tab w:val="right" w:leader="dot" w:pos="9360"/>
+            </w:tabs>
+            <w:spacing w:after="40"/>
+            <w:ind w:left="360"/>
+            <w:rPr>
+              <w:noProof/>
+            </w:rPr>
+          </w:pPr>
+          <w:hyperlink w:anchor="_Toc_cu_24">
+            <w:r>
+              <w:rPr>
+                <w:noProof/>
+              </w:rPr>
+              <w:t xml:space="preserve">6.1 The automatically merged objects</w:t>
+            </w:r>
+          </w:hyperlink>
+          <w:r>
+            <w:rPr>
+              <w:noProof/>
+            </w:rPr>
+            <w:tab/>
+          </w:r>
+          <w:hyperlink w:anchor="_Toc_cu_24">
+            <w:r>
+              <w:rPr>
+                <w:noProof/>
+              </w:rPr>
+              <w:t>9</w:t>
+            </w:r>
+          </w:hyperlink>
+        </w:p>
+        <w:p>
+          <w:pPr>
+            <w:tabs>
+              <w:tab w:val="right" w:leader="dot" w:pos="9360"/>
+            </w:tabs>
+            <w:spacing w:after="40"/>
+            <w:ind w:left="360"/>
+            <w:rPr>
+              <w:noProof/>
+            </w:rPr>
+          </w:pPr>
+          <w:hyperlink w:anchor="_Toc_cu_25">
+            <w:r>
+              <w:rPr>
+                <w:noProof/>
+              </w:rPr>
+              <w:t xml:space="preserve">6.2 The manual objects</w:t>
+            </w:r>
+          </w:hyperlink>
+          <w:r>
+            <w:rPr>
+              <w:noProof/>
+            </w:rPr>
+            <w:tab/>
+          </w:r>
+          <w:hyperlink w:anchor="_Toc_cu_25">
+            <w:r>
+              <w:rPr>
+                <w:noProof/>
+              </w:rPr>
+              <w:t>9</w:t>
+            </w:r>
+          </w:hyperlink>
+        </w:p>
+        <w:p>
+          <w:pPr>
+            <w:tabs>
+              <w:tab w:val="right" w:leader="dot" w:pos="9360"/>
+            </w:tabs>
+            <w:spacing w:after="40"/>
+            <w:ind w:left="360"/>
+            <w:rPr>
+              <w:noProof/>
+            </w:rPr>
+          </w:pPr>
+          <w:hyperlink w:anchor="_Toc_cu_26">
+            <w:r>
+              <w:rPr>
+                <w:noProof/>
+              </w:rPr>
+              <w:t xml:space="preserve">6.3 Join the objects by type</w:t>
+            </w:r>
+          </w:hyperlink>
+          <w:r>
+            <w:rPr>
+              <w:noProof/>
+            </w:rPr>
+            <w:tab/>
+          </w:r>
+          <w:hyperlink w:anchor="_Toc_cu_26">
+            <w:r>
+              <w:rPr>
+                <w:noProof/>
+              </w:rPr>
+              <w:t>9</w:t>
+            </w:r>
+          </w:hyperlink>
+        </w:p>
+        <w:p>
+          <w:pPr>
+            <w:tabs>
+              <w:tab w:val="right" w:leader="dot" w:pos="9360"/>
+            </w:tabs>
+            <w:spacing w:after="40"/>
+            <w:ind w:left="360"/>
+            <w:rPr>
+              <w:noProof/>
+            </w:rPr>
+          </w:pPr>
+          <w:hyperlink w:anchor="_Toc_cu_27">
+            <w:r>
+              <w:rPr>
+                <w:noProof/>
+              </w:rPr>
+              <w:t xml:space="preserve">6.4 Re-apply the language layer, then compile</w:t>
+            </w:r>
+          </w:hyperlink>
+          <w:r>
+            <w:rPr>
+              <w:noProof/>
+            </w:rPr>
+            <w:tab/>
+          </w:r>
+          <w:hyperlink w:anchor="_Toc_cu_27">
+            <w:r>
+              <w:rPr>
+                <w:noProof/>
+              </w:rPr>
+              <w:t>9</w:t>
+            </w:r>
+          </w:hyperlink>
+        </w:p>
+        <w:p>
+          <w:pPr>
+            <w:tabs>
+              <w:tab w:val="right" w:leader="dot" w:pos="9360"/>
+            </w:tabs>
+            <w:spacing w:after="40"/>
+            <w:rPr>
+              <w:noProof/>
+            </w:rPr>
+          </w:pPr>
+          <w:hyperlink w:anchor="_Toc_cu_28">
+            <w:r>
+              <w:rPr>
+                <w:noProof/>
+              </w:rPr>
+              <w:t xml:space="preserve">7. Inside the application</w:t>
+            </w:r>
+          </w:hyperlink>
+          <w:r>
+            <w:rPr>
+              <w:noProof/>
+            </w:rPr>
+            <w:tab/>
+          </w:r>
+          <w:hyperlink w:anchor="_Toc_cu_28">
+            <w:r>
+              <w:rPr>
+                <w:noProof/>
+              </w:rPr>
+              <w:t>9</w:t>
+            </w:r>
+          </w:hyperlink>
+        </w:p>
+        <w:p>
+          <w:pPr>
+            <w:tabs>
+              <w:tab w:val="right" w:leader="dot" w:pos="9360"/>
+            </w:tabs>
+            <w:spacing w:after="40"/>
+            <w:rPr>
+              <w:noProof/>
+            </w:rPr>
+          </w:pPr>
+          <w:hyperlink w:anchor="_Toc_cu_29">
+            <w:r>
+              <w:rPr>
+                <w:noProof/>
+              </w:rPr>
+              <w:t xml:space="preserve">8. Rules Index by object type</w:t>
+            </w:r>
+          </w:hyperlink>
+          <w:r>
+            <w:rPr>
+              <w:noProof/>
+            </w:rPr>
+            <w:tab/>
+          </w:r>
+          <w:hyperlink w:anchor="_Toc_cu_29">
+            <w:r>
+              <w:rPr>
+                <w:noProof/>
+              </w:rPr>
+              <w:t>10</w:t>
+            </w:r>
+          </w:hyperlink>
+        </w:p>
+        <w:p>
+          <w:pPr>
+            <w:tabs>
+              <w:tab w:val="right" w:leader="dot" w:pos="9360"/>
+            </w:tabs>
+            <w:spacing w:after="40"/>
+            <w:ind w:left="360"/>
+            <w:rPr>
+              <w:noProof/>
+            </w:rPr>
+          </w:pPr>
+          <w:hyperlink w:anchor="_Toc_cu_30">
+            <w:r>
+              <w:rPr>
+                <w:noProof/>
+              </w:rPr>
+              <w:t xml:space="preserve">8.0 Object-type dispatch (all object types)</w:t>
+            </w:r>
+          </w:hyperlink>
+          <w:r>
+            <w:rPr>
+              <w:noProof/>
+            </w:rPr>
+            <w:tab/>
+          </w:r>
+          <w:hyperlink w:anchor="_Toc_cu_30">
+            <w:r>
+              <w:rPr>
+                <w:noProof/>
+              </w:rPr>
+              <w:t>10</w:t>
+            </w:r>
+          </w:hyperlink>
+        </w:p>
+        <w:p>
+          <w:pPr>
+            <w:tabs>
+              <w:tab w:val="right" w:leader="dot" w:pos="9360"/>
+            </w:tabs>
+            <w:spacing w:after="40"/>
+            <w:ind w:left="360"/>
+            <w:rPr>
+              <w:noProof/>
+            </w:rPr>
+          </w:pPr>
+          <w:hyperlink w:anchor="_Toc_cu_31">
+            <w:r>
+              <w:rPr>
+                <w:noProof/>
+              </w:rPr>
+              <w:t xml:space="preserve">8.1 Table</w:t>
+            </w:r>
+          </w:hyperlink>
+          <w:r>
+            <w:rPr>
+              <w:noProof/>
+            </w:rPr>
+            <w:tab/>
+          </w:r>
+          <w:hyperlink w:anchor="_Toc_cu_31">
+            <w:r>
+              <w:rPr>
+                <w:noProof/>
+              </w:rPr>
+              <w:t>11</w:t>
+            </w:r>
+          </w:hyperlink>
+        </w:p>
+        <w:p>
+          <w:pPr>
+            <w:tabs>
+              <w:tab w:val="right" w:leader="dot" w:pos="9360"/>
+            </w:tabs>
+            <w:spacing w:after="40"/>
+            <w:ind w:left="720"/>
+            <w:rPr>
+              <w:noProof/>
+            </w:rPr>
+          </w:pPr>
+          <w:hyperlink w:anchor="_Toc_cu_32">
+            <w:r>
+              <w:rPr>
+                <w:noProof/>
+              </w:rPr>
+              <w:t xml:space="preserve">8.1.1 Customer field added to a vendor table — CARRY (field graft)</w:t>
+            </w:r>
+          </w:hyperlink>
+          <w:r>
+            <w:rPr>
+              <w:noProof/>
+            </w:rPr>
+            <w:tab/>
+          </w:r>
+          <w:hyperlink w:anchor="_Toc_cu_32">
+            <w:r>
+              <w:rPr>
+                <w:noProof/>
+              </w:rPr>
+              <w:t>11</w:t>
+            </w:r>
+          </w:hyperlink>
+        </w:p>
+        <w:p>
+          <w:pPr>
+            <w:tabs>
+              <w:tab w:val="right" w:leader="dot" w:pos="9360"/>
+            </w:tabs>
+            <w:spacing w:after="40"/>
+            <w:ind w:left="720"/>
+            <w:rPr>
+              <w:noProof/>
+            </w:rPr>
+          </w:pPr>
+          <w:hyperlink w:anchor="_Toc_cu_33">
+            <w:r>
+              <w:rPr>
+                <w:noProof/>
+              </w:rPr>
+              <w:t xml:space="preserve">8.1.2 A changelog entry takes priority over a misleading vendor tag — CARRY</w:t>
+            </w:r>
+          </w:hyperlink>
+          <w:r>
+            <w:rPr>
+              <w:noProof/>
+            </w:rPr>
+            <w:tab/>
+          </w:r>
+          <w:hyperlink w:anchor="_Toc_cu_33">
+            <w:r>
+              <w:rPr>
+                <w:noProof/>
+              </w:rPr>
+              <w:t>11</w:t>
+            </w:r>
+          </w:hyperlink>
+        </w:p>
+        <w:p>
+          <w:pPr>
+            <w:tabs>
+              <w:tab w:val="right" w:leader="dot" w:pos="9360"/>
+            </w:tabs>
+            <w:spacing w:after="40"/>
+            <w:ind w:left="720"/>
+            <w:rPr>
+              <w:noProof/>
+            </w:rPr>
+          </w:pPr>
+          <w:hyperlink w:anchor="_Toc_cu_34">
+            <w:r>
+              <w:rPr>
+                <w:noProof/>
+              </w:rPr>
+              <w:t xml:space="preserve">8.1.3 A whole field, present only in A, with no tag and no changelog entry — MANUAL</w:t>
+            </w:r>
+          </w:hyperlink>
+          <w:r>
+            <w:rPr>
+              <w:noProof/>
+            </w:rPr>
+            <w:tab/>
+          </w:r>
+          <w:hyperlink w:anchor="_Toc_cu_34">
+            <w:r>
+              <w:rPr>
+                <w:noProof/>
+              </w:rPr>
+              <w:t>11</w:t>
+            </w:r>
+          </w:hyperlink>
+        </w:p>
+        <w:p>
+          <w:pPr>
+            <w:tabs>
+              <w:tab w:val="right" w:leader="dot" w:pos="9360"/>
+            </w:tabs>
+            <w:spacing w:after="40"/>
+            <w:ind w:left="720"/>
+            <w:rPr>
+              <w:noProof/>
+            </w:rPr>
+          </w:pPr>
+          <w:hyperlink w:anchor="_Toc_cu_35">
+            <w:r>
+              <w:rPr>
+                <w:noProof/>
+              </w:rPr>
+              <w:t xml:space="preserve">8.1.4 A customer code block inside a changed shared field or trigger — the scorer decides</w:t>
+            </w:r>
+          </w:hyperlink>
+          <w:r>
+            <w:rPr>
+              <w:noProof/>
+            </w:rPr>
+            <w:tab/>
+          </w:r>
+          <w:hyperlink w:anchor="_Toc_cu_35">
+            <w:r>
+              <w:rPr>
+                <w:noProof/>
+              </w:rPr>
+              <w:t>11</w:t>
+            </w:r>
+          </w:hyperlink>
+        </w:p>
+        <w:p>
+          <w:pPr>
+            <w:tabs>
+              <w:tab w:val="right" w:leader="dot" w:pos="9360"/>
+            </w:tabs>
+            <w:spacing w:after="40"/>
+            <w:ind w:left="720"/>
+            <w:rPr>
+              <w:noProof/>
+            </w:rPr>
+          </w:pPr>
+          <w:hyperlink w:anchor="_Toc_cu_36">
+            <w:r>
+              <w:rPr>
+                <w:noProof/>
+              </w:rPr>
+              <w:t xml:space="preserve">8.1.5 A caption or option change — CARRY (always take the customer value)</w:t>
+            </w:r>
+          </w:hyperlink>
+          <w:r>
+            <w:rPr>
+              <w:noProof/>
+            </w:rPr>
+            <w:tab/>
+          </w:r>
+          <w:hyperlink w:anchor="_Toc_cu_36">
+            <w:r>
+              <w:rPr>
+                <w:noProof/>
+              </w:rPr>
+              <w:t>12</w:t>
+            </w:r>
+          </w:hyperlink>
+        </w:p>
+        <w:p>
+          <w:pPr>
+            <w:tabs>
+              <w:tab w:val="right" w:leader="dot" w:pos="9360"/>
+            </w:tabs>
+            <w:spacing w:after="40"/>
+            <w:ind w:left="720"/>
+            <w:rPr>
+              <w:noProof/>
+            </w:rPr>
+          </w:pPr>
+          <w:hyperlink w:anchor="_Toc_cu_37">
+            <w:r>
+              <w:rPr>
+                <w:noProof/>
+              </w:rPr>
+              <w:t xml:space="preserve">8.1.6 A field with both a code change and an option change — both are carried</w:t>
+            </w:r>
+          </w:hyperlink>
+          <w:r>
+            <w:rPr>
+              <w:noProof/>
+            </w:rPr>
+            <w:tab/>
+          </w:r>
+          <w:hyperlink w:anchor="_Toc_cu_37">
+            <w:r>
+              <w:rPr>
+                <w:noProof/>
+              </w:rPr>
+              <w:t>12</w:t>
+            </w:r>
+          </w:hyperlink>
+        </w:p>
+        <w:p>
+          <w:pPr>
+            <w:tabs>
+              <w:tab w:val="right" w:leader="dot" w:pos="9360"/>
+            </w:tabs>
+            <w:spacing w:after="40"/>
+            <w:ind w:left="720"/>
+            <w:rPr>
+              <w:noProof/>
+            </w:rPr>
+          </w:pPr>
+          <w:hyperlink w:anchor="_Toc_cu_38">
+            <w:r>
+              <w:rPr>
+                <w:noProof/>
+              </w:rPr>
+              <w:t xml:space="preserve">8.1.7 Customer variable declarations — CARRY (keep rather than delete)</w:t>
+            </w:r>
+          </w:hyperlink>
+          <w:r>
+            <w:rPr>
+              <w:noProof/>
+            </w:rPr>
+            <w:tab/>
+          </w:r>
+          <w:hyperlink w:anchor="_Toc_cu_38">
+            <w:r>
+              <w:rPr>
+                <w:noProof/>
+              </w:rPr>
+              <w:t>12</w:t>
+            </w:r>
+          </w:hyperlink>
+        </w:p>
+        <w:p>
+          <w:pPr>
+            <w:tabs>
+              <w:tab w:val="right" w:leader="dot" w:pos="9360"/>
+            </w:tabs>
+            <w:spacing w:after="40"/>
+            <w:ind w:left="720"/>
+            <w:rPr>
+              <w:noProof/>
+            </w:rPr>
+          </w:pPr>
+          <w:hyperlink w:anchor="_Toc_cu_39">
+            <w:r>
+              <w:rPr>
+                <w:noProof/>
+              </w:rPr>
+              <w:t xml:space="preserve">8.1.8 A customer-extended option-string variable — CARRY</w:t>
+            </w:r>
+          </w:hyperlink>
+          <w:r>
+            <w:rPr>
+              <w:noProof/>
+            </w:rPr>
+            <w:tab/>
+          </w:r>
+          <w:hyperlink w:anchor="_Toc_cu_39">
+            <w:r>
+              <w:rPr>
+                <w:noProof/>
+              </w:rPr>
+              <w:t>12</w:t>
+            </w:r>
+          </w:hyperlink>
+        </w:p>
+        <w:p>
+          <w:pPr>
+            <w:tabs>
+              <w:tab w:val="right" w:leader="dot" w:pos="9360"/>
+            </w:tabs>
+            <w:spacing w:after="40"/>
+            <w:ind w:left="720"/>
+            <w:rPr>
+              <w:noProof/>
+            </w:rPr>
+          </w:pPr>
+          <w:hyperlink w:anchor="_Toc_cu_40">
+            <w:r>
+              <w:rPr>
+                <w:noProof/>
+              </w:rPr>
+              <w:t xml:space="preserve">8.1.9 Header and changelog bookkeeping (every automatic merge)</w:t>
+            </w:r>
+          </w:hyperlink>
+          <w:r>
+            <w:rPr>
+              <w:noProof/>
+            </w:rPr>
+            <w:tab/>
+          </w:r>
+          <w:hyperlink w:anchor="_Toc_cu_40">
+            <w:r>
+              <w:rPr>
+                <w:noProof/>
+              </w:rPr>
+              <w:t>12</w:t>
+            </w:r>
+          </w:hyperlink>
+        </w:p>
+        <w:p>
+          <w:pPr>
+            <w:tabs>
+              <w:tab w:val="right" w:leader="dot" w:pos="9360"/>
+            </w:tabs>
+            <w:spacing w:after="40"/>
+            <w:ind w:left="720"/>
+            <w:rPr>
+              <w:noProof/>
+            </w:rPr>
+          </w:pPr>
+          <w:hyperlink w:anchor="_Toc_cu_41">
+            <w:r>
+              <w:rPr>
+                <w:noProof/>
+              </w:rPr>
+              <w:t xml:space="preserve">8.1.10 Differences in tag spelling are standardised</w:t>
+            </w:r>
+          </w:hyperlink>
+          <w:r>
+            <w:rPr>
+              <w:noProof/>
+            </w:rPr>
+            <w:tab/>
+          </w:r>
+          <w:hyperlink w:anchor="_Toc_cu_41">
+            <w:r>
+              <w:rPr>
+                <w:noProof/>
+              </w:rPr>
+              <w:t>13</w:t>
+            </w:r>
+          </w:hyperlink>
+        </w:p>
+        <w:p>
+          <w:pPr>
+            <w:tabs>
+              <w:tab w:val="right" w:leader="dot" w:pos="9360"/>
+            </w:tabs>
+            <w:spacing w:after="40"/>
+            <w:ind w:left="360"/>
+            <w:rPr>
+              <w:noProof/>
+            </w:rPr>
+          </w:pPr>
+          <w:hyperlink w:anchor="_Toc_cu_42">
+            <w:r>
+              <w:rPr>
+                <w:noProof/>
+              </w:rPr>
+              <w:t xml:space="preserve">8.2 Codeunit</w:t>
+            </w:r>
+          </w:hyperlink>
+          <w:r>
+            <w:rPr>
+              <w:noProof/>
+            </w:rPr>
+            <w:tab/>
+          </w:r>
+          <w:hyperlink w:anchor="_Toc_cu_42">
+            <w:r>
+              <w:rPr>
+                <w:noProof/>
+              </w:rPr>
+              <w:t>13</w:t>
+            </w:r>
+          </w:hyperlink>
+        </w:p>
+        <w:p>
+          <w:pPr>
+            <w:tabs>
+              <w:tab w:val="right" w:leader="dot" w:pos="9360"/>
+            </w:tabs>
+            <w:spacing w:after="40"/>
+            <w:ind w:left="360"/>
+            <w:rPr>
+              <w:noProof/>
+            </w:rPr>
+          </w:pPr>
+          <w:hyperlink w:anchor="_Toc_cu_43">
+            <w:r>
+              <w:rPr>
+                <w:noProof/>
+              </w:rPr>
+              <w:t xml:space="preserve">8.3 Page</w:t>
+            </w:r>
+          </w:hyperlink>
+          <w:r>
+            <w:rPr>
+              <w:noProof/>
+            </w:rPr>
+            <w:tab/>
+          </w:r>
+          <w:hyperlink w:anchor="_Toc_cu_43">
+            <w:r>
+              <w:rPr>
+                <w:noProof/>
+              </w:rPr>
+              <w:t>13</w:t>
+            </w:r>
+          </w:hyperlink>
+        </w:p>
+        <w:p>
+          <w:pPr>
+            <w:tabs>
+              <w:tab w:val="right" w:leader="dot" w:pos="9360"/>
+            </w:tabs>
+            <w:spacing w:after="40"/>
+            <w:ind w:left="720"/>
+            <w:rPr>
+              <w:noProof/>
+            </w:rPr>
+          </w:pPr>
+          <w:hyperlink w:anchor="_Toc_cu_44">
+            <w:r>
+              <w:rPr>
+                <w:noProof/>
+              </w:rPr>
+              <w:t xml:space="preserve">8.3.1 A control added by the customer — CARRY (graft)</w:t>
+            </w:r>
+          </w:hyperlink>
+          <w:r>
+            <w:rPr>
+              <w:noProof/>
+            </w:rPr>
+            <w:tab/>
+          </w:r>
+          <w:hyperlink w:anchor="_Toc_cu_44">
+            <w:r>
+              <w:rPr>
+                <w:noProof/>
+              </w:rPr>
+              <w:t>13</w:t>
+            </w:r>
+          </w:hyperlink>
+        </w:p>
+        <w:p>
+          <w:pPr>
+            <w:tabs>
+              <w:tab w:val="right" w:leader="dot" w:pos="9360"/>
+            </w:tabs>
+            <w:spacing w:after="40"/>
+            <w:ind w:left="720"/>
+            <w:rPr>
+              <w:noProof/>
+            </w:rPr>
+          </w:pPr>
+          <w:hyperlink w:anchor="_Toc_cu_45">
+            <w:r>
+              <w:rPr>
+                <w:noProof/>
+              </w:rPr>
+              <w:t xml:space="preserve">8.3.2 A vendor caption rename — TAKE B (do not carry the outdated customer caption)</w:t>
+            </w:r>
+          </w:hyperlink>
+          <w:r>
+            <w:rPr>
+              <w:noProof/>
+            </w:rPr>
+            <w:tab/>
+          </w:r>
+          <w:hyperlink w:anchor="_Toc_cu_45">
+            <w:r>
+              <w:rPr>
+                <w:noProof/>
+              </w:rPr>
+              <w:t>14</w:t>
+            </w:r>
+          </w:hyperlink>
+        </w:p>
+        <w:p>
+          <w:pPr>
+            <w:tabs>
+              <w:tab w:val="right" w:leader="dot" w:pos="9360"/>
+            </w:tabs>
+            <w:spacing w:after="40"/>
+            <w:ind w:left="720"/>
+            <w:rPr>
+              <w:noProof/>
+            </w:rPr>
+          </w:pPr>
+          <w:hyperlink w:anchor="_Toc_cu_46">
+            <w:r>
+              <w:rPr>
+                <w:noProof/>
+              </w:rPr>
+              <w:t xml:space="preserve">8.3.3 A control present only in A, carrying only a vendor tag — MANUAL</w:t>
+            </w:r>
+          </w:hyperlink>
+          <w:r>
+            <w:rPr>
+              <w:noProof/>
+            </w:rPr>
+            <w:tab/>
+          </w:r>
+          <w:hyperlink w:anchor="_Toc_cu_46">
+            <w:r>
+              <w:rPr>
+                <w:noProof/>
+              </w:rPr>
+              <w:t>14</w:t>
+            </w:r>
+          </w:hyperlink>
+        </w:p>
+        <w:p>
+          <w:pPr>
+            <w:tabs>
+              <w:tab w:val="right" w:leader="dot" w:pos="9360"/>
+            </w:tabs>
+            <w:spacing w:after="40"/>
+            <w:ind w:left="720"/>
+            <w:rPr>
+              <w:noProof/>
+            </w:rPr>
+          </w:pPr>
+          <w:hyperlink w:anchor="_Toc_cu_47">
+            <w:r>
+              <w:rPr>
+                <w:noProof/>
+              </w:rPr>
+              <w:t xml:space="preserve">8.3.4 A customer change to a property on a shared control — MANUAL</w:t>
+            </w:r>
+          </w:hyperlink>
+          <w:r>
+            <w:rPr>
+              <w:noProof/>
+            </w:rPr>
+            <w:tab/>
+          </w:r>
+          <w:hyperlink w:anchor="_Toc_cu_47">
+            <w:r>
+              <w:rPr>
+                <w:noProof/>
+              </w:rPr>
+              <w:t>14</w:t>
+            </w:r>
+          </w:hyperlink>
+        </w:p>
+        <w:p>
+          <w:pPr>
+            <w:tabs>
+              <w:tab w:val="right" w:leader="dot" w:pos="9360"/>
+            </w:tabs>
+            <w:spacing w:after="40"/>
+            <w:ind w:left="720"/>
+            <w:rPr>
+              <w:noProof/>
+            </w:rPr>
+          </w:pPr>
+          <w:hyperlink w:anchor="_Toc_cu_48">
+            <w:r>
+              <w:rPr>
+                <w:noProof/>
+              </w:rPr>
+              <w:t xml:space="preserve">8.3.5 Caption capture on a page stops at the closing brace</w:t>
+            </w:r>
+          </w:hyperlink>
+          <w:r>
+            <w:rPr>
+              <w:noProof/>
+            </w:rPr>
+            <w:tab/>
+          </w:r>
+          <w:hyperlink w:anchor="_Toc_cu_48">
+            <w:r>
+              <w:rPr>
+                <w:noProof/>
+              </w:rPr>
+              <w:t>14</w:t>
+            </w:r>
+          </w:hyperlink>
+        </w:p>
+        <w:p>
+          <w:pPr>
+            <w:tabs>
+              <w:tab w:val="right" w:leader="dot" w:pos="9360"/>
+            </w:tabs>
+            <w:spacing w:after="40"/>
+            <w:ind w:left="360"/>
+            <w:rPr>
+              <w:noProof/>
+            </w:rPr>
+          </w:pPr>
+          <w:hyperlink w:anchor="_Toc_cu_49">
+            <w:r>
+              <w:rPr>
+                <w:noProof/>
+              </w:rPr>
+              <w:t xml:space="preserve">8.4 Report and XMLport</w:t>
+            </w:r>
+          </w:hyperlink>
+          <w:r>
+            <w:rPr>
+              <w:noProof/>
+            </w:rPr>
+            <w:tab/>
+          </w:r>
+          <w:hyperlink w:anchor="_Toc_cu_49">
+            <w:r>
+              <w:rPr>
+                <w:noProof/>
+              </w:rPr>
+              <w:t>14</w:t>
+            </w:r>
+          </w:hyperlink>
+        </w:p>
+        <w:p>
+          <w:pPr>
+            <w:tabs>
+              <w:tab w:val="right" w:leader="dot" w:pos="9360"/>
+            </w:tabs>
+            <w:spacing w:after="40"/>
+            <w:ind w:left="360"/>
+            <w:rPr>
+              <w:noProof/>
+            </w:rPr>
+          </w:pPr>
+          <w:hyperlink w:anchor="_Toc_cu_50">
+            <w:r>
+              <w:rPr>
+                <w:noProof/>
+              </w:rPr>
+              <w:t xml:space="preserve">8.5 Rules that apply to all object types</w:t>
+            </w:r>
+          </w:hyperlink>
+          <w:r>
+            <w:rPr>
+              <w:noProof/>
+            </w:rPr>
+            <w:tab/>
+          </w:r>
+          <w:hyperlink w:anchor="_Toc_cu_50">
+            <w:r>
+              <w:rPr>
+                <w:noProof/>
+              </w:rPr>
+              <w:t>14</w:t>
+            </w:r>
+          </w:hyperlink>
+        </w:p>
+        <w:p>
+          <w:pPr>
+            <w:tabs>
+              <w:tab w:val="right" w:leader="dot" w:pos="9360"/>
+            </w:tabs>
+            <w:spacing w:after="40"/>
+            <w:rPr>
+              <w:noProof/>
+            </w:rPr>
+          </w:pPr>
+          <w:hyperlink w:anchor="_Toc_cu_51">
+            <w:r>
+              <w:rPr>
+                <w:noProof/>
+              </w:rPr>
+              <w:t xml:space="preserve">9. Quick reference</w:t>
+            </w:r>
+          </w:hyperlink>
+          <w:r>
+            <w:rPr>
+              <w:noProof/>
+            </w:rPr>
+            <w:tab/>
+          </w:r>
+          <w:hyperlink w:anchor="_Toc_cu_51">
+            <w:r>
+              <w:rPr>
+                <w:noProof/>
+              </w:rPr>
+              <w:t>15</w:t>
+            </w:r>
+          </w:hyperlink>
         </w:p>
         <w:p>
           <w:r>
@@ -121,17 +1885,21 @@
       <w:pPr>
         <w:pStyle w:val="Heading1"/>
       </w:pPr>
+      <w:bookmarkStart w:id="9001" w:name="_Toc_cu_1"/>
       <w:r>
         <w:t xml:space="preserve">1. What the tool does</w:t>
       </w:r>
+      <w:bookmarkEnd w:id="9001"/>
     </w:p>
     <w:p>
       <w:pPr>
         <w:pStyle w:val="Heading2"/>
       </w:pPr>
+      <w:bookmarkStart w:id="9002" w:name="_Toc_cu_2"/>
       <w:r>
         <w:t xml:space="preserve">1.1 The problem it solves</w:t>
       </w:r>
+      <w:bookmarkEnd w:id="9002"/>
     </w:p>
     <w:p>
       <w:pPr>
@@ -173,9 +1941,11 @@
       <w:pPr>
         <w:pStyle w:val="Heading2"/>
       </w:pPr>
+      <w:bookmarkStart w:id="9003" w:name="_Toc_cu_3"/>
       <w:r>
         <w:t xml:space="preserve">1.2 The A / B to C model</w:t>
       </w:r>
+      <w:bookmarkEnd w:id="9003"/>
     </w:p>
     <w:p>
       <w:pPr>
@@ -257,9 +2027,11 @@
       <w:pPr>
         <w:pStyle w:val="Heading2"/>
       </w:pPr>
+      <w:bookmarkStart w:id="9004" w:name="_Toc_cu_4"/>
       <w:r>
         <w:t xml:space="preserve">1.3 What the tool does not do</w:t>
       </w:r>
+      <w:bookmarkEnd w:id="9004"/>
     </w:p>
     <w:p>
       <w:pPr>
@@ -314,9 +2086,11 @@
       <w:pPr>
         <w:pStyle w:val="Heading2"/>
       </w:pPr>
+      <w:bookmarkStart w:id="9005" w:name="_Toc_cu_5"/>
       <w:r>
         <w:t xml:space="preserve">1.4 The safety rule that governs everything: the whole-object gate</w:t>
       </w:r>
+      <w:bookmarkEnd w:id="9005"/>
     </w:p>
     <w:p>
       <w:pPr>
@@ -350,17 +2124,21 @@
       <w:pPr>
         <w:pStyle w:val="Heading1"/>
       </w:pPr>
+      <w:bookmarkStart w:id="9006" w:name="_Toc_cu_6"/>
       <w:r>
         <w:t xml:space="preserve">2. Starting the tool</w:t>
       </w:r>
+      <w:bookmarkEnd w:id="9006"/>
     </w:p>
     <w:p>
       <w:pPr>
         <w:pStyle w:val="Heading2"/>
       </w:pPr>
+      <w:bookmarkStart w:id="9007" w:name="_Toc_cu_7"/>
       <w:r>
         <w:t xml:space="preserve">2.1 The application</w:t>
       </w:r>
+      <w:bookmarkEnd w:id="9007"/>
     </w:p>
     <w:p>
       <w:pPr>
@@ -513,9 +2291,11 @@
       <w:pPr>
         <w:pStyle w:val="Heading2"/>
       </w:pPr>
+      <w:bookmarkStart w:id="9008" w:name="_Toc_cu_8"/>
       <w:r>
         <w:t xml:space="preserve">2.2 The window</w:t>
       </w:r>
+      <w:bookmarkEnd w:id="9008"/>
     </w:p>
     <w:tbl>
       <w:tblPr>
@@ -1145,9 +2925,11 @@
       <w:pPr>
         <w:pStyle w:val="Heading1"/>
       </w:pPr>
+      <w:bookmarkStart w:id="9009" w:name="_Toc_cu_9"/>
       <w:r>
         <w:t xml:space="preserve">3. Preparing a job folder</w:t>
       </w:r>
+      <w:bookmarkEnd w:id="9009"/>
     </w:p>
     <w:p>
       <w:pPr>
@@ -1161,9 +2943,11 @@
       <w:pPr>
         <w:pStyle w:val="Heading2"/>
       </w:pPr>
+      <w:bookmarkStart w:id="9010" w:name="_Toc_cu_10"/>
       <w:r>
         <w:t xml:space="preserve">3.1 The required folder structure</w:t>
       </w:r>
+      <w:bookmarkEnd w:id="9010"/>
     </w:p>
     <w:p>
       <w:pPr>
@@ -1178,101 +2962,17 @@
           <w:szCs w:val="18"/>
         </w:rPr>
         <w:t xml:space="preserve">&lt;job folder&gt;\</w:t>
-      </w:r>
-      <w:r>
-        <w:rPr>
-          <w:rFonts w:ascii="Consolas" w:cs="Consolas" w:eastAsia="Consolas" w:hAnsi="Consolas"/>
-          <w:sz w:val="18"/>
-          <w:szCs w:val="18"/>
-        </w:rPr>
         <w:br/>
-      </w:r>
-      <w:r>
-        <w:rPr>
-          <w:rFonts w:ascii="Consolas" w:cs="Consolas" w:eastAsia="Consolas" w:hAnsi="Consolas"/>
-          <w:sz w:val="18"/>
-          <w:szCs w:val="18"/>
-        </w:rPr>
         <w:t xml:space="preserve">    A\</w:t>
-      </w:r>
-      <w:r>
-        <w:rPr>
-          <w:rFonts w:ascii="Consolas" w:cs="Consolas" w:eastAsia="Consolas" w:hAnsi="Consolas"/>
-          <w:sz w:val="18"/>
-          <w:szCs w:val="18"/>
-        </w:rPr>
         <w:br/>
-      </w:r>
-      <w:r>
-        <w:rPr>
-          <w:rFonts w:ascii="Consolas" w:cs="Consolas" w:eastAsia="Consolas" w:hAnsi="Consolas"/>
-          <w:sz w:val="18"/>
-          <w:szCs w:val="18"/>
-        </w:rPr>
         <w:t xml:space="preserve">        &lt;Type&gt;\</w:t>
-      </w:r>
-      <w:r>
-        <w:rPr>
-          <w:rFonts w:ascii="Consolas" w:cs="Consolas" w:eastAsia="Consolas" w:hAnsi="Consolas"/>
-          <w:sz w:val="18"/>
-          <w:szCs w:val="18"/>
-        </w:rPr>
         <w:br/>
-      </w:r>
-      <w:r>
-        <w:rPr>
-          <w:rFonts w:ascii="Consolas" w:cs="Consolas" w:eastAsia="Consolas" w:hAnsi="Consolas"/>
-          <w:sz w:val="18"/>
-          <w:szCs w:val="18"/>
-        </w:rPr>
         <w:t xml:space="preserve">            EX-&lt;stem&gt;.txt      (the customer object, A)</w:t>
-      </w:r>
-      <w:r>
-        <w:rPr>
-          <w:rFonts w:ascii="Consolas" w:cs="Consolas" w:eastAsia="Consolas" w:hAnsi="Consolas"/>
-          <w:sz w:val="18"/>
-          <w:szCs w:val="18"/>
-        </w:rPr>
         <w:br/>
-      </w:r>
-      <w:r>
-        <w:rPr>
-          <w:rFonts w:ascii="Consolas" w:cs="Consolas" w:eastAsia="Consolas" w:hAnsi="Consolas"/>
-          <w:sz w:val="18"/>
-          <w:szCs w:val="18"/>
-        </w:rPr>
         <w:t xml:space="preserve">    B\</w:t>
-      </w:r>
-      <w:r>
-        <w:rPr>
-          <w:rFonts w:ascii="Consolas" w:cs="Consolas" w:eastAsia="Consolas" w:hAnsi="Consolas"/>
-          <w:sz w:val="18"/>
-          <w:szCs w:val="18"/>
-        </w:rPr>
         <w:br/>
-      </w:r>
-      <w:r>
-        <w:rPr>
-          <w:rFonts w:ascii="Consolas" w:cs="Consolas" w:eastAsia="Consolas" w:hAnsi="Consolas"/>
-          <w:sz w:val="18"/>
-          <w:szCs w:val="18"/>
-        </w:rPr>
         <w:t xml:space="preserve">        &lt;Type&gt;\</w:t>
-      </w:r>
-      <w:r>
-        <w:rPr>
-          <w:rFonts w:ascii="Consolas" w:cs="Consolas" w:eastAsia="Consolas" w:hAnsi="Consolas"/>
-          <w:sz w:val="18"/>
-          <w:szCs w:val="18"/>
-        </w:rPr>
         <w:br/>
-      </w:r>
-      <w:r>
-        <w:rPr>
-          <w:rFonts w:ascii="Consolas" w:cs="Consolas" w:eastAsia="Consolas" w:hAnsi="Consolas"/>
-          <w:sz w:val="18"/>
-          <w:szCs w:val="18"/>
-        </w:rPr>
         <w:t xml:space="preserve">            CU-&lt;stem&gt;.txt      (the cumulative-update / vendor object, B)</w:t>
       </w:r>
     </w:p>
@@ -2335,69 +4035,13 @@
           <w:szCs w:val="18"/>
         </w:rPr>
         <w:t xml:space="preserve">C:\jobs\CustomerX\</w:t>
-      </w:r>
-      <w:r>
-        <w:rPr>
-          <w:rFonts w:ascii="Consolas" w:cs="Consolas" w:eastAsia="Consolas" w:hAnsi="Consolas"/>
-          <w:sz w:val="18"/>
-          <w:szCs w:val="18"/>
-        </w:rPr>
         <w:br/>
-      </w:r>
-      <w:r>
-        <w:rPr>
-          <w:rFonts w:ascii="Consolas" w:cs="Consolas" w:eastAsia="Consolas" w:hAnsi="Consolas"/>
-          <w:sz w:val="18"/>
-          <w:szCs w:val="18"/>
-        </w:rPr>
         <w:t xml:space="preserve">    A\Table\EX-T14.txt</w:t>
-      </w:r>
-      <w:r>
-        <w:rPr>
-          <w:rFonts w:ascii="Consolas" w:cs="Consolas" w:eastAsia="Consolas" w:hAnsi="Consolas"/>
-          <w:sz w:val="18"/>
-          <w:szCs w:val="18"/>
-        </w:rPr>
         <w:br/>
-      </w:r>
-      <w:r>
-        <w:rPr>
-          <w:rFonts w:ascii="Consolas" w:cs="Consolas" w:eastAsia="Consolas" w:hAnsi="Consolas"/>
-          <w:sz w:val="18"/>
-          <w:szCs w:val="18"/>
-        </w:rPr>
         <w:t xml:space="preserve">    A\Page\EX-P21.txt</w:t>
-      </w:r>
-      <w:r>
-        <w:rPr>
-          <w:rFonts w:ascii="Consolas" w:cs="Consolas" w:eastAsia="Consolas" w:hAnsi="Consolas"/>
-          <w:sz w:val="18"/>
-          <w:szCs w:val="18"/>
-        </w:rPr>
         <w:br/>
-      </w:r>
-      <w:r>
-        <w:rPr>
-          <w:rFonts w:ascii="Consolas" w:cs="Consolas" w:eastAsia="Consolas" w:hAnsi="Consolas"/>
-          <w:sz w:val="18"/>
-          <w:szCs w:val="18"/>
-        </w:rPr>
         <w:t xml:space="preserve">    B\Table\CU-T14.txt</w:t>
-      </w:r>
-      <w:r>
-        <w:rPr>
-          <w:rFonts w:ascii="Consolas" w:cs="Consolas" w:eastAsia="Consolas" w:hAnsi="Consolas"/>
-          <w:sz w:val="18"/>
-          <w:szCs w:val="18"/>
-        </w:rPr>
         <w:br/>
-      </w:r>
-      <w:r>
-        <w:rPr>
-          <w:rFonts w:ascii="Consolas" w:cs="Consolas" w:eastAsia="Consolas" w:hAnsi="Consolas"/>
-          <w:sz w:val="18"/>
-          <w:szCs w:val="18"/>
-        </w:rPr>
         <w:t xml:space="preserve">    B\Page\CU-P21.txt</w:t>
       </w:r>
     </w:p>
@@ -2405,9 +4049,11 @@
       <w:pPr>
         <w:pStyle w:val="Heading2"/>
       </w:pPr>
+      <w:bookmarkStart w:id="9011" w:name="_Toc_cu_11"/>
       <w:r>
         <w:t xml:space="preserve">3.2 Strip the language layer before export</w:t>
       </w:r>
+      <w:bookmarkEnd w:id="9011"/>
     </w:p>
     <w:p>
       <w:pPr>
@@ -2511,9 +4157,11 @@
       <w:pPr>
         <w:pStyle w:val="Heading2"/>
       </w:pPr>
+      <w:bookmarkStart w:id="9012" w:name="_Toc_cu_12"/>
       <w:r>
         <w:t xml:space="preserve">3.3 What to leave out of a job</w:t>
       </w:r>
+      <w:bookmarkEnd w:id="9012"/>
     </w:p>
     <w:p>
       <w:pPr>
@@ -2597,17 +4245,21 @@
       <w:pPr>
         <w:pStyle w:val="Heading1"/>
       </w:pPr>
+      <w:bookmarkStart w:id="9013" w:name="_Toc_cu_13"/>
       <w:r>
         <w:t xml:space="preserve">4. Running a merge</w:t>
       </w:r>
+      <w:bookmarkEnd w:id="9013"/>
     </w:p>
     <w:p>
       <w:pPr>
         <w:pStyle w:val="Heading2"/>
       </w:pPr>
+      <w:bookmarkStart w:id="9014" w:name="_Toc_cu_14"/>
       <w:r>
         <w:t xml:space="preserve">4.1 Steps</w:t>
       </w:r>
+      <w:bookmarkEnd w:id="9014"/>
     </w:p>
     <w:p>
       <w:pPr>
@@ -2894,9 +4546,11 @@
       <w:pPr>
         <w:pStyle w:val="Heading2"/>
       </w:pPr>
+      <w:bookmarkStart w:id="9015" w:name="_Toc_cu_15"/>
       <w:r>
         <w:t xml:space="preserve">4.2 What "Run merge" does</w:t>
       </w:r>
+      <w:bookmarkEnd w:id="9015"/>
     </w:p>
     <w:p>
       <w:pPr>
@@ -3041,9 +4695,11 @@
       <w:pPr>
         <w:pStyle w:val="Heading2"/>
       </w:pPr>
+      <w:bookmarkStart w:id="9016" w:name="_Toc_cu_16"/>
       <w:r>
         <w:t xml:space="preserve">4.3 The two date formats</w:t>
       </w:r>
+      <w:bookmarkEnd w:id="9016"/>
     </w:p>
     <w:p>
       <w:pPr>
@@ -3164,9 +4820,11 @@
       <w:pPr>
         <w:pStyle w:val="Heading2"/>
       </w:pPr>
+      <w:bookmarkStart w:id="9017" w:name="_Toc_cu_17"/>
       <w:r>
         <w:t xml:space="preserve">4.4 The customer tags are determined automatically</w:t>
       </w:r>
+      <w:bookmarkEnd w:id="9017"/>
     </w:p>
     <w:p>
       <w:pPr>
@@ -3213,17 +4871,21 @@
       <w:pPr>
         <w:pStyle w:val="Heading1"/>
       </w:pPr>
+      <w:bookmarkStart w:id="9018" w:name="_Toc_cu_18"/>
       <w:r>
         <w:t xml:space="preserve">5. Reading the results</w:t>
       </w:r>
+      <w:bookmarkEnd w:id="9018"/>
     </w:p>
     <w:p>
       <w:pPr>
         <w:pStyle w:val="Heading2"/>
       </w:pPr>
+      <w:bookmarkStart w:id="9019" w:name="_Toc_cu_19"/>
       <w:r>
         <w:t xml:space="preserve">5.1 Use Dry run first</w:t>
       </w:r>
+      <w:bookmarkEnd w:id="9019"/>
     </w:p>
     <w:p>
       <w:pPr>
@@ -3257,9 +4919,11 @@
       <w:pPr>
         <w:pStyle w:val="Heading2"/>
       </w:pPr>
+      <w:bookmarkStart w:id="9020" w:name="_Toc_cu_20"/>
       <w:r>
         <w:t xml:space="preserve">5.2 Where the files go after a merge</w:t>
       </w:r>
+      <w:bookmarkEnd w:id="9020"/>
     </w:p>
     <w:tbl>
       <w:tblPr>
@@ -3684,9 +5348,11 @@
       <w:pPr>
         <w:pStyle w:val="Heading2"/>
       </w:pPr>
+      <w:bookmarkStart w:id="9021" w:name="_Toc_cu_21"/>
       <w:r>
         <w:t xml:space="preserve">5.3 The manual-review report</w:t>
       </w:r>
+      <w:bookmarkEnd w:id="9021"/>
     </w:p>
     <w:p>
       <w:pPr>
@@ -3709,149 +5375,23 @@
           <w:szCs w:val="18"/>
         </w:rPr>
         <w:t xml:space="preserve">MANUAL REVIEW / DEV (17):  (left in A/ and B/)</w:t>
-      </w:r>
-      <w:r>
-        <w:rPr>
-          <w:rFonts w:ascii="Consolas" w:cs="Consolas" w:eastAsia="Consolas" w:hAnsi="Consolas"/>
-          <w:sz w:val="18"/>
-          <w:szCs w:val="18"/>
-        </w:rPr>
         <w:br/>
-      </w:r>
-      <w:r>
-        <w:rPr>
-          <w:rFonts w:ascii="Consolas" w:cs="Consolas" w:eastAsia="Consolas" w:hAnsi="Consolas"/>
-          <w:sz w:val="18"/>
-          <w:szCs w:val="18"/>
-        </w:rPr>
         <w:t xml:space="preserve">  P21      4 blocks need manual merge:</w:t>
-      </w:r>
-      <w:r>
-        <w:rPr>
-          <w:rFonts w:ascii="Consolas" w:cs="Consolas" w:eastAsia="Consolas" w:hAnsi="Consolas"/>
-          <w:sz w:val="18"/>
-          <w:szCs w:val="18"/>
-        </w:rPr>
         <w:br/>
-      </w:r>
-      <w:r>
-        <w:rPr>
-          <w:rFonts w:ascii="Consolas" w:cs="Consolas" w:eastAsia="Consolas" w:hAnsi="Consolas"/>
-          <w:sz w:val="18"/>
-          <w:szCs w:val="18"/>
-        </w:rPr>
         <w:t xml:space="preserve">      - vendor-deletion change in field 7 at line 1592</w:t>
-      </w:r>
-      <w:r>
-        <w:rPr>
-          <w:rFonts w:ascii="Consolas" w:cs="Consolas" w:eastAsia="Consolas" w:hAnsi="Consolas"/>
-          <w:sz w:val="18"/>
-          <w:szCs w:val="18"/>
-        </w:rPr>
         <w:br/>
-      </w:r>
-      <w:r>
-        <w:rPr>
-          <w:rFonts w:ascii="Consolas" w:cs="Consolas" w:eastAsia="Consolas" w:hAnsi="Consolas"/>
-          <w:sz w:val="18"/>
-          <w:szCs w:val="18"/>
-        </w:rPr>
         <w:t xml:space="preserve">      - vendor-deletion change in field 9 at line 1606</w:t>
-      </w:r>
-      <w:r>
-        <w:rPr>
-          <w:rFonts w:ascii="Consolas" w:cs="Consolas" w:eastAsia="Consolas" w:hAnsi="Consolas"/>
-          <w:sz w:val="18"/>
-          <w:szCs w:val="18"/>
-        </w:rPr>
         <w:br/>
-      </w:r>
-      <w:r>
-        <w:rPr>
-          <w:rFonts w:ascii="Consolas" w:cs="Consolas" w:eastAsia="Consolas" w:hAnsi="Consolas"/>
-          <w:sz w:val="18"/>
-          <w:szCs w:val="18"/>
-        </w:rPr>
         <w:t xml:space="preserve">      - vendor-deletion change in field 13 at line 1660</w:t>
-      </w:r>
-      <w:r>
-        <w:rPr>
-          <w:rFonts w:ascii="Consolas" w:cs="Consolas" w:eastAsia="Consolas" w:hAnsi="Consolas"/>
-          <w:sz w:val="18"/>
-          <w:szCs w:val="18"/>
-        </w:rPr>
         <w:br/>
-      </w:r>
-      <w:r>
-        <w:rPr>
-          <w:rFonts w:ascii="Consolas" w:cs="Consolas" w:eastAsia="Consolas" w:hAnsi="Consolas"/>
-          <w:sz w:val="18"/>
-          <w:szCs w:val="18"/>
-        </w:rPr>
         <w:t xml:space="preserve">      - vendor-deletion change in field 14 at line 1675</w:t>
-      </w:r>
-      <w:r>
-        <w:rPr>
-          <w:rFonts w:ascii="Consolas" w:cs="Consolas" w:eastAsia="Consolas" w:hAnsi="Consolas"/>
-          <w:sz w:val="18"/>
-          <w:szCs w:val="18"/>
-        </w:rPr>
         <w:br/>
-      </w:r>
-      <w:r>
-        <w:rPr>
-          <w:rFonts w:ascii="Consolas" w:cs="Consolas" w:eastAsia="Consolas" w:hAnsi="Consolas"/>
-          <w:sz w:val="18"/>
-          <w:szCs w:val="18"/>
-        </w:rPr>
         <w:t xml:space="preserve">  P232     4 blocks need manual merge:</w:t>
-      </w:r>
-      <w:r>
-        <w:rPr>
-          <w:rFonts w:ascii="Consolas" w:cs="Consolas" w:eastAsia="Consolas" w:hAnsi="Consolas"/>
-          <w:sz w:val="18"/>
-          <w:szCs w:val="18"/>
-        </w:rPr>
         <w:br/>
-      </w:r>
-      <w:r>
-        <w:rPr>
-          <w:rFonts w:ascii="Consolas" w:cs="Consolas" w:eastAsia="Consolas" w:hAnsi="Consolas"/>
-          <w:sz w:val="18"/>
-          <w:szCs w:val="18"/>
-        </w:rPr>
         <w:t xml:space="preserve">      - customer field 1101353000 in field 1101353000 at line 113</w:t>
-      </w:r>
-      <w:r>
-        <w:rPr>
-          <w:rFonts w:ascii="Consolas" w:cs="Consolas" w:eastAsia="Consolas" w:hAnsi="Consolas"/>
-          <w:sz w:val="18"/>
-          <w:szCs w:val="18"/>
-        </w:rPr>
         <w:br/>
-      </w:r>
-      <w:r>
-        <w:rPr>
-          <w:rFonts w:ascii="Consolas" w:cs="Consolas" w:eastAsia="Consolas" w:hAnsi="Consolas"/>
-          <w:sz w:val="18"/>
-          <w:szCs w:val="18"/>
-        </w:rPr>
         <w:t xml:space="preserve">      - customer code block 'AP001662' at line 124</w:t>
-      </w:r>
-      <w:r>
-        <w:rPr>
-          <w:rFonts w:ascii="Consolas" w:cs="Consolas" w:eastAsia="Consolas" w:hAnsi="Consolas"/>
-          <w:sz w:val="18"/>
-          <w:szCs w:val="18"/>
-        </w:rPr>
         <w:br/>
-      </w:r>
-      <w:r>
-        <w:rPr>
-          <w:rFonts w:ascii="Consolas" w:cs="Consolas" w:eastAsia="Consolas" w:hAnsi="Consolas"/>
-          <w:sz w:val="18"/>
-          <w:szCs w:val="18"/>
-        </w:rPr>
         <w:t xml:space="preserve">  P279     untagged-A-only change in field 1101353000 at line 119 - needs manual merge</w:t>
       </w:r>
     </w:p>
@@ -3929,9 +5469,11 @@
       <w:pPr>
         <w:pStyle w:val="Heading2"/>
       </w:pPr>
+      <w:bookmarkStart w:id="9022" w:name="_Toc_cu_22"/>
       <w:r>
         <w:t xml:space="preserve">5.4 What the report tells you about the customer tags</w:t>
       </w:r>
+      <w:bookmarkEnd w:id="9022"/>
     </w:p>
     <w:p>
       <w:pPr>
@@ -3955,17 +5497,21 @@
       <w:pPr>
         <w:pStyle w:val="Heading1"/>
       </w:pPr>
+      <w:bookmarkStart w:id="9023" w:name="_Toc_cu_23"/>
       <w:r>
         <w:t xml:space="preserve">6. After the merge</w:t>
       </w:r>
+      <w:bookmarkEnd w:id="9023"/>
     </w:p>
     <w:p>
       <w:pPr>
         <w:pStyle w:val="Heading2"/>
       </w:pPr>
+      <w:bookmarkStart w:id="9024" w:name="_Toc_cu_24"/>
       <w:r>
         <w:t xml:space="preserve">6.1 The automatically merged objects</w:t>
       </w:r>
+      <w:bookmarkEnd w:id="9024"/>
     </w:p>
     <w:p>
       <w:pPr>
@@ -3988,9 +5534,11 @@
       <w:pPr>
         <w:pStyle w:val="Heading2"/>
       </w:pPr>
+      <w:bookmarkStart w:id="9025" w:name="_Toc_cu_25"/>
       <w:r>
         <w:t xml:space="preserve">6.2 The manual objects</w:t>
       </w:r>
+      <w:bookmarkEnd w:id="9025"/>
     </w:p>
     <w:p>
       <w:pPr>
@@ -4022,9 +5570,11 @@
       <w:pPr>
         <w:pStyle w:val="Heading2"/>
       </w:pPr>
+      <w:bookmarkStart w:id="9026" w:name="_Toc_cu_26"/>
       <w:r>
         <w:t xml:space="preserve">6.3 Join the objects by type</w:t>
       </w:r>
+      <w:bookmarkEnd w:id="9026"/>
     </w:p>
     <w:p>
       <w:pPr>
@@ -4038,9 +5588,11 @@
       <w:pPr>
         <w:pStyle w:val="Heading2"/>
       </w:pPr>
+      <w:bookmarkStart w:id="9027" w:name="_Toc_cu_27"/>
       <w:r>
         <w:t xml:space="preserve">6.4 Re-apply the language layer, then compile</w:t>
       </w:r>
+      <w:bookmarkEnd w:id="9027"/>
     </w:p>
     <w:p>
       <w:pPr>
@@ -4081,9 +5633,11 @@
       <w:pPr>
         <w:pStyle w:val="Heading1"/>
       </w:pPr>
+      <w:bookmarkStart w:id="9028" w:name="_Toc_cu_28"/>
       <w:r>
         <w:t xml:space="preserve">7. Inside the application</w:t>
       </w:r>
+      <w:bookmarkEnd w:id="9028"/>
     </w:p>
     <w:p>
       <w:pPr>
@@ -4548,9 +6102,11 @@
       <w:pPr>
         <w:pStyle w:val="Heading1"/>
       </w:pPr>
+      <w:bookmarkStart w:id="9029" w:name="_Toc_cu_29"/>
       <w:r>
         <w:t xml:space="preserve">8. Rules Index by object type</w:t>
       </w:r>
+      <w:bookmarkEnd w:id="9029"/>
     </w:p>
     <w:p>
       <w:pPr>
@@ -4650,9 +6206,11 @@
       <w:pPr>
         <w:pStyle w:val="Heading2"/>
       </w:pPr>
+      <w:bookmarkStart w:id="9030" w:name="_Toc_cu_30"/>
       <w:r>
         <w:t xml:space="preserve">8.0 Object-type dispatch (all object types)</w:t>
       </w:r>
+      <w:bookmarkEnd w:id="9030"/>
     </w:p>
     <w:p>
       <w:pPr>
@@ -5249,9 +6807,11 @@
       <w:pPr>
         <w:pStyle w:val="Heading2"/>
       </w:pPr>
+      <w:bookmarkStart w:id="9031" w:name="_Toc_cu_31"/>
       <w:r>
         <w:t xml:space="preserve">8.1 Table</w:t>
       </w:r>
+      <w:bookmarkEnd w:id="9031"/>
     </w:p>
     <w:p>
       <w:pPr>
@@ -5265,9 +6825,11 @@
       <w:pPr>
         <w:pStyle w:val="Heading3"/>
       </w:pPr>
+      <w:bookmarkStart w:id="9032" w:name="_Toc_cu_32"/>
       <w:r>
         <w:t xml:space="preserve">8.1.1 Customer field added to a vendor table — CARRY (field graft)</w:t>
       </w:r>
+      <w:bookmarkEnd w:id="9032"/>
     </w:p>
     <w:p>
       <w:pPr>
@@ -5321,9 +6883,11 @@
       <w:pPr>
         <w:pStyle w:val="Heading3"/>
       </w:pPr>
+      <w:bookmarkStart w:id="9033" w:name="_Toc_cu_33"/>
       <w:r>
         <w:t xml:space="preserve">8.1.2 A changelog entry takes priority over a misleading vendor tag — CARRY</w:t>
       </w:r>
+      <w:bookmarkEnd w:id="9033"/>
     </w:p>
     <w:p>
       <w:pPr>
@@ -5366,9 +6930,11 @@
       <w:pPr>
         <w:pStyle w:val="Heading3"/>
       </w:pPr>
+      <w:bookmarkStart w:id="9034" w:name="_Toc_cu_34"/>
       <w:r>
         <w:t xml:space="preserve">8.1.3 A whole field, present only in A, with no tag and no changelog entry — MANUAL</w:t>
       </w:r>
+      <w:bookmarkEnd w:id="9034"/>
     </w:p>
     <w:p>
       <w:pPr>
@@ -5402,9 +6968,11 @@
       <w:pPr>
         <w:pStyle w:val="Heading3"/>
       </w:pPr>
+      <w:bookmarkStart w:id="9035" w:name="_Toc_cu_35"/>
       <w:r>
         <w:t xml:space="preserve">8.1.4 A customer code block inside a changed shared field or trigger — the scorer decides</w:t>
       </w:r>
+      <w:bookmarkEnd w:id="9035"/>
     </w:p>
     <w:p>
       <w:pPr>
@@ -5593,9 +7161,11 @@
       <w:pPr>
         <w:pStyle w:val="Heading3"/>
       </w:pPr>
+      <w:bookmarkStart w:id="9036" w:name="_Toc_cu_36"/>
       <w:r>
         <w:t xml:space="preserve">8.1.5 A caption or option change — CARRY (always take the customer value)</w:t>
       </w:r>
+      <w:bookmarkEnd w:id="9036"/>
     </w:p>
     <w:p>
       <w:pPr>
@@ -5715,9 +7285,11 @@
       <w:pPr>
         <w:pStyle w:val="Heading3"/>
       </w:pPr>
+      <w:bookmarkStart w:id="9037" w:name="_Toc_cu_37"/>
       <w:r>
         <w:t xml:space="preserve">8.1.6 A field with both a code change and an option change — both are carried</w:t>
       </w:r>
+      <w:bookmarkEnd w:id="9037"/>
     </w:p>
     <w:p>
       <w:pPr>
@@ -5751,9 +7323,11 @@
       <w:pPr>
         <w:pStyle w:val="Heading3"/>
       </w:pPr>
+      <w:bookmarkStart w:id="9038" w:name="_Toc_cu_38"/>
       <w:r>
         <w:t xml:space="preserve">8.1.7 Customer variable declarations — CARRY (keep rather than delete)</w:t>
       </w:r>
+      <w:bookmarkEnd w:id="9038"/>
     </w:p>
     <w:p>
       <w:pPr>
@@ -5796,9 +7370,11 @@
       <w:pPr>
         <w:pStyle w:val="Heading3"/>
       </w:pPr>
+      <w:bookmarkStart w:id="9039" w:name="_Toc_cu_39"/>
       <w:r>
         <w:t xml:space="preserve">8.1.8 A customer-extended option-string variable — CARRY</w:t>
       </w:r>
+      <w:bookmarkEnd w:id="9039"/>
     </w:p>
     <w:p>
       <w:pPr>
@@ -5841,9 +7417,11 @@
       <w:pPr>
         <w:pStyle w:val="Heading3"/>
       </w:pPr>
+      <w:bookmarkStart w:id="9040" w:name="_Toc_cu_40"/>
       <w:r>
         <w:t xml:space="preserve">8.1.9 Header and changelog bookkeeping (every automatic merge)</w:t>
       </w:r>
+      <w:bookmarkEnd w:id="9040"/>
     </w:p>
     <w:p>
       <w:pPr>
@@ -5954,9 +7532,11 @@
       <w:pPr>
         <w:pStyle w:val="Heading3"/>
       </w:pPr>
+      <w:bookmarkStart w:id="9041" w:name="_Toc_cu_41"/>
       <w:r>
         <w:t xml:space="preserve">8.1.10 Differences in tag spelling are standardised</w:t>
       </w:r>
+      <w:bookmarkEnd w:id="9041"/>
     </w:p>
     <w:p>
       <w:pPr>
@@ -6007,9 +7587,11 @@
       <w:pPr>
         <w:pStyle w:val="Heading2"/>
       </w:pPr>
+      <w:bookmarkStart w:id="9042" w:name="_Toc_cu_42"/>
       <w:r>
         <w:t xml:space="preserve">8.2 Codeunit</w:t>
       </w:r>
+      <w:bookmarkEnd w:id="9042"/>
     </w:p>
     <w:p>
       <w:pPr>
@@ -6123,9 +7705,11 @@
       <w:pPr>
         <w:pStyle w:val="Heading2"/>
       </w:pPr>
+      <w:bookmarkStart w:id="9043" w:name="_Toc_cu_43"/>
       <w:r>
         <w:t xml:space="preserve">8.3 Page</w:t>
       </w:r>
+      <w:bookmarkEnd w:id="9043"/>
     </w:p>
     <w:p>
       <w:pPr>
@@ -6139,9 +7723,11 @@
       <w:pPr>
         <w:pStyle w:val="Heading3"/>
       </w:pPr>
+      <w:bookmarkStart w:id="9044" w:name="_Toc_cu_44"/>
       <w:r>
         <w:t xml:space="preserve">8.3.1 A control added by the customer — CARRY (graft)</w:t>
       </w:r>
+      <w:bookmarkEnd w:id="9044"/>
     </w:p>
     <w:p>
       <w:pPr>
@@ -6195,9 +7781,11 @@
       <w:pPr>
         <w:pStyle w:val="Heading3"/>
       </w:pPr>
+      <w:bookmarkStart w:id="9045" w:name="_Toc_cu_45"/>
       <w:r>
         <w:t xml:space="preserve">8.3.2 A vendor caption rename — TAKE B (do not carry the outdated customer caption)</w:t>
       </w:r>
+      <w:bookmarkEnd w:id="9045"/>
     </w:p>
     <w:p>
       <w:pPr>
@@ -6231,9 +7819,11 @@
       <w:pPr>
         <w:pStyle w:val="Heading3"/>
       </w:pPr>
+      <w:bookmarkStart w:id="9046" w:name="_Toc_cu_46"/>
       <w:r>
         <w:t xml:space="preserve">8.3.3 A control present only in A, carrying only a vendor tag — MANUAL</w:t>
       </w:r>
+      <w:bookmarkEnd w:id="9046"/>
     </w:p>
     <w:p>
       <w:pPr>
@@ -6277,9 +7867,11 @@
       <w:pPr>
         <w:pStyle w:val="Heading3"/>
       </w:pPr>
+      <w:bookmarkStart w:id="9047" w:name="_Toc_cu_47"/>
       <w:r>
         <w:t xml:space="preserve">8.3.4 A customer change to a property on a shared control — MANUAL</w:t>
       </w:r>
+      <w:bookmarkEnd w:id="9047"/>
     </w:p>
     <w:p>
       <w:pPr>
@@ -6354,9 +7946,11 @@
       <w:pPr>
         <w:pStyle w:val="Heading3"/>
       </w:pPr>
+      <w:bookmarkStart w:id="9048" w:name="_Toc_cu_48"/>
       <w:r>
         <w:t xml:space="preserve">8.3.5 Caption capture on a page stops at the closing brace</w:t>
       </w:r>
+      <w:bookmarkEnd w:id="9048"/>
     </w:p>
     <w:p>
       <w:pPr>
@@ -6387,9 +7981,11 @@
       <w:pPr>
         <w:pStyle w:val="Heading2"/>
       </w:pPr>
+      <w:bookmarkStart w:id="9049" w:name="_Toc_cu_49"/>
       <w:r>
         <w:t xml:space="preserve">8.4 Report and XMLport</w:t>
       </w:r>
+      <w:bookmarkEnd w:id="9049"/>
     </w:p>
     <w:p>
       <w:pPr>
@@ -6411,9 +8007,11 @@
       <w:pPr>
         <w:pStyle w:val="Heading2"/>
       </w:pPr>
+      <w:bookmarkStart w:id="9050" w:name="_Toc_cu_50"/>
       <w:r>
         <w:t xml:space="preserve">8.5 Rules that apply to all object types</w:t>
       </w:r>
+      <w:bookmarkEnd w:id="9050"/>
     </w:p>
     <w:p>
       <w:pPr>
@@ -6566,9 +8164,11 @@
       <w:pPr>
         <w:pStyle w:val="Heading1"/>
       </w:pPr>
+      <w:bookmarkStart w:id="9051" w:name="_Toc_cu_51"/>
       <w:r>
         <w:t xml:space="preserve">9. Quick reference</w:t>
       </w:r>
+      <w:bookmarkEnd w:id="9051"/>
     </w:p>
     <w:p>
       <w:pPr>

</xml_diff>

<commit_message>
Record manual deliverable in CONTEXT.md (8.21); add reproducible docx builder
- docs/CONTEXT.md: session-log entry 8.21 documenting the User Manual +
  Rules Index deliverable, the domain corrections captured, and the TOC
  page-number bake mechanic (docx-js emits an empty TOC field -> bake real
  numbers from a rendered PDF). 'Do not hand-edit the docx; edit the md and
  rebuild' recorded for handoff.
- docs/build_manual.js: single-command builder (md -> docx + baked TOC),
  so a future rebuild is 'node docs/build_manual.js' rather than a manual
  sequence. Degrades gracefully (valid docx, TOC bake skipped) if the
  office helpers are absent.
- docs/USER_MANUAL.docx: regenerated by the script (now reproducible from
  source rather than hand-patched).
</commit_message>
<xml_diff>
--- a/docs/USER_MANUAL.docx
+++ b/docs/USER_MANUAL.docx
@@ -395,7 +395,7 @@
               <w:rPr>
                 <w:noProof/>
               </w:rPr>
-              <w:t>4</w:t>
+              <w:t>3</w:t>
             </w:r>
           </w:hyperlink>
         </w:p>
@@ -463,7 +463,7 @@
               <w:rPr>
                 <w:noProof/>
               </w:rPr>
-              <w:t>5</w:t>
+              <w:t>4</w:t>
             </w:r>
           </w:hyperlink>
         </w:p>
@@ -632,7 +632,7 @@
               <w:rPr>
                 <w:noProof/>
               </w:rPr>
-              <w:t>6</w:t>
+              <w:t>5</w:t>
             </w:r>
           </w:hyperlink>
         </w:p>
@@ -699,7 +699,7 @@
               <w:rPr>
                 <w:noProof/>
               </w:rPr>
-              <w:t>7</w:t>
+              <w:t>6</w:t>
             </w:r>
           </w:hyperlink>
         </w:p>
@@ -733,7 +733,7 @@
               <w:rPr>
                 <w:noProof/>
               </w:rPr>
-              <w:t>7</w:t>
+              <w:t>6</w:t>
             </w:r>
           </w:hyperlink>
         </w:p>
@@ -767,7 +767,7 @@
               <w:rPr>
                 <w:noProof/>
               </w:rPr>
-              <w:t>7</w:t>
+              <w:t>6</w:t>
             </w:r>
           </w:hyperlink>
         </w:p>
@@ -801,7 +801,7 @@
               <w:rPr>
                 <w:noProof/>
               </w:rPr>
-              <w:t>7</w:t>
+              <w:t>6</w:t>
             </w:r>
           </w:hyperlink>
         </w:p>
@@ -835,7 +835,7 @@
               <w:rPr>
                 <w:noProof/>
               </w:rPr>
-              <w:t>8</w:t>
+              <w:t>7</w:t>
             </w:r>
           </w:hyperlink>
         </w:p>
@@ -868,7 +868,7 @@
               <w:rPr>
                 <w:noProof/>
               </w:rPr>
-              <w:t>9</w:t>
+              <w:t>7</w:t>
             </w:r>
           </w:hyperlink>
         </w:p>
@@ -902,7 +902,7 @@
               <w:rPr>
                 <w:noProof/>
               </w:rPr>
-              <w:t>9</w:t>
+              <w:t>7</w:t>
             </w:r>
           </w:hyperlink>
         </w:p>
@@ -936,7 +936,7 @@
               <w:rPr>
                 <w:noProof/>
               </w:rPr>
-              <w:t>9</w:t>
+              <w:t>7</w:t>
             </w:r>
           </w:hyperlink>
         </w:p>
@@ -970,7 +970,7 @@
               <w:rPr>
                 <w:noProof/>
               </w:rPr>
-              <w:t>9</w:t>
+              <w:t>7</w:t>
             </w:r>
           </w:hyperlink>
         </w:p>
@@ -1004,7 +1004,7 @@
               <w:rPr>
                 <w:noProof/>
               </w:rPr>
-              <w:t>9</w:t>
+              <w:t>7</w:t>
             </w:r>
           </w:hyperlink>
         </w:p>
@@ -1037,7 +1037,7 @@
               <w:rPr>
                 <w:noProof/>
               </w:rPr>
-              <w:t>9</w:t>
+              <w:t>7</w:t>
             </w:r>
           </w:hyperlink>
         </w:p>
@@ -1070,7 +1070,7 @@
               <w:rPr>
                 <w:noProof/>
               </w:rPr>
-              <w:t>10</w:t>
+              <w:t>8</w:t>
             </w:r>
           </w:hyperlink>
         </w:p>
@@ -1104,7 +1104,7 @@
               <w:rPr>
                 <w:noProof/>
               </w:rPr>
-              <w:t>10</w:t>
+              <w:t>8</w:t>
             </w:r>
           </w:hyperlink>
         </w:p>
@@ -1138,7 +1138,7 @@
               <w:rPr>
                 <w:noProof/>
               </w:rPr>
-              <w:t>11</w:t>
+              <w:t>9</w:t>
             </w:r>
           </w:hyperlink>
         </w:p>
@@ -1172,7 +1172,7 @@
               <w:rPr>
                 <w:noProof/>
               </w:rPr>
-              <w:t>11</w:t>
+              <w:t>9</w:t>
             </w:r>
           </w:hyperlink>
         </w:p>
@@ -1206,7 +1206,7 @@
               <w:rPr>
                 <w:noProof/>
               </w:rPr>
-              <w:t>11</w:t>
+              <w:t>9</w:t>
             </w:r>
           </w:hyperlink>
         </w:p>
@@ -1240,7 +1240,7 @@
               <w:rPr>
                 <w:noProof/>
               </w:rPr>
-              <w:t>11</w:t>
+              <w:t>9</w:t>
             </w:r>
           </w:hyperlink>
         </w:p>
@@ -1274,7 +1274,7 @@
               <w:rPr>
                 <w:noProof/>
               </w:rPr>
-              <w:t>11</w:t>
+              <w:t>10</w:t>
             </w:r>
           </w:hyperlink>
         </w:p>
@@ -1308,7 +1308,7 @@
               <w:rPr>
                 <w:noProof/>
               </w:rPr>
-              <w:t>12</w:t>
+              <w:t>10</w:t>
             </w:r>
           </w:hyperlink>
         </w:p>
@@ -1342,7 +1342,7 @@
               <w:rPr>
                 <w:noProof/>
               </w:rPr>
-              <w:t>12</w:t>
+              <w:t>10</w:t>
             </w:r>
           </w:hyperlink>
         </w:p>
@@ -1376,7 +1376,7 @@
               <w:rPr>
                 <w:noProof/>
               </w:rPr>
-              <w:t>12</w:t>
+              <w:t>10</w:t>
             </w:r>
           </w:hyperlink>
         </w:p>
@@ -1410,7 +1410,7 @@
               <w:rPr>
                 <w:noProof/>
               </w:rPr>
-              <w:t>12</w:t>
+              <w:t>11</w:t>
             </w:r>
           </w:hyperlink>
         </w:p>
@@ -1444,7 +1444,7 @@
               <w:rPr>
                 <w:noProof/>
               </w:rPr>
-              <w:t>12</w:t>
+              <w:t>11</w:t>
             </w:r>
           </w:hyperlink>
         </w:p>
@@ -1478,7 +1478,7 @@
               <w:rPr>
                 <w:noProof/>
               </w:rPr>
-              <w:t>13</w:t>
+              <w:t>11</w:t>
             </w:r>
           </w:hyperlink>
         </w:p>
@@ -1512,7 +1512,7 @@
               <w:rPr>
                 <w:noProof/>
               </w:rPr>
-              <w:t>13</w:t>
+              <w:t>11</w:t>
             </w:r>
           </w:hyperlink>
         </w:p>
@@ -1546,7 +1546,7 @@
               <w:rPr>
                 <w:noProof/>
               </w:rPr>
-              <w:t>13</w:t>
+              <w:t>12</w:t>
             </w:r>
           </w:hyperlink>
         </w:p>
@@ -1580,7 +1580,7 @@
               <w:rPr>
                 <w:noProof/>
               </w:rPr>
-              <w:t>13</w:t>
+              <w:t>12</w:t>
             </w:r>
           </w:hyperlink>
         </w:p>
@@ -1614,7 +1614,7 @@
               <w:rPr>
                 <w:noProof/>
               </w:rPr>
-              <w:t>14</w:t>
+              <w:t>12</w:t>
             </w:r>
           </w:hyperlink>
         </w:p>
@@ -1648,7 +1648,7 @@
               <w:rPr>
                 <w:noProof/>
               </w:rPr>
-              <w:t>14</w:t>
+              <w:t>12</w:t>
             </w:r>
           </w:hyperlink>
         </w:p>
@@ -1682,7 +1682,7 @@
               <w:rPr>
                 <w:noProof/>
               </w:rPr>
-              <w:t>14</w:t>
+              <w:t>12</w:t>
             </w:r>
           </w:hyperlink>
         </w:p>
@@ -1716,7 +1716,7 @@
               <w:rPr>
                 <w:noProof/>
               </w:rPr>
-              <w:t>14</w:t>
+              <w:t>12</w:t>
             </w:r>
           </w:hyperlink>
         </w:p>
@@ -1750,7 +1750,7 @@
               <w:rPr>
                 <w:noProof/>
               </w:rPr>
-              <w:t>14</w:t>
+              <w:t>13</w:t>
             </w:r>
           </w:hyperlink>
         </w:p>
@@ -1784,7 +1784,7 @@
               <w:rPr>
                 <w:noProof/>
               </w:rPr>
-              <w:t>14</w:t>
+              <w:t>13</w:t>
             </w:r>
           </w:hyperlink>
         </w:p>
@@ -1817,7 +1817,7 @@
               <w:rPr>
                 <w:noProof/>
               </w:rPr>
-              <w:t>15</w:t>
+              <w:t>13</w:t>
             </w:r>
           </w:hyperlink>
         </w:p>
@@ -2233,7 +2233,7 @@
       <w:r>
         <w:drawing>
           <wp:inline distT="0" distB="0" distL="0" distR="0">
-            <wp:extent cx="4572000" cy="3562350"/>
+            <wp:extent cx="4572000" cy="299493460575"/>
             <wp:effectExtent t="0" r="0" b="0" l="0"/>
             <wp:docPr id="1" name="" descr="" title=""/>
             <wp:cNvGraphicFramePr>
@@ -2258,7 +2258,7 @@
                   <pic:spPr bwMode="auto">
                     <a:xfrm>
                       <a:off x="0" y="0"/>
-                      <a:ext cx="4572000" cy="3562350"/>
+                      <a:ext cx="4572000" cy="299493460575"/>
                     </a:xfrm>
                     <a:prstGeom prst="rect">
                       <a:avLst/>
@@ -4637,7 +4637,7 @@
       <w:r>
         <w:drawing>
           <wp:inline distT="0" distB="0" distL="0" distR="0">
-            <wp:extent cx="4572000" cy="3562350"/>
+            <wp:extent cx="4572000" cy="299493460575"/>
             <wp:effectExtent t="0" r="0" b="0" l="0"/>
             <wp:docPr id="1" name="" descr="" title=""/>
             <wp:cNvGraphicFramePr>
@@ -4662,7 +4662,7 @@
                   <pic:spPr bwMode="auto">
                     <a:xfrm>
                       <a:off x="0" y="0"/>
-                      <a:ext cx="4572000" cy="3562350"/>
+                      <a:ext cx="4572000" cy="299493460575"/>
                     </a:xfrm>
                     <a:prstGeom prst="rect">
                       <a:avLst/>
@@ -5290,7 +5290,7 @@
       <w:r>
         <w:drawing>
           <wp:inline distT="0" distB="0" distL="0" distR="0">
-            <wp:extent cx="4572000" cy="1514475"/>
+            <wp:extent cx="4572000" cy="299493460575"/>
             <wp:effectExtent t="0" r="0" b="0" l="0"/>
             <wp:docPr id="1" name="" descr="" title=""/>
             <wp:cNvGraphicFramePr>
@@ -5315,7 +5315,7 @@
                   <pic:spPr bwMode="auto">
                     <a:xfrm>
                       <a:off x="0" y="0"/>
-                      <a:ext cx="4572000" cy="1514475"/>
+                      <a:ext cx="4572000" cy="299493460575"/>
                     </a:xfrm>
                     <a:prstGeom prst="rect">
                       <a:avLst/>
@@ -5411,7 +5411,7 @@
       <w:r>
         <w:drawing>
           <wp:inline distT="0" distB="0" distL="0" distR="0">
-            <wp:extent cx="4572000" cy="5153025"/>
+            <wp:extent cx="4572000" cy="299493460575"/>
             <wp:effectExtent t="0" r="0" b="0" l="0"/>
             <wp:docPr id="1" name="" descr="" title=""/>
             <wp:cNvGraphicFramePr>
@@ -5436,7 +5436,7 @@
                   <pic:spPr bwMode="auto">
                     <a:xfrm>
                       <a:off x="0" y="0"/>
-                      <a:ext cx="4572000" cy="5153025"/>
+                      <a:ext cx="4572000" cy="299493460575"/>
                     </a:xfrm>
                     <a:prstGeom prst="rect">
                       <a:avLst/>

</xml_diff>

<commit_message>
docs: record procedure-scope anchor confinement + v2.0
Developer docs (ARCHITECTURE §9, CONTEXT §4 + new §8.23 changelog entry):
record the anchor-confinement behaviour (identified via T17, not a T17-
specific patch), the id-first/name-second enclosing-procedure match, the
proc-absent-from-B -> DEV gate, and the indent-anchored _proc_units span-walk
fix in both scorer and diffengine. Validation tally updated to 8 objects incl.
T17.

User manual (USER_MANUAL.md + regenerated .docx via build_manual.js):
- new worked example 8.1.5a (a carried code block lands in its own procedure
  even when the anchor text repeats; validated on Table 17)
- exe references 1.9 -> 2.0 (hardcoded in the manual; the bump made them stale)

BUILD.md: example exe name 1.9 -> 2.0.

No code change in this commit; docs only.
</commit_message>
<xml_diff>
--- a/docs/USER_MANUAL.docx
+++ b/docs/USER_MANUAL.docx
@@ -1328,7 +1328,7 @@
               <w:rPr>
                 <w:noProof/>
               </w:rPr>
-              <w:t xml:space="preserve">8.1.6 A caption or option change — CARRY (always take the customer value)</w:t>
+              <w:t xml:space="preserve">8.1.5a A carried code block lands in its own procedure, even when the anchor text repeats</w:t>
             </w:r>
           </w:hyperlink>
           <w:r>
@@ -1362,7 +1362,7 @@
               <w:rPr>
                 <w:noProof/>
               </w:rPr>
-              <w:t xml:space="preserve">8.1.7 A field with both a code change and an option change — both are carried</w:t>
+              <w:t xml:space="preserve">8.1.6 A caption or option change — CARRY (always take the customer value)</w:t>
             </w:r>
           </w:hyperlink>
           <w:r>
@@ -1396,7 +1396,7 @@
               <w:rPr>
                 <w:noProof/>
               </w:rPr>
-              <w:t xml:space="preserve">8.1.8 Customer variable declarations — CARRY (keep rather than delete)</w:t>
+              <w:t xml:space="preserve">8.1.7 A field with both a code change and an option change — both are carried</w:t>
             </w:r>
           </w:hyperlink>
           <w:r>
@@ -1430,7 +1430,7 @@
               <w:rPr>
                 <w:noProof/>
               </w:rPr>
-              <w:t xml:space="preserve">8.1.9 A customer-extended option-string variable — CARRY</w:t>
+              <w:t xml:space="preserve">8.1.8 Customer variable declarations — CARRY (keep rather than delete)</w:t>
             </w:r>
           </w:hyperlink>
           <w:r>
@@ -1464,7 +1464,7 @@
               <w:rPr>
                 <w:noProof/>
               </w:rPr>
-              <w:t xml:space="preserve">8.1.10 Header and changelog bookkeeping (every automatic merge)</w:t>
+              <w:t xml:space="preserve">8.1.9 A customer-extended option-string variable — CARRY</w:t>
             </w:r>
           </w:hyperlink>
           <w:r>
@@ -1478,7 +1478,7 @@
               <w:rPr>
                 <w:noProof/>
               </w:rPr>
-              <w:t>11</w:t>
+              <w:t>12</w:t>
             </w:r>
           </w:hyperlink>
         </w:p>
@@ -1498,7 +1498,7 @@
               <w:rPr>
                 <w:noProof/>
               </w:rPr>
-              <w:t xml:space="preserve">8.1.11 Differences in tag spelling are standardised</w:t>
+              <w:t xml:space="preserve">8.1.10 Header and changelog bookkeeping (every automatic merge)</w:t>
             </w:r>
           </w:hyperlink>
           <w:r>
@@ -1508,6 +1508,40 @@
             <w:tab/>
           </w:r>
           <w:hyperlink w:anchor="_Toc_cu_42">
+            <w:r>
+              <w:rPr>
+                <w:noProof/>
+              </w:rPr>
+              <w:t>12</w:t>
+            </w:r>
+          </w:hyperlink>
+        </w:p>
+        <w:p>
+          <w:pPr>
+            <w:tabs>
+              <w:tab w:val="right" w:leader="dot" w:pos="9360"/>
+            </w:tabs>
+            <w:spacing w:after="40"/>
+            <w:ind w:left="720"/>
+            <w:rPr>
+              <w:noProof/>
+            </w:rPr>
+          </w:pPr>
+          <w:hyperlink w:anchor="_Toc_cu_43">
+            <w:r>
+              <w:rPr>
+                <w:noProof/>
+              </w:rPr>
+              <w:t xml:space="preserve">8.1.11 Differences in tag spelling are standardised</w:t>
+            </w:r>
+          </w:hyperlink>
+          <w:r>
+            <w:rPr>
+              <w:noProof/>
+            </w:rPr>
+            <w:tab/>
+          </w:r>
+          <w:hyperlink w:anchor="_Toc_cu_43">
             <w:r>
               <w:rPr>
                 <w:noProof/>
@@ -1527,7 +1561,7 @@
               <w:noProof/>
             </w:rPr>
           </w:pPr>
-          <w:hyperlink w:anchor="_Toc_cu_43">
+          <w:hyperlink w:anchor="_Toc_cu_44">
             <w:r>
               <w:rPr>
                 <w:noProof/>
@@ -1541,7 +1575,7 @@
             </w:rPr>
             <w:tab/>
           </w:r>
-          <w:hyperlink w:anchor="_Toc_cu_43">
+          <w:hyperlink w:anchor="_Toc_cu_44">
             <w:r>
               <w:rPr>
                 <w:noProof/>
@@ -1561,7 +1595,7 @@
               <w:noProof/>
             </w:rPr>
           </w:pPr>
-          <w:hyperlink w:anchor="_Toc_cu_44">
+          <w:hyperlink w:anchor="_Toc_cu_45">
             <w:r>
               <w:rPr>
                 <w:noProof/>
@@ -1575,7 +1609,7 @@
             </w:rPr>
             <w:tab/>
           </w:r>
-          <w:hyperlink w:anchor="_Toc_cu_44">
+          <w:hyperlink w:anchor="_Toc_cu_45">
             <w:r>
               <w:rPr>
                 <w:noProof/>
@@ -1595,7 +1629,7 @@
               <w:noProof/>
             </w:rPr>
           </w:pPr>
-          <w:hyperlink w:anchor="_Toc_cu_45">
+          <w:hyperlink w:anchor="_Toc_cu_46">
             <w:r>
               <w:rPr>
                 <w:noProof/>
@@ -1609,12 +1643,12 @@
             </w:rPr>
             <w:tab/>
           </w:r>
-          <w:hyperlink w:anchor="_Toc_cu_45">
-            <w:r>
-              <w:rPr>
-                <w:noProof/>
-              </w:rPr>
-              <w:t>12</w:t>
+          <w:hyperlink w:anchor="_Toc_cu_46">
+            <w:r>
+              <w:rPr>
+                <w:noProof/>
+              </w:rPr>
+              <w:t>13</w:t>
             </w:r>
           </w:hyperlink>
         </w:p>
@@ -1629,7 +1663,7 @@
               <w:noProof/>
             </w:rPr>
           </w:pPr>
-          <w:hyperlink w:anchor="_Toc_cu_46">
+          <w:hyperlink w:anchor="_Toc_cu_47">
             <w:r>
               <w:rPr>
                 <w:noProof/>
@@ -1643,12 +1677,12 @@
             </w:rPr>
             <w:tab/>
           </w:r>
-          <w:hyperlink w:anchor="_Toc_cu_46">
-            <w:r>
-              <w:rPr>
-                <w:noProof/>
-              </w:rPr>
-              <w:t>12</w:t>
+          <w:hyperlink w:anchor="_Toc_cu_47">
+            <w:r>
+              <w:rPr>
+                <w:noProof/>
+              </w:rPr>
+              <w:t>13</w:t>
             </w:r>
           </w:hyperlink>
         </w:p>
@@ -1663,7 +1697,7 @@
               <w:noProof/>
             </w:rPr>
           </w:pPr>
-          <w:hyperlink w:anchor="_Toc_cu_47">
+          <w:hyperlink w:anchor="_Toc_cu_48">
             <w:r>
               <w:rPr>
                 <w:noProof/>
@@ -1677,7 +1711,7 @@
             </w:rPr>
             <w:tab/>
           </w:r>
-          <w:hyperlink w:anchor="_Toc_cu_47">
+          <w:hyperlink w:anchor="_Toc_cu_48">
             <w:r>
               <w:rPr>
                 <w:noProof/>
@@ -1697,7 +1731,7 @@
               <w:noProof/>
             </w:rPr>
           </w:pPr>
-          <w:hyperlink w:anchor="_Toc_cu_48">
+          <w:hyperlink w:anchor="_Toc_cu_49">
             <w:r>
               <w:rPr>
                 <w:noProof/>
@@ -1711,7 +1745,7 @@
             </w:rPr>
             <w:tab/>
           </w:r>
-          <w:hyperlink w:anchor="_Toc_cu_48">
+          <w:hyperlink w:anchor="_Toc_cu_49">
             <w:r>
               <w:rPr>
                 <w:noProof/>
@@ -1731,7 +1765,7 @@
               <w:noProof/>
             </w:rPr>
           </w:pPr>
-          <w:hyperlink w:anchor="_Toc_cu_49">
+          <w:hyperlink w:anchor="_Toc_cu_50">
             <w:r>
               <w:rPr>
                 <w:noProof/>
@@ -1745,7 +1779,7 @@
             </w:rPr>
             <w:tab/>
           </w:r>
-          <w:hyperlink w:anchor="_Toc_cu_49">
+          <w:hyperlink w:anchor="_Toc_cu_50">
             <w:r>
               <w:rPr>
                 <w:noProof/>
@@ -1765,7 +1799,7 @@
               <w:noProof/>
             </w:rPr>
           </w:pPr>
-          <w:hyperlink w:anchor="_Toc_cu_50">
+          <w:hyperlink w:anchor="_Toc_cu_51">
             <w:r>
               <w:rPr>
                 <w:noProof/>
@@ -1779,12 +1813,12 @@
             </w:rPr>
             <w:tab/>
           </w:r>
-          <w:hyperlink w:anchor="_Toc_cu_50">
-            <w:r>
-              <w:rPr>
-                <w:noProof/>
-              </w:rPr>
-              <w:t>13</w:t>
+          <w:hyperlink w:anchor="_Toc_cu_51">
+            <w:r>
+              <w:rPr>
+                <w:noProof/>
+              </w:rPr>
+              <w:t>14</w:t>
             </w:r>
           </w:hyperlink>
         </w:p>
@@ -1799,7 +1833,7 @@
               <w:noProof/>
             </w:rPr>
           </w:pPr>
-          <w:hyperlink w:anchor="_Toc_cu_51">
+          <w:hyperlink w:anchor="_Toc_cu_52">
             <w:r>
               <w:rPr>
                 <w:noProof/>
@@ -1813,12 +1847,12 @@
             </w:rPr>
             <w:tab/>
           </w:r>
-          <w:hyperlink w:anchor="_Toc_cu_51">
-            <w:r>
-              <w:rPr>
-                <w:noProof/>
-              </w:rPr>
-              <w:t>13</w:t>
+          <w:hyperlink w:anchor="_Toc_cu_52">
+            <w:r>
+              <w:rPr>
+                <w:noProof/>
+              </w:rPr>
+              <w:t>14</w:t>
             </w:r>
           </w:hyperlink>
         </w:p>
@@ -1832,7 +1866,7 @@
               <w:noProof/>
             </w:rPr>
           </w:pPr>
-          <w:hyperlink w:anchor="_Toc_cu_52">
+          <w:hyperlink w:anchor="_Toc_cu_53">
             <w:r>
               <w:rPr>
                 <w:noProof/>
@@ -1846,7 +1880,7 @@
             </w:rPr>
             <w:tab/>
           </w:r>
-          <w:hyperlink w:anchor="_Toc_cu_52">
+          <w:hyperlink w:anchor="_Toc_cu_53">
             <w:r>
               <w:rPr>
                 <w:noProof/>
@@ -2187,7 +2221,7 @@
           <w:b/>
           <w:bCs/>
         </w:rPr>
-        <w:t xml:space="preserve">CUupdate_1.9.exe</w:t>
+        <w:t xml:space="preserve">CUupdate_2.0.exe</w:t>
       </w:r>
       <w:r>
         <w:t xml:space="preserve">. The machine it runs on does not need any additional software installed — everything required is contained within the application.</w:t>
@@ -2209,7 +2243,7 @@
         <w:rPr>
           <w:rFonts w:ascii="Consolas" w:cs="Consolas" w:eastAsia="Consolas" w:hAnsi="Consolas"/>
         </w:rPr>
-        <w:t xml:space="preserve">CUupdate_1.9.exe</w:t>
+        <w:t xml:space="preserve">CUupdate_2.0.exe</w:t>
       </w:r>
       <w:r>
         <w:t xml:space="preserve"> to the machine, or run it from where it is stored.</w:t>
@@ -4311,7 +4345,7 @@
         <w:rPr>
           <w:rFonts w:ascii="Consolas" w:cs="Consolas" w:eastAsia="Consolas" w:hAnsi="Consolas"/>
         </w:rPr>
-        <w:t xml:space="preserve">CUupdate_1.9.exe</w:t>
+        <w:t xml:space="preserve">CUupdate_2.0.exe</w:t>
       </w:r>
       <w:r>
         <w:t xml:space="preserve">.</w:t>
@@ -5692,7 +5726,7 @@
         <w:rPr>
           <w:rFonts w:ascii="Consolas" w:cs="Consolas" w:eastAsia="Consolas" w:hAnsi="Consolas"/>
         </w:rPr>
-        <w:t xml:space="preserve">CUupdate_1.9.exe</w:t>
+        <w:t xml:space="preserve">CUupdate_2.0.exe</w:t>
       </w:r>
       <w:r>
         <w:t xml:space="preserve"> file. No part of this is required at run time other than the application itself.</w:t>
@@ -6126,7 +6160,7 @@
         <w:rPr>
           <w:rFonts w:ascii="Consolas" w:cs="Consolas" w:eastAsia="Consolas" w:hAnsi="Consolas"/>
         </w:rPr>
-        <w:t xml:space="preserve">CUupdate_1.9.exe</w:t>
+        <w:t xml:space="preserve">CUupdate_2.0.exe</w:t>
       </w:r>
       <w:r>
         <w:t xml:space="preserve"> file. End users are given the finished application and do not build it themselves.</w:t>
@@ -7337,7 +7371,7 @@
       </w:pPr>
       <w:bookmarkStart w:id="9037" w:name="_Toc_cu_37"/>
       <w:r>
-        <w:t xml:space="preserve">8.1.6 A caption or option change — CARRY (always take the customer value)</w:t>
+        <w:t xml:space="preserve">8.1.5a A carried code block lands in its own procedure, even when the anchor text repeats</w:t>
       </w:r>
       <w:bookmarkEnd w:id="9037"/>
     </w:p>
@@ -7346,53 +7380,34 @@
         <w:spacing w:after="120"/>
       </w:pPr>
       <w:r>
-        <w:t xml:space="preserve">On </w:t>
+        <w:t xml:space="preserve">When a customer code block sits inside a procedure, the point it transplants to is found </w:t>
       </w:r>
       <w:r>
         <w:rPr>
           <w:b/>
           <w:bCs/>
         </w:rPr>
-        <w:t xml:space="preserve">any</w:t>
-      </w:r>
-      <w:r>
-        <w:t xml:space="preserve"> difference in </w:t>
+        <w:t xml:space="preserve">within that same procedure</w:t>
+      </w:r>
+      <w:r>
+        <w:t xml:space="preserve">, never in a different one. This matters because the lines a block anchors against are often vendor boilerplate that repeats — for example a </w:t>
       </w:r>
       <w:r>
         <w:rPr>
           <w:rFonts w:ascii="Consolas" w:cs="Consolas" w:eastAsia="Consolas" w:hAnsi="Consolas"/>
         </w:rPr>
-        <w:t xml:space="preserve">CaptionML</w:t>
-      </w:r>
-      <w:r>
-        <w:t xml:space="preserve">, </w:t>
-      </w:r>
-      <w:r>
-        <w:rPr>
-          <w:rFonts w:ascii="Consolas" w:cs="Consolas" w:eastAsia="Consolas" w:hAnsi="Consolas"/>
-        </w:rPr>
-        <w:t xml:space="preserve">OptionCaptionML</w:t>
-      </w:r>
-      <w:r>
-        <w:t xml:space="preserve"> or </w:t>
-      </w:r>
-      <w:r>
-        <w:rPr>
-          <w:rFonts w:ascii="Consolas" w:cs="Consolas" w:eastAsia="Consolas" w:hAnsi="Consolas"/>
-        </w:rPr>
-        <w:t xml:space="preserve">OptionString</w:t>
-      </w:r>
-      <w:r>
-        <w:t xml:space="preserve">, the customer value is carried forward. No tag is required. This is low-risk and easy to verify in testing, so it is always taken. The field's </w:t>
-      </w:r>
-      <w:r>
-        <w:rPr>
-          <w:rFonts w:ascii="Consolas" w:cs="Consolas" w:eastAsia="Consolas" w:hAnsi="Consolas"/>
-        </w:rPr>
-        <w:t xml:space="preserve">Description=</w:t>
-      </w:r>
-      <w:r>
-        <w:t xml:space="preserve"> tag list is carried with it, but only when the vendor's tags are a subset of the customer's, so that a vendor-added tag is never lost.</w:t>
+        <w:t xml:space="preserve">// Start PA036544</w:t>
+      </w:r>
+      <w:r>
+        <w:t xml:space="preserve"> marker, or the standard exit-point call, can appear at the end of several procedures in the same object. If the tool searched the whole object for the nearest matching anchor, a block could be carried into the wrong procedure: the text would match, but the surrounding variables would not exist there, and the merged object would not compile.</w:t>
+      </w:r>
+    </w:p>
+    <w:p>
+      <w:pPr>
+        <w:spacing w:after="120"/>
+      </w:pPr>
+      <w:r>
+        <w:t xml:space="preserve">The tool prevents this by first identifying the procedure the block belongs to in A, finding the same procedure in B, and confining the search for the insertion point to that procedure. The procedure is matched by its number first and its name second, so a procedure the vendor has renamed (but not renumbered) is still recognised as the same procedure. If the procedure the block lives in has been removed from the vendor object entirely, the block has nowhere safe to land and the whole object is sent to manual review rather than guessed.</w:t>
       </w:r>
     </w:p>
     <w:p>
@@ -7409,10 +7424,119 @@
           <w:i/>
           <w:iCs/>
         </w:rPr>
-        <w:t xml:space="preserve">Validated on Table 36:</w:t>
-      </w:r>
-      <w:r>
-        <w:t xml:space="preserve"> fields 11 and 100, where the customer caption "Customer Order No." differs from the cumulative-update caption "Your Reference". The customer caption is kept.</w:t>
+        <w:t xml:space="preserve">Validated on Table 17 (G/L Entry):</w:t>
+      </w:r>
+      <w:r>
+        <w:t xml:space="preserve"> the customer's </w:t>
+      </w:r>
+      <w:r>
+        <w:rPr>
+          <w:rFonts w:ascii="Consolas" w:cs="Consolas" w:eastAsia="Consolas" w:hAnsi="Consolas"/>
+        </w:rPr>
+        <w:t xml:space="preserve">// Start AP001994</w:t>
+      </w:r>
+      <w:r>
+        <w:t xml:space="preserve"> block (which sets "Posted Description") sits at the end of </w:t>
+      </w:r>
+      <w:r>
+        <w:rPr>
+          <w:rFonts w:ascii="Consolas" w:cs="Consolas" w:eastAsia="Consolas" w:hAnsi="Consolas"/>
+        </w:rPr>
+        <w:t xml:space="preserve">CopyFromGenJnlLine</w:t>
+      </w:r>
+      <w:r>
+        <w:t xml:space="preserve">. Its closing anchor, a </w:t>
+      </w:r>
+      <w:r>
+        <w:rPr>
+          <w:rFonts w:ascii="Consolas" w:cs="Consolas" w:eastAsia="Consolas" w:hAnsi="Consolas"/>
+        </w:rPr>
+        <w:t xml:space="preserve">// Start PA036544</w:t>
+      </w:r>
+      <w:r>
+        <w:t xml:space="preserve"> marker, also appears at the end of four other procedures in the same object. The block is carried into </w:t>
+      </w:r>
+      <w:r>
+        <w:rPr>
+          <w:rFonts w:ascii="Consolas" w:cs="Consolas" w:eastAsia="Consolas" w:hAnsi="Consolas"/>
+        </w:rPr>
+        <w:t xml:space="preserve">CopyFromGenJnlLine</w:t>
+      </w:r>
+      <w:r>
+        <w:t xml:space="preserve">, where the </w:t>
+      </w:r>
+      <w:r>
+        <w:rPr>
+          <w:rFonts w:ascii="Consolas" w:cs="Consolas" w:eastAsia="Consolas" w:hAnsi="Consolas"/>
+        </w:rPr>
+        <w:t xml:space="preserve">GenJnlLine</w:t>
+      </w:r>
+      <w:r>
+        <w:t xml:space="preserve"> parameter it reads is in scope — not into one of the other procedures that share the same anchor text. (An earlier version of the tool carried this block into the wrong procedure.)</w:t>
+      </w:r>
+    </w:p>
+    <w:p>
+      <w:pPr>
+        <w:pStyle w:val="Heading3"/>
+      </w:pPr>
+      <w:bookmarkStart w:id="9038" w:name="_Toc_cu_38"/>
+      <w:r>
+        <w:t xml:space="preserve">8.1.6 A caption or option change — CARRY (always take the customer value)</w:t>
+      </w:r>
+      <w:bookmarkEnd w:id="9038"/>
+    </w:p>
+    <w:p>
+      <w:pPr>
+        <w:spacing w:after="120"/>
+      </w:pPr>
+      <w:r>
+        <w:t xml:space="preserve">On </w:t>
+      </w:r>
+      <w:r>
+        <w:rPr>
+          <w:b/>
+          <w:bCs/>
+        </w:rPr>
+        <w:t xml:space="preserve">any</w:t>
+      </w:r>
+      <w:r>
+        <w:t xml:space="preserve"> difference in </w:t>
+      </w:r>
+      <w:r>
+        <w:rPr>
+          <w:rFonts w:ascii="Consolas" w:cs="Consolas" w:eastAsia="Consolas" w:hAnsi="Consolas"/>
+        </w:rPr>
+        <w:t xml:space="preserve">CaptionML</w:t>
+      </w:r>
+      <w:r>
+        <w:t xml:space="preserve">, </w:t>
+      </w:r>
+      <w:r>
+        <w:rPr>
+          <w:rFonts w:ascii="Consolas" w:cs="Consolas" w:eastAsia="Consolas" w:hAnsi="Consolas"/>
+        </w:rPr>
+        <w:t xml:space="preserve">OptionCaptionML</w:t>
+      </w:r>
+      <w:r>
+        <w:t xml:space="preserve"> or </w:t>
+      </w:r>
+      <w:r>
+        <w:rPr>
+          <w:rFonts w:ascii="Consolas" w:cs="Consolas" w:eastAsia="Consolas" w:hAnsi="Consolas"/>
+        </w:rPr>
+        <w:t xml:space="preserve">OptionString</w:t>
+      </w:r>
+      <w:r>
+        <w:t xml:space="preserve">, the customer value is carried forward. No tag is required. This is low-risk and easy to verify in testing, so it is always taken. The field's </w:t>
+      </w:r>
+      <w:r>
+        <w:rPr>
+          <w:rFonts w:ascii="Consolas" w:cs="Consolas" w:eastAsia="Consolas" w:hAnsi="Consolas"/>
+        </w:rPr>
+        <w:t xml:space="preserve">Description=</w:t>
+      </w:r>
+      <w:r>
+        <w:t xml:space="preserve"> tag list is carried with it, but only when the vendor's tags are a subset of the customer's, so that a vendor-added tag is never lost.</w:t>
       </w:r>
     </w:p>
     <w:p>
@@ -7429,48 +7553,10 @@
           <w:i/>
           <w:iCs/>
         </w:rPr>
-        <w:t xml:space="preserve">Validated on Table 77 (Report Selections):</w:t>
-      </w:r>
-      <w:r>
-        <w:t xml:space="preserve"> field 1, "Usage", where the customer had appended Direct Credit options to the option string and option caption. These are carried forward. (An earlier version of the tool incorrectly took the vendor value here.)</w:t>
-      </w:r>
-    </w:p>
-    <w:p>
-      <w:pPr>
-        <w:shd w:fill="FFF6E0" w:val="clear"/>
-        <w:spacing w:after="120" w:before="80"/>
-        <w:ind w:left="360"/>
-      </w:pPr>
-      <w:r>
-        <w:t xml:space="preserve">A non-blocking warning is raised, but the carry still proceeds, if the vendor </w:t>
-      </w:r>
-      <w:r>
-        <w:rPr>
-          <w:b/>
-          <w:bCs/>
-        </w:rPr>
-        <w:t xml:space="preserve">also</w:t>
-      </w:r>
-      <w:r>
-        <w:t xml:space="preserve"> changed the options in the middle of the list (that is, the vendor's option string is not a leading part of the customer's). A mid-list vendor change can shift the option ordinals, so the item is flagged for the developer to check.</w:t>
-      </w:r>
-    </w:p>
-    <w:p>
-      <w:pPr>
-        <w:pStyle w:val="Heading3"/>
-      </w:pPr>
-      <w:bookmarkStart w:id="9038" w:name="_Toc_cu_38"/>
-      <w:r>
-        <w:t xml:space="preserve">8.1.7 A field with both a code change and an option change — both are carried</w:t>
-      </w:r>
-      <w:bookmarkEnd w:id="9038"/>
-    </w:p>
-    <w:p>
-      <w:pPr>
-        <w:spacing w:after="120"/>
-      </w:pPr>
-      <w:r>
-        <w:t xml:space="preserve">A field can have both a customer code block in its trigger and an extended option or caption. These are not treated as alternatives. The tool produces a scorer-routed code item and a caption carry for the same field.</w:t>
+        <w:t xml:space="preserve">Validated on Table 36:</w:t>
+      </w:r>
+      <w:r>
+        <w:t xml:space="preserve"> fields 11 and 100, where the customer caption "Customer Order No." differs from the cumulative-update caption "Your Reference". The customer caption is kept.</w:t>
       </w:r>
     </w:p>
     <w:p>
@@ -7487,10 +7573,30 @@
           <w:i/>
           <w:iCs/>
         </w:rPr>
-        <w:t xml:space="preserve">Validated on Table 80:</w:t>
-      </w:r>
-      <w:r>
-        <w:t xml:space="preserve"> field 9, "Type", had both a CASE branch and an extended option string, option caption and description tag. Both are carried.</w:t>
+        <w:t xml:space="preserve">Validated on Table 77 (Report Selections):</w:t>
+      </w:r>
+      <w:r>
+        <w:t xml:space="preserve"> field 1, "Usage", where the customer had appended Direct Credit options to the option string and option caption. These are carried forward. (An earlier version of the tool incorrectly took the vendor value here.)</w:t>
+      </w:r>
+    </w:p>
+    <w:p>
+      <w:pPr>
+        <w:shd w:fill="FFF6E0" w:val="clear"/>
+        <w:spacing w:after="120" w:before="80"/>
+        <w:ind w:left="360"/>
+      </w:pPr>
+      <w:r>
+        <w:t xml:space="preserve">A non-blocking warning is raised, but the carry still proceeds, if the vendor </w:t>
+      </w:r>
+      <w:r>
+        <w:rPr>
+          <w:b/>
+          <w:bCs/>
+        </w:rPr>
+        <w:t xml:space="preserve">also</w:t>
+      </w:r>
+      <w:r>
+        <w:t xml:space="preserve"> changed the options in the middle of the list (that is, the vendor's option string is not a leading part of the customer's). A mid-list vendor change can shift the option ordinals, so the item is flagged for the developer to check.</w:t>
       </w:r>
     </w:p>
     <w:p>
@@ -7499,7 +7605,7 @@
       </w:pPr>
       <w:bookmarkStart w:id="9039" w:name="_Toc_cu_39"/>
       <w:r>
-        <w:t xml:space="preserve">8.1.8 Customer variable declarations — CARRY (keep rather than delete)</w:t>
+        <w:t xml:space="preserve">8.1.7 A field with both a code change and an option change — both are carried</w:t>
       </w:r>
       <w:bookmarkEnd w:id="9039"/>
     </w:p>
@@ -7508,7 +7614,7 @@
         <w:spacing w:after="120"/>
       </w:pPr>
       <w:r>
-        <w:t xml:space="preserve">A variable declared in the VAR section of A — either the object-level (global) section, or a procedure-level (local) section — but absent from the matching section of B, is carried forward. The justification is compile-safety alone: a variable that is referenced but not declared fails to compile, whereas a variable that is declared but unused is harmless. The tool therefore never drops a declaration. The carry is performed silently and recorded, because it only ever adds. A variable declaration carries no tag, so there is no source information to reason from; the rule is simply to keep it.</w:t>
+        <w:t xml:space="preserve">A field can have both a customer code block in its trigger and an extended option or caption. These are not treated as alternatives. The tool produces a scorer-routed code item and a caption carry for the same field.</w:t>
       </w:r>
     </w:p>
     <w:p>
@@ -7525,19 +7631,10 @@
           <w:i/>
           <w:iCs/>
         </w:rPr>
-        <w:t xml:space="preserve">Validated on Table 81:</w:t>
-      </w:r>
-      <w:r>
-        <w:t xml:space="preserve"> a global variable, </w:t>
-      </w:r>
-      <w:r>
-        <w:rPr>
-          <w:rFonts w:ascii="Consolas" w:cs="Consolas" w:eastAsia="Consolas" w:hAnsi="Consolas"/>
-        </w:rPr>
-        <w:t xml:space="preserve">VendBankAccG</w:t>
-      </w:r>
-      <w:r>
-        <w:t xml:space="preserve">, used by carried code, was being dropped. It is now carried forward so that the merged object compiles.</w:t>
+        <w:t xml:space="preserve">Validated on Table 80:</w:t>
+      </w:r>
+      <w:r>
+        <w:t xml:space="preserve"> field 9, "Type", had both a CASE branch and an extended option string, option caption and description tag. Both are carried.</w:t>
       </w:r>
     </w:p>
     <w:p>
@@ -7546,7 +7643,7 @@
       </w:pPr>
       <w:bookmarkStart w:id="9040" w:name="_Toc_cu_40"/>
       <w:r>
-        <w:t xml:space="preserve">8.1.9 A customer-extended option-string variable — CARRY</w:t>
+        <w:t xml:space="preserve">8.1.8 Customer variable declarations — CARRY (keep rather than delete)</w:t>
       </w:r>
       <w:bookmarkEnd w:id="9040"/>
     </w:p>
@@ -7555,7 +7652,7 @@
         <w:spacing w:after="120"/>
       </w:pPr>
       <w:r>
-        <w:t xml:space="preserve">A variable present in both A and B, where both values are quoted text and the vendor's value is a leading part of the customer's value (that is, the customer appended options), takes the customer's value. A rename or a re-ordering is not a leading part of the value, so it fails this test and is sent to the whole-object manual-review gate; the tool does not guess at it.</w:t>
+        <w:t xml:space="preserve">A variable declared in the VAR section of A — either the object-level (global) section, or a procedure-level (local) section — but absent from the matching section of B, is carried forward. The justification is compile-safety alone: a variable that is referenced but not declared fails to compile, whereas a variable that is declared but unused is harmless. The tool therefore never drops a declaration. The carry is performed silently and recorded, because it only ever adds. A variable declaration carries no tag, so there is no source information to reason from; the rule is simply to keep it.</w:t>
       </w:r>
     </w:p>
     <w:p>
@@ -7572,19 +7669,19 @@
           <w:i/>
           <w:iCs/>
         </w:rPr>
-        <w:t xml:space="preserve">Validated on Page 347:</w:t>
-      </w:r>
-      <w:r>
-        <w:t xml:space="preserve"> the customer's extension of the </w:t>
+        <w:t xml:space="preserve">Validated on Table 81:</w:t>
+      </w:r>
+      <w:r>
+        <w:t xml:space="preserve"> a global variable, </w:t>
       </w:r>
       <w:r>
         <w:rPr>
           <w:rFonts w:ascii="Consolas" w:cs="Consolas" w:eastAsia="Consolas" w:hAnsi="Consolas"/>
         </w:rPr>
-        <w:t xml:space="preserve">ReportUsage2</w:t>
-      </w:r>
-      <w:r>
-        <w:t xml:space="preserve"> option list is carried forward.</w:t>
+        <w:t xml:space="preserve">VendBankAccG</w:t>
+      </w:r>
+      <w:r>
+        <w:t xml:space="preserve">, used by carried code, was being dropped. It is now carried forward so that the merged object compiles.</w:t>
       </w:r>
     </w:p>
     <w:p>
@@ -7593,7 +7690,7 @@
       </w:pPr>
       <w:bookmarkStart w:id="9041" w:name="_Toc_cu_41"/>
       <w:r>
-        <w:t xml:space="preserve">8.1.10 Header and changelog bookkeeping (every automatic merge)</w:t>
+        <w:t xml:space="preserve">8.1.9 A customer-extended option-string variable — CARRY</w:t>
       </w:r>
       <w:bookmarkEnd w:id="9041"/>
     </w:p>
@@ -7602,7 +7699,7 @@
         <w:spacing w:after="120"/>
       </w:pPr>
       <w:r>
-        <w:t xml:space="preserve">When the tool builds C, it also performs the mechanical bookkeeping a hand merge would:</w:t>
+        <w:t xml:space="preserve">A variable present in both A and B, where both values are quoted text and the vendor's value is a leading part of the customer's value (that is, the customer appended options), takes the customer's value. A rename or a re-ordering is not a leading part of the value, so it fails this test and is sent to the whole-object manual-review gate; the tool does not guess at it.</w:t>
       </w:r>
     </w:p>
     <w:p>
@@ -7616,40 +7713,40 @@
       </w:pPr>
       <w:r>
         <w:rPr>
-          <w:b/>
-          <w:bCs/>
-        </w:rPr>
-        <w:t xml:space="preserve">Header:</w:t>
-      </w:r>
-      <w:r>
-        <w:t xml:space="preserve"> it sets </w:t>
+          <w:i/>
+          <w:iCs/>
+        </w:rPr>
+        <w:t xml:space="preserve">Validated on Page 347:</w:t>
+      </w:r>
+      <w:r>
+        <w:t xml:space="preserve"> the customer's extension of the </w:t>
       </w:r>
       <w:r>
         <w:rPr>
           <w:rFonts w:ascii="Consolas" w:cs="Consolas" w:eastAsia="Consolas" w:hAnsi="Consolas"/>
         </w:rPr>
-        <w:t xml:space="preserve">Date=</w:t>
-      </w:r>
-      <w:r>
-        <w:t xml:space="preserve"> to the merge date, in the declared database locale; reasserts </w:t>
-      </w:r>
-      <w:r>
-        <w:rPr>
-          <w:rFonts w:ascii="Consolas" w:cs="Consolas" w:eastAsia="Consolas" w:hAnsi="Consolas"/>
-        </w:rPr>
-        <w:t xml:space="preserve">Modified=Yes</w:t>
-      </w:r>
-      <w:r>
-        <w:t xml:space="preserve">; preserves the </w:t>
-      </w:r>
-      <w:r>
-        <w:rPr>
-          <w:rFonts w:ascii="Consolas" w:cs="Consolas" w:eastAsia="Consolas" w:hAnsi="Consolas"/>
-        </w:rPr>
-        <w:t xml:space="preserve">Time</w:t>
-      </w:r>
-      <w:r>
-        <w:t xml:space="preserve"> value from B unchanged; and appends the CU token to the version-list tokens of A (A carries the customer tokens; B is the standard vendor object).</w:t>
+        <w:t xml:space="preserve">ReportUsage2</w:t>
+      </w:r>
+      <w:r>
+        <w:t xml:space="preserve"> option list is carried forward.</w:t>
+      </w:r>
+    </w:p>
+    <w:p>
+      <w:pPr>
+        <w:pStyle w:val="Heading3"/>
+      </w:pPr>
+      <w:bookmarkStart w:id="9042" w:name="_Toc_cu_42"/>
+      <w:r>
+        <w:t xml:space="preserve">8.1.10 Header and changelog bookkeeping (every automatic merge)</w:t>
+      </w:r>
+      <w:bookmarkEnd w:id="9042"/>
+    </w:p>
+    <w:p>
+      <w:pPr>
+        <w:spacing w:after="120"/>
+      </w:pPr>
+      <w:r>
+        <w:t xml:space="preserve">When the tool builds C, it also performs the mechanical bookkeeping a hand merge would:</w:t>
       </w:r>
     </w:p>
     <w:p>
@@ -7666,20 +7763,37 @@
           <w:b/>
           <w:bCs/>
         </w:rPr>
-        <w:t xml:space="preserve">Placement:</w:t>
-      </w:r>
-      <w:r>
-        <w:t xml:space="preserve"> customer content is inserted </w:t>
-      </w:r>
-      <w:r>
-        <w:rPr>
-          <w:b/>
-          <w:bCs/>
-        </w:rPr>
-        <w:t xml:space="preserve">after</w:t>
-      </w:r>
-      <w:r>
-        <w:t xml:space="preserve"> the corresponding vendor content, which matches the established TortoiseMerge habit.</w:t>
+        <w:t xml:space="preserve">Header:</w:t>
+      </w:r>
+      <w:r>
+        <w:t xml:space="preserve"> it sets </w:t>
+      </w:r>
+      <w:r>
+        <w:rPr>
+          <w:rFonts w:ascii="Consolas" w:cs="Consolas" w:eastAsia="Consolas" w:hAnsi="Consolas"/>
+        </w:rPr>
+        <w:t xml:space="preserve">Date=</w:t>
+      </w:r>
+      <w:r>
+        <w:t xml:space="preserve"> to the merge date, in the declared database locale; reasserts </w:t>
+      </w:r>
+      <w:r>
+        <w:rPr>
+          <w:rFonts w:ascii="Consolas" w:cs="Consolas" w:eastAsia="Consolas" w:hAnsi="Consolas"/>
+        </w:rPr>
+        <w:t xml:space="preserve">Modified=Yes</w:t>
+      </w:r>
+      <w:r>
+        <w:t xml:space="preserve">; preserves the </w:t>
+      </w:r>
+      <w:r>
+        <w:rPr>
+          <w:rFonts w:ascii="Consolas" w:cs="Consolas" w:eastAsia="Consolas" w:hAnsi="Consolas"/>
+        </w:rPr>
+        <w:t xml:space="preserve">Time</w:t>
+      </w:r>
+      <w:r>
+        <w:t xml:space="preserve"> value from B unchanged; and appends the CU token to the version-list tokens of A (A carries the customer tokens; B is the standard vendor object).</w:t>
       </w:r>
     </w:p>
     <w:p>
@@ -7696,83 +7810,20 @@
           <w:b/>
           <w:bCs/>
         </w:rPr>
-        <w:t xml:space="preserve">Changelog (documentation trigger):</w:t>
-      </w:r>
-      <w:r>
-        <w:t xml:space="preserve"> the tool keeps B's entries, including the newest vendor entries; then appends the customer entries from A that are not already present in B, matched by exact line, so that this is independent of any tag prefix; then appends a single CU stamp line last, at the standard six-space indent. This is a combined list: it loses neither the vendor's new entries nor the customer's entries.</w:t>
-      </w:r>
-    </w:p>
-    <w:p>
-      <w:pPr>
-        <w:pStyle w:val="Heading3"/>
-      </w:pPr>
-      <w:bookmarkStart w:id="9042" w:name="_Toc_cu_42"/>
-      <w:r>
-        <w:t xml:space="preserve">8.1.11 Differences in tag spelling are standardised</w:t>
-      </w:r>
-      <w:bookmarkEnd w:id="9042"/>
-    </w:p>
-    <w:p>
-      <w:pPr>
-        <w:spacing w:after="120"/>
-      </w:pPr>
-      <w:r>
-        <w:t xml:space="preserve">A difference in tag spelling between the version list and the body (for example, </w:t>
-      </w:r>
-      <w:r>
-        <w:rPr>
-          <w:rFonts w:ascii="Consolas" w:cs="Consolas" w:eastAsia="Consolas" w:hAnsi="Consolas"/>
-        </w:rPr>
-        <w:t xml:space="preserve">WBL-009</w:t>
-      </w:r>
-      <w:r>
-        <w:t xml:space="preserve"> in the body against </w:t>
-      </w:r>
-      <w:r>
-        <w:rPr>
-          <w:rFonts w:ascii="Consolas" w:cs="Consolas" w:eastAsia="Consolas" w:hAnsi="Consolas"/>
-        </w:rPr>
-        <w:t xml:space="preserve">WBL009</w:t>
-      </w:r>
-      <w:r>
-        <w:t xml:space="preserve"> in the version list) is matched without regard to hyphens or full stops, and the </w:t>
+        <w:t xml:space="preserve">Placement:</w:t>
+      </w:r>
+      <w:r>
+        <w:t xml:space="preserve"> customer content is inserted </w:t>
       </w:r>
       <w:r>
         <w:rPr>
           <w:b/>
           <w:bCs/>
         </w:rPr>
-        <w:t xml:space="preserve">version-list spelling is treated as the standard form</w:t>
-      </w:r>
-      <w:r>
-        <w:t xml:space="preserve">. The difference is flagged, and the merged object is written with the standard tag, so that the next upgrade reads a clean tag. A plain </w:t>
-      </w:r>
-      <w:r>
-        <w:rPr>
-          <w:rFonts w:ascii="Consolas" w:cs="Consolas" w:eastAsia="Consolas" w:hAnsi="Consolas"/>
-        </w:rPr>
-        <w:t xml:space="preserve">WBL</w:t>
-      </w:r>
-      <w:r>
-        <w:t xml:space="preserve"> with no identifier is left as it is; the tool never invents an identifier.</w:t>
-      </w:r>
-    </w:p>
-    <w:p>
-      <w:pPr>
-        <w:pStyle w:val="Heading2"/>
-      </w:pPr>
-      <w:bookmarkStart w:id="9043" w:name="_Toc_cu_43"/>
-      <w:r>
-        <w:t xml:space="preserve">8.2 Codeunit</w:t>
-      </w:r>
-      <w:bookmarkEnd w:id="9043"/>
-    </w:p>
-    <w:p>
-      <w:pPr>
-        <w:spacing w:after="120"/>
-      </w:pPr>
-      <w:r>
-        <w:t xml:space="preserve">A codeunit contains code only. It has no field nodes, so the field-graft, caption and option rules do not apply; they are explicitly disabled, so that they can never be applied wrongly. What runs is:</w:t>
+        <w:t xml:space="preserve">after</w:t>
+      </w:r>
+      <w:r>
+        <w:t xml:space="preserve"> the corresponding vendor content, which matches the established TortoiseMerge habit.</w:t>
       </w:r>
     </w:p>
     <w:p>
@@ -7789,10 +7840,83 @@
           <w:b/>
           <w:bCs/>
         </w:rPr>
-        <w:t xml:space="preserve">Customer code blocks</w:t>
-      </w:r>
-      <w:r>
-        <w:t xml:space="preserve"> — passed to the scorer, exactly as in section 8.1.4 (pure addition, vanilla modification or vanilla suppression; CARRY or MANUAL according to whether the insertion point survives).</w:t>
+        <w:t xml:space="preserve">Changelog (documentation trigger):</w:t>
+      </w:r>
+      <w:r>
+        <w:t xml:space="preserve"> the tool keeps B's entries, including the newest vendor entries; then appends the customer entries from A that are not already present in B, matched by exact line, so that this is independent of any tag prefix; then appends a single CU stamp line last, at the standard six-space indent. This is a combined list: it loses neither the vendor's new entries nor the customer's entries.</w:t>
+      </w:r>
+    </w:p>
+    <w:p>
+      <w:pPr>
+        <w:pStyle w:val="Heading3"/>
+      </w:pPr>
+      <w:bookmarkStart w:id="9043" w:name="_Toc_cu_43"/>
+      <w:r>
+        <w:t xml:space="preserve">8.1.11 Differences in tag spelling are standardised</w:t>
+      </w:r>
+      <w:bookmarkEnd w:id="9043"/>
+    </w:p>
+    <w:p>
+      <w:pPr>
+        <w:spacing w:after="120"/>
+      </w:pPr>
+      <w:r>
+        <w:t xml:space="preserve">A difference in tag spelling between the version list and the body (for example, </w:t>
+      </w:r>
+      <w:r>
+        <w:rPr>
+          <w:rFonts w:ascii="Consolas" w:cs="Consolas" w:eastAsia="Consolas" w:hAnsi="Consolas"/>
+        </w:rPr>
+        <w:t xml:space="preserve">WBL-009</w:t>
+      </w:r>
+      <w:r>
+        <w:t xml:space="preserve"> in the body against </w:t>
+      </w:r>
+      <w:r>
+        <w:rPr>
+          <w:rFonts w:ascii="Consolas" w:cs="Consolas" w:eastAsia="Consolas" w:hAnsi="Consolas"/>
+        </w:rPr>
+        <w:t xml:space="preserve">WBL009</w:t>
+      </w:r>
+      <w:r>
+        <w:t xml:space="preserve"> in the version list) is matched without regard to hyphens or full stops, and the </w:t>
+      </w:r>
+      <w:r>
+        <w:rPr>
+          <w:b/>
+          <w:bCs/>
+        </w:rPr>
+        <w:t xml:space="preserve">version-list spelling is treated as the standard form</w:t>
+      </w:r>
+      <w:r>
+        <w:t xml:space="preserve">. The difference is flagged, and the merged object is written with the standard tag, so that the next upgrade reads a clean tag. A plain </w:t>
+      </w:r>
+      <w:r>
+        <w:rPr>
+          <w:rFonts w:ascii="Consolas" w:cs="Consolas" w:eastAsia="Consolas" w:hAnsi="Consolas"/>
+        </w:rPr>
+        <w:t xml:space="preserve">WBL</w:t>
+      </w:r>
+      <w:r>
+        <w:t xml:space="preserve"> with no identifier is left as it is; the tool never invents an identifier.</w:t>
+      </w:r>
+    </w:p>
+    <w:p>
+      <w:pPr>
+        <w:pStyle w:val="Heading2"/>
+      </w:pPr>
+      <w:bookmarkStart w:id="9044" w:name="_Toc_cu_44"/>
+      <w:r>
+        <w:t xml:space="preserve">8.2 Codeunit</w:t>
+      </w:r>
+      <w:bookmarkEnd w:id="9044"/>
+    </w:p>
+    <w:p>
+      <w:pPr>
+        <w:spacing w:after="120"/>
+      </w:pPr>
+      <w:r>
+        <w:t xml:space="preserve">A codeunit contains code only. It has no field nodes, so the field-graft, caption and option rules do not apply; they are explicitly disabled, so that they can never be applied wrongly. What runs is:</w:t>
       </w:r>
     </w:p>
     <w:p>
@@ -7809,10 +7933,10 @@
           <w:b/>
           <w:bCs/>
         </w:rPr>
-        <w:t xml:space="preserve">Customer variable declarations</w:t>
-      </w:r>
-      <w:r>
-        <w:t xml:space="preserve"> — carried, as in section 8.1.7.</w:t>
+        <w:t xml:space="preserve">Customer code blocks</w:t>
+      </w:r>
+      <w:r>
+        <w:t xml:space="preserve"> — passed to the scorer, exactly as in section 8.1.4 (pure addition, vanilla modification or vanilla suppression; CARRY or MANUAL according to whether the insertion point survives).</w:t>
       </w:r>
     </w:p>
     <w:p>
@@ -7829,10 +7953,10 @@
           <w:b/>
           <w:bCs/>
         </w:rPr>
-        <w:t xml:space="preserve">Changelog carry and header bookkeeping</w:t>
-      </w:r>
-      <w:r>
-        <w:t xml:space="preserve"> — as in section 8.1.9.</w:t>
+        <w:t xml:space="preserve">Customer variable declarations</w:t>
+      </w:r>
+      <w:r>
+        <w:t xml:space="preserve"> — carried, as in section 8.1.7.</w:t>
       </w:r>
     </w:p>
     <w:p>
@@ -7849,10 +7973,10 @@
           <w:b/>
           <w:bCs/>
         </w:rPr>
-        <w:t xml:space="preserve">An untagged region where A differs from B</w:t>
-      </w:r>
-      <w:r>
-        <w:t xml:space="preserve"> — TAKE B. For code objects, tag discipline is reliable, so an untagged code difference is most likely the vendor's own change. This is the one remaining case where vendor content is taken without an explicit signal; it is accepted deliberately, and is confined to code objects, where tag discipline holds. It does not apply to pages or reports.</w:t>
+        <w:t xml:space="preserve">Changelog carry and header bookkeeping</w:t>
+      </w:r>
+      <w:r>
+        <w:t xml:space="preserve"> — as in section 8.1.9.</w:t>
       </w:r>
     </w:p>
     <w:p>
@@ -7866,49 +7990,13 @@
       </w:pPr>
       <w:r>
         <w:rPr>
-          <w:i/>
-          <w:iCs/>
-        </w:rPr>
-        <w:t xml:space="preserve">Validated on Codeunit 80 (Sales-Post):</w:t>
-      </w:r>
-      <w:r>
-        <w:t xml:space="preserve"> customer vanilla modifications are sent to manual review; the vendor's own tag defects, present identically in A and B, are tolerated rather than stopped on.</w:t>
-      </w:r>
-    </w:p>
-    <w:p>
-      <w:pPr>
-        <w:pStyle w:val="Heading2"/>
-      </w:pPr>
-      <w:bookmarkStart w:id="9044" w:name="_Toc_cu_44"/>
-      <w:r>
-        <w:t xml:space="preserve">8.3 Page</w:t>
-      </w:r>
-      <w:bookmarkEnd w:id="9044"/>
-    </w:p>
-    <w:p>
-      <w:pPr>
-        <w:spacing w:after="120"/>
-      </w:pPr>
-      <w:r>
-        <w:t xml:space="preserve">A page is a structure-bearing object: it consists of a tree of controls, captions and layout, and is often untagged, because there is frequently no natural place for an inline code tag. The absence of tags is therefore never read as "unchanged"; the tool works from the structural comparison and the changelog. The page handler is validated: it merges confident cases automatically and sends uncertain ones to manual review.</w:t>
-      </w:r>
-    </w:p>
-    <w:p>
-      <w:pPr>
-        <w:pStyle w:val="Heading3"/>
-      </w:pPr>
-      <w:bookmarkStart w:id="9045" w:name="_Toc_cu_45"/>
-      <w:r>
-        <w:t xml:space="preserve">8.3.1 A control added by the customer — CARRY (graft)</w:t>
-      </w:r>
-      <w:bookmarkEnd w:id="9045"/>
-    </w:p>
-    <w:p>
-      <w:pPr>
-        <w:spacing w:after="120"/>
-      </w:pPr>
-      <w:r>
-        <w:t xml:space="preserve">A control present in A, absent from B, and justified either by a changelog entry that names it or by a customer tag, is grafted into the controls of B after the control that still exists in B. This is structurally the same as a table field graft, with page spacing (pages separate sibling controls with a blank line).</w:t>
+          <w:b/>
+          <w:bCs/>
+        </w:rPr>
+        <w:t xml:space="preserve">An untagged region where A differs from B</w:t>
+      </w:r>
+      <w:r>
+        <w:t xml:space="preserve"> — TAKE B. For code objects, tag discipline is reliable, so an untagged code difference is most likely the vendor's own change. This is the one remaining case where vendor content is taken without an explicit signal; it is accepted deliberately, and is confined to code objects, where tag discipline holds. It does not apply to pages or reports.</w:t>
       </w:r>
     </w:p>
     <w:p>
@@ -7925,10 +8013,46 @@
           <w:i/>
           <w:iCs/>
         </w:rPr>
-        <w:t xml:space="preserve">Validated on Page 14:</w:t>
-      </w:r>
-      <w:r>
-        <w:t xml:space="preserve"> the customer added an "E-Mail" control, justified only by the changelog entry "Added E-Mail field", with no tag on the control itself. It is grafted after its anchor, the "Phone No." control, identically to the hand merge.</w:t>
+        <w:t xml:space="preserve">Validated on Codeunit 80 (Sales-Post):</w:t>
+      </w:r>
+      <w:r>
+        <w:t xml:space="preserve"> customer vanilla modifications are sent to manual review; the vendor's own tag defects, present identically in A and B, are tolerated rather than stopped on.</w:t>
+      </w:r>
+    </w:p>
+    <w:p>
+      <w:pPr>
+        <w:pStyle w:val="Heading2"/>
+      </w:pPr>
+      <w:bookmarkStart w:id="9045" w:name="_Toc_cu_45"/>
+      <w:r>
+        <w:t xml:space="preserve">8.3 Page</w:t>
+      </w:r>
+      <w:bookmarkEnd w:id="9045"/>
+    </w:p>
+    <w:p>
+      <w:pPr>
+        <w:spacing w:after="120"/>
+      </w:pPr>
+      <w:r>
+        <w:t xml:space="preserve">A page is a structure-bearing object: it consists of a tree of controls, captions and layout, and is often untagged, because there is frequently no natural place for an inline code tag. The absence of tags is therefore never read as "unchanged"; the tool works from the structural comparison and the changelog. The page handler is validated: it merges confident cases automatically and sends uncertain ones to manual review.</w:t>
+      </w:r>
+    </w:p>
+    <w:p>
+      <w:pPr>
+        <w:pStyle w:val="Heading3"/>
+      </w:pPr>
+      <w:bookmarkStart w:id="9046" w:name="_Toc_cu_46"/>
+      <w:r>
+        <w:t xml:space="preserve">8.3.1 A control added by the customer — CARRY (graft)</w:t>
+      </w:r>
+      <w:bookmarkEnd w:id="9046"/>
+    </w:p>
+    <w:p>
+      <w:pPr>
+        <w:spacing w:after="120"/>
+      </w:pPr>
+      <w:r>
+        <w:t xml:space="preserve">A control present in A, absent from B, and justified either by a changelog entry that names it or by a customer tag, is grafted into the controls of B after the control that still exists in B. This is structurally the same as a table field graft, with page spacing (pages separate sibling controls with a blank line).</w:t>
       </w:r>
     </w:p>
     <w:p>
@@ -7945,28 +8069,10 @@
           <w:i/>
           <w:iCs/>
         </w:rPr>
-        <w:t xml:space="preserve">Validated on Page 21 (tagged version):</w:t>
-      </w:r>
-      <w:r>
-        <w:t xml:space="preserve"> the four customer FactBoxes, carrying a customer tag, merge automatically as confident grafts, in the correct order even when several share one anchor.</w:t>
-      </w:r>
-    </w:p>
-    <w:p>
-      <w:pPr>
-        <w:pStyle w:val="Heading3"/>
-      </w:pPr>
-      <w:bookmarkStart w:id="9046" w:name="_Toc_cu_46"/>
-      <w:r>
-        <w:t xml:space="preserve">8.3.2 A vendor caption rename — TAKE B (do not carry the outdated customer caption)</w:t>
-      </w:r>
-      <w:bookmarkEnd w:id="9046"/>
-    </w:p>
-    <w:p>
-      <w:pPr>
-        <w:spacing w:after="120"/>
-      </w:pPr>
-      <w:r>
-        <w:t xml:space="preserve">If a caption or option difference exists, and B carries a vendor tag that A does not, the change is vendor-driven: the vendor renamed it. The tool takes the vendor value, and does not carry the customer's now-outdated value. This guard prevents the table-era rule of always carrying the customer caption from overwriting a vendor rename.</w:t>
+        <w:t xml:space="preserve">Validated on Page 14:</w:t>
+      </w:r>
+      <w:r>
+        <w:t xml:space="preserve"> the customer added an "E-Mail" control, justified only by the changelog entry "Added E-Mail field", with no tag on the control itself. It is grafted after its anchor, the "Phone No." control, identically to the hand merge.</w:t>
       </w:r>
     </w:p>
     <w:p>
@@ -7983,10 +8089,10 @@
           <w:i/>
           <w:iCs/>
         </w:rPr>
-        <w:t xml:space="preserve">Validated on Page 21:</w:t>
-      </w:r>
-      <w:r>
-        <w:t xml:space="preserve"> controls where the vendor renamed "Quick Customer" to "New Quick Customer" and added a new vendor tag in B. The vendor value is taken.</w:t>
+        <w:t xml:space="preserve">Validated on Page 21 (tagged version):</w:t>
+      </w:r>
+      <w:r>
+        <w:t xml:space="preserve"> the four customer FactBoxes, carrying a customer tag, merge automatically as confident grafts, in the correct order even when several share one anchor.</w:t>
       </w:r>
     </w:p>
     <w:p>
@@ -7995,7 +8101,7 @@
       </w:pPr>
       <w:bookmarkStart w:id="9047" w:name="_Toc_cu_47"/>
       <w:r>
-        <w:t xml:space="preserve">8.3.3 A control present only in A, carrying only a vendor tag — MANUAL</w:t>
+        <w:t xml:space="preserve">8.3.2 A vendor caption rename — TAKE B (do not carry the outdated customer caption)</w:t>
       </w:r>
       <w:bookmarkEnd w:id="9047"/>
     </w:p>
@@ -8004,17 +8110,7 @@
         <w:spacing w:after="120"/>
       </w:pPr>
       <w:r>
-        <w:t xml:space="preserve">A control present only in A that carries </w:t>
-      </w:r>
-      <w:r>
-        <w:rPr>
-          <w:b/>
-          <w:bCs/>
-        </w:rPr>
-        <w:t xml:space="preserve">only</w:t>
-      </w:r>
-      <w:r>
-        <w:t xml:space="preserve"> a vendor description tag is ambiguous: it could be a genuine vendor deletion, or a customer-added control that happens to carry a vendor tag. From the control alone, the tool cannot tell which, so it sends the object to manual review rather than risk dropping a customer control.</w:t>
+        <w:t xml:space="preserve">If a caption or option difference exists, and B carries a vendor tag that A does not, the change is vendor-driven: the vendor renamed it. The tool takes the vendor value, and does not carry the customer's now-outdated value. This guard prevents the table-era rule of always carrying the customer caption from overwriting a vendor rename.</w:t>
       </w:r>
     </w:p>
     <w:p>
@@ -8034,7 +8130,7 @@
         <w:t xml:space="preserve">Validated on Page 21:</w:t>
       </w:r>
       <w:r>
-        <w:t xml:space="preserve"> FactBoxes recorded under a customer changelog entry but each carrying a vendor description tag are sent to manual review. When the same FactBoxes are given a customer tag (the tagged version of the page), the same object merges automatically, as in section 8.3.1. The customer tag is what resolves the ambiguity.</w:t>
+        <w:t xml:space="preserve"> controls where the vendor renamed "Quick Customer" to "New Quick Customer" and added a new vendor tag in B. The vendor value is taken.</w:t>
       </w:r>
     </w:p>
     <w:p>
@@ -8043,7 +8139,7 @@
       </w:pPr>
       <w:bookmarkStart w:id="9048" w:name="_Toc_cu_48"/>
       <w:r>
-        <w:t xml:space="preserve">8.3.4 A customer change to a property on a shared control — MANUAL</w:t>
+        <w:t xml:space="preserve">8.3.3 A control present only in A, carrying only a vendor tag — MANUAL</w:t>
       </w:r>
       <w:bookmarkEnd w:id="9048"/>
     </w:p>
@@ -8052,21 +8148,17 @@
         <w:spacing w:after="120"/>
       </w:pPr>
       <w:r>
-        <w:t xml:space="preserve">A customer change to a property on a control that exists in both A and B — for example, changing</w:t>
-      </w:r>
-    </w:p>
-    <w:p>
-      <w:pPr>
-        <w:spacing w:after="120"/>
-      </w:pPr>
-      <w:r>
-        <w:rPr>
-          <w:rFonts w:ascii="Consolas" w:cs="Consolas" w:eastAsia="Consolas" w:hAnsi="Consolas"/>
-        </w:rPr>
-        <w:t xml:space="preserve">Visible</w:t>
-      </w:r>
-      <w:r>
-        <w:t xml:space="preserve"> — is a modification, not a clean addition, and is sent to manual review.</w:t>
+        <w:t xml:space="preserve">A control present only in A that carries </w:t>
+      </w:r>
+      <w:r>
+        <w:rPr>
+          <w:b/>
+          <w:bCs/>
+        </w:rPr>
+        <w:t xml:space="preserve">only</w:t>
+      </w:r>
+      <w:r>
+        <w:t xml:space="preserve"> a vendor description tag is ambiguous: it could be a genuine vendor deletion, or a customer-added control that happens to carry a vendor tag. From the control alone, the tool cannot tell which, so it sends the object to manual review rather than risk dropping a customer control.</w:t>
       </w:r>
     </w:p>
     <w:p>
@@ -8083,11 +8175,34 @@
           <w:i/>
           <w:iCs/>
         </w:rPr>
-        <w:t xml:space="preserve">Validated on Page 5025440:</w:t>
-      </w:r>
-      <w:r>
-        <w:t xml:space="preserve"> the customer changed </w:t>
-      </w:r>
+        <w:t xml:space="preserve">Validated on Page 21:</w:t>
+      </w:r>
+      <w:r>
+        <w:t xml:space="preserve"> FactBoxes recorded under a customer changelog entry but each carrying a vendor description tag are sent to manual review. When the same FactBoxes are given a customer tag (the tagged version of the page), the same object merges automatically, as in section 8.3.1. The customer tag is what resolves the ambiguity.</w:t>
+      </w:r>
+    </w:p>
+    <w:p>
+      <w:pPr>
+        <w:pStyle w:val="Heading3"/>
+      </w:pPr>
+      <w:bookmarkStart w:id="9049" w:name="_Toc_cu_49"/>
+      <w:r>
+        <w:t xml:space="preserve">8.3.4 A customer change to a property on a shared control — MANUAL</w:t>
+      </w:r>
+      <w:bookmarkEnd w:id="9049"/>
+    </w:p>
+    <w:p>
+      <w:pPr>
+        <w:spacing w:after="120"/>
+      </w:pPr>
+      <w:r>
+        <w:t xml:space="preserve">A customer change to a property on a control that exists in both A and B — for example, changing</w:t>
+      </w:r>
+    </w:p>
+    <w:p>
+      <w:pPr>
+        <w:spacing w:after="120"/>
+      </w:pPr>
       <w:r>
         <w:rPr>
           <w:rFonts w:ascii="Consolas" w:cs="Consolas" w:eastAsia="Consolas" w:hAnsi="Consolas"/>
@@ -8095,97 +8210,8 @@
         <w:t xml:space="preserve">Visible</w:t>
       </w:r>
       <w:r>
-        <w:t xml:space="preserve"> from </w:t>
-      </w:r>
-      <w:r>
-        <w:rPr>
-          <w:rFonts w:ascii="Consolas" w:cs="Consolas" w:eastAsia="Consolas" w:hAnsi="Consolas"/>
-        </w:rPr>
-        <w:t xml:space="preserve">FALSE</w:t>
-      </w:r>
-      <w:r>
-        <w:t xml:space="preserve"> to </w:t>
-      </w:r>
-      <w:r>
-        <w:rPr>
-          <w:rFonts w:ascii="Consolas" w:cs="Consolas" w:eastAsia="Consolas" w:hAnsi="Consolas"/>
-        </w:rPr>
-        <w:t xml:space="preserve">true</w:t>
-      </w:r>
-      <w:r>
-        <w:t xml:space="preserve"> on a shared control. The object is sent to manual review.</w:t>
-      </w:r>
-    </w:p>
-    <w:p>
-      <w:pPr>
-        <w:pStyle w:val="Heading3"/>
-      </w:pPr>
-      <w:bookmarkStart w:id="9049" w:name="_Toc_cu_49"/>
-      <w:r>
-        <w:t xml:space="preserve">8.3.5 Caption capture on a page stops at the closing brace</w:t>
-      </w:r>
-      <w:bookmarkEnd w:id="9049"/>
-    </w:p>
-    <w:p>
-      <w:pPr>
-        <w:spacing w:after="120"/>
-      </w:pPr>
-      <w:r>
-        <w:t xml:space="preserve">On a page, a single-value caption can be the last property before the control's closing brace, with no trailing semicolon (for example, </w:t>
-      </w:r>
-      <w:r>
-        <w:rPr>
-          <w:rFonts w:ascii="Consolas" w:cs="Consolas" w:eastAsia="Consolas" w:hAnsi="Consolas"/>
-        </w:rPr>
-        <w:t xml:space="preserve">CaptionML=ENU=General }</w:t>
-      </w:r>
-      <w:r>
-        <w:t xml:space="preserve">). The tool stops reading the caption value at the brace as well as at the semicolon, so that the brace is not read as part of the value. (A table caption always ends at a semicolon, so this applies to pages only.)</w:t>
-      </w:r>
-    </w:p>
-    <w:p>
-      <w:pPr>
-        <w:spacing w:after="120"/>
-      </w:pPr>
-      <w:r>
-        <w:t xml:space="preserve">The page handler also performs the variable-declaration carry (sections 8.1.7 and 8.1.8) and the changelog and header bookkeeping (section 8.1.9).</w:t>
-      </w:r>
-    </w:p>
-    <w:p>
-      <w:pPr>
-        <w:pStyle w:val="Heading2"/>
-      </w:pPr>
-      <w:bookmarkStart w:id="9050" w:name="_Toc_cu_50"/>
-      <w:r>
-        <w:t xml:space="preserve">8.4 Report and XMLport</w:t>
-      </w:r>
-      <w:bookmarkEnd w:id="9050"/>
-    </w:p>
-    <w:p>
-      <w:pPr>
-        <w:spacing w:after="120"/>
-      </w:pPr>
-      <w:r>
-        <w:t xml:space="preserve">Both report and XMLport objects are recognised but not yet validated. The whole object is sent to manual review before any rule runs. The report describes this in plain language ("object type not yet auto-merged by the tool — manual merge").</w:t>
-      </w:r>
-    </w:p>
-    <w:p>
-      <w:pPr>
-        <w:spacing w:after="120"/>
-      </w:pPr>
-      <w:r>
-        <w:t xml:space="preserve">This is deliberately safe. It means that there is no path by which a report can be merged incompletely. In particular, the RDLC layout case — for example, a report whose change is "Add header and footer", where the change is held in a layout block that the comparison does not read — is covered by the whole-object gate, not missed. A report or XMLport object will be merged automatically only once its handler is built and validated against a real object.</w:t>
-      </w:r>
-    </w:p>
-    <w:p>
-      <w:pPr>
-        <w:pStyle w:val="Heading2"/>
-      </w:pPr>
-      <w:bookmarkStart w:id="9051" w:name="_Toc_cu_51"/>
-      <w:r>
-        <w:t xml:space="preserve">8.5 Rules that apply to all object types</w:t>
-      </w:r>
-      <w:bookmarkEnd w:id="9051"/>
+        <w:t xml:space="preserve"> — is a modification, not a clean addition, and is sent to manual review.</w:t>
+      </w:r>
     </w:p>
     <w:p>
       <w:pPr>
@@ -8198,23 +8224,112 @@
       </w:pPr>
       <w:r>
         <w:rPr>
-          <w:b/>
-          <w:bCs/>
-        </w:rPr>
-        <w:t xml:space="preserve">Killme objects are retired.</w:t>
-      </w:r>
-      <w:r>
-        <w:t xml:space="preserve"> An object whose name contains the word </w:t>
+          <w:i/>
+          <w:iCs/>
+        </w:rPr>
+        <w:t xml:space="preserve">Validated on Page 5025440:</w:t>
+      </w:r>
+      <w:r>
+        <w:t xml:space="preserve"> the customer changed </w:t>
       </w:r>
       <w:r>
         <w:rPr>
           <w:rFonts w:ascii="Consolas" w:cs="Consolas" w:eastAsia="Consolas" w:hAnsi="Consolas"/>
         </w:rPr>
-        <w:t xml:space="preserve">kill</w:t>
-      </w:r>
-      <w:r>
-        <w:t xml:space="preserve"> is retired and is never written to the merged set. It is identified by its name, not by its version list or body tags.</w:t>
-      </w:r>
+        <w:t xml:space="preserve">Visible</w:t>
+      </w:r>
+      <w:r>
+        <w:t xml:space="preserve"> from </w:t>
+      </w:r>
+      <w:r>
+        <w:rPr>
+          <w:rFonts w:ascii="Consolas" w:cs="Consolas" w:eastAsia="Consolas" w:hAnsi="Consolas"/>
+        </w:rPr>
+        <w:t xml:space="preserve">FALSE</w:t>
+      </w:r>
+      <w:r>
+        <w:t xml:space="preserve"> to </w:t>
+      </w:r>
+      <w:r>
+        <w:rPr>
+          <w:rFonts w:ascii="Consolas" w:cs="Consolas" w:eastAsia="Consolas" w:hAnsi="Consolas"/>
+        </w:rPr>
+        <w:t xml:space="preserve">true</w:t>
+      </w:r>
+      <w:r>
+        <w:t xml:space="preserve"> on a shared control. The object is sent to manual review.</w:t>
+      </w:r>
+    </w:p>
+    <w:p>
+      <w:pPr>
+        <w:pStyle w:val="Heading3"/>
+      </w:pPr>
+      <w:bookmarkStart w:id="9050" w:name="_Toc_cu_50"/>
+      <w:r>
+        <w:t xml:space="preserve">8.3.5 Caption capture on a page stops at the closing brace</w:t>
+      </w:r>
+      <w:bookmarkEnd w:id="9050"/>
+    </w:p>
+    <w:p>
+      <w:pPr>
+        <w:spacing w:after="120"/>
+      </w:pPr>
+      <w:r>
+        <w:t xml:space="preserve">On a page, a single-value caption can be the last property before the control's closing brace, with no trailing semicolon (for example, </w:t>
+      </w:r>
+      <w:r>
+        <w:rPr>
+          <w:rFonts w:ascii="Consolas" w:cs="Consolas" w:eastAsia="Consolas" w:hAnsi="Consolas"/>
+        </w:rPr>
+        <w:t xml:space="preserve">CaptionML=ENU=General }</w:t>
+      </w:r>
+      <w:r>
+        <w:t xml:space="preserve">). The tool stops reading the caption value at the brace as well as at the semicolon, so that the brace is not read as part of the value. (A table caption always ends at a semicolon, so this applies to pages only.)</w:t>
+      </w:r>
+    </w:p>
+    <w:p>
+      <w:pPr>
+        <w:spacing w:after="120"/>
+      </w:pPr>
+      <w:r>
+        <w:t xml:space="preserve">The page handler also performs the variable-declaration carry (sections 8.1.7 and 8.1.8) and the changelog and header bookkeeping (section 8.1.9).</w:t>
+      </w:r>
+    </w:p>
+    <w:p>
+      <w:pPr>
+        <w:pStyle w:val="Heading2"/>
+      </w:pPr>
+      <w:bookmarkStart w:id="9051" w:name="_Toc_cu_51"/>
+      <w:r>
+        <w:t xml:space="preserve">8.4 Report and XMLport</w:t>
+      </w:r>
+      <w:bookmarkEnd w:id="9051"/>
+    </w:p>
+    <w:p>
+      <w:pPr>
+        <w:spacing w:after="120"/>
+      </w:pPr>
+      <w:r>
+        <w:t xml:space="preserve">Both report and XMLport objects are recognised but not yet validated. The whole object is sent to manual review before any rule runs. The report describes this in plain language ("object type not yet auto-merged by the tool — manual merge").</w:t>
+      </w:r>
+    </w:p>
+    <w:p>
+      <w:pPr>
+        <w:spacing w:after="120"/>
+      </w:pPr>
+      <w:r>
+        <w:t xml:space="preserve">This is deliberately safe. It means that there is no path by which a report can be merged incompletely. In particular, the RDLC layout case — for example, a report whose change is "Add header and footer", where the change is held in a layout block that the comparison does not read — is covered by the whole-object gate, not missed. A report or XMLport object will be merged automatically only once its handler is built and validated against a real object.</w:t>
+      </w:r>
+    </w:p>
+    <w:p>
+      <w:pPr>
+        <w:pStyle w:val="Heading2"/>
+      </w:pPr>
+      <w:bookmarkStart w:id="9052" w:name="_Toc_cu_52"/>
+      <w:r>
+        <w:t xml:space="preserve">8.5 Rules that apply to all object types</w:t>
+      </w:r>
+      <w:bookmarkEnd w:id="9052"/>
     </w:p>
     <w:p>
       <w:pPr>
@@ -8230,10 +8345,19 @@
           <w:b/>
           <w:bCs/>
         </w:rPr>
-        <w:t xml:space="preserve">Modified = No means take B.</w:t>
-      </w:r>
-      <w:r>
-        <w:t xml:space="preserve"> If the header of A records that the customer never modified the object, the vendor object is taken.</w:t>
+        <w:t xml:space="preserve">Killme objects are retired.</w:t>
+      </w:r>
+      <w:r>
+        <w:t xml:space="preserve"> An object whose name contains the word </w:t>
+      </w:r>
+      <w:r>
+        <w:rPr>
+          <w:rFonts w:ascii="Consolas" w:cs="Consolas" w:eastAsia="Consolas" w:hAnsi="Consolas"/>
+        </w:rPr>
+        <w:t xml:space="preserve">kill</w:t>
+      </w:r>
+      <w:r>
+        <w:t xml:space="preserve"> is retired and is never written to the merged set. It is identified by its name, not by its version list or body tags.</w:t>
       </w:r>
     </w:p>
     <w:p>
@@ -8250,10 +8374,10 @@
           <w:b/>
           <w:bCs/>
         </w:rPr>
-        <w:t xml:space="preserve">An identical object means take B.</w:t>
-      </w:r>
-      <w:r>
-        <w:t xml:space="preserve"> After the header bookkeeping, whitespace, line endings and language layer are normalised, if A is identical to B, there is nothing to carry.</w:t>
+        <w:t xml:space="preserve">Modified = No means take B.</w:t>
+      </w:r>
+      <w:r>
+        <w:t xml:space="preserve"> If the header of A records that the customer never modified the object, the vendor object is taken.</w:t>
       </w:r>
     </w:p>
     <w:p>
@@ -8270,19 +8394,10 @@
           <w:b/>
           <w:bCs/>
         </w:rPr>
-        <w:t xml:space="preserve">Integrity is assessed by layer.</w:t>
-      </w:r>
-      <w:r>
-        <w:t xml:space="preserve"> A malformed tag in a customer block stops the merge, because the block cannot be transplanted safely. A malformed tag in a vendor block is a warning only, because incadea ships its own tag defects (for example </w:t>
-      </w:r>
-      <w:r>
-        <w:rPr>
-          <w:rFonts w:ascii="Consolas" w:cs="Consolas" w:eastAsia="Consolas" w:hAnsi="Consolas"/>
-        </w:rPr>
-        <w:t xml:space="preserve">// Srop PA035804</w:t>
-      </w:r>
-      <w:r>
-        <w:t xml:space="preserve">) identically in A and B, and the tool must not stop on the vendor's own errors.</w:t>
+        <w:t xml:space="preserve">An identical object means take B.</w:t>
+      </w:r>
+      <w:r>
+        <w:t xml:space="preserve"> After the header bookkeeping, whitespace, line endings and language layer are normalised, if A is identical to B, there is nothing to carry.</w:t>
       </w:r>
     </w:p>
     <w:p>
@@ -8299,19 +8414,19 @@
           <w:b/>
           <w:bCs/>
         </w:rPr>
-        <w:t xml:space="preserve">Transplant is verbatim.</w:t>
-      </w:r>
-      <w:r>
-        <w:t xml:space="preserve"> Customer blocks are inserted exactly as written, including their original indentation; the tool does not re-indent them. (A hand merge sometimes re-indents an inner </w:t>
+        <w:t xml:space="preserve">Integrity is assessed by layer.</w:t>
+      </w:r>
+      <w:r>
+        <w:t xml:space="preserve"> A malformed tag in a customer block stops the merge, because the block cannot be transplanted safely. A malformed tag in a vendor block is a warning only, because incadea ships its own tag defects (for example </w:t>
       </w:r>
       <w:r>
         <w:rPr>
           <w:rFonts w:ascii="Consolas" w:cs="Consolas" w:eastAsia="Consolas" w:hAnsi="Consolas"/>
         </w:rPr>
-        <w:t xml:space="preserve">END;</w:t>
-      </w:r>
-      <w:r>
-        <w:t xml:space="preserve">; the tool's verbatim form still compiles, and can be tidied later.)</w:t>
+        <w:t xml:space="preserve">// Srop PA035804</w:t>
+      </w:r>
+      <w:r>
+        <w:t xml:space="preserve">) identically in A and B, and the tool must not stop on the vendor's own errors.</w:t>
       </w:r>
     </w:p>
     <w:p>
@@ -8328,31 +8443,60 @@
           <w:b/>
           <w:bCs/>
         </w:rPr>
-        <w:t xml:space="preserve">Encoding.</w:t>
-      </w:r>
-      <w:r>
-        <w:t xml:space="preserve"> Files are in cp1252 / Latin-1 encoding. TortoiseMerge artefacts — carriage returns, trailing whitespace, and stray tabs in the changelog — are normalised.</w:t>
-      </w:r>
-    </w:p>
-    <w:p>
-      <w:pPr>
-        <w:pStyle w:val="Heading1"/>
-      </w:pPr>
-      <w:bookmarkStart w:id="9052" w:name="_Toc_cu_52"/>
-      <w:r>
-        <w:t xml:space="preserve">9. Quick reference</w:t>
-      </w:r>
-      <w:bookmarkEnd w:id="9052"/>
-    </w:p>
-    <w:p>
-      <w:pPr>
-        <w:spacing w:after="120"/>
+        <w:t xml:space="preserve">Transplant is verbatim.</w:t>
+      </w:r>
+      <w:r>
+        <w:t xml:space="preserve"> Customer blocks are inserted exactly as written, including their original indentation; the tool does not re-indent them. (A hand merge sometimes re-indents an inner </w:t>
+      </w:r>
+      <w:r>
+        <w:rPr>
+          <w:rFonts w:ascii="Consolas" w:cs="Consolas" w:eastAsia="Consolas" w:hAnsi="Consolas"/>
+        </w:rPr>
+        <w:t xml:space="preserve">END;</w:t>
+      </w:r>
+      <w:r>
+        <w:t xml:space="preserve">; the tool's verbatim form still compiles, and can be tidied later.)</w:t>
+      </w:r>
+    </w:p>
+    <w:p>
+      <w:pPr>
+        <w:pStyle w:val="ListParagraph"/>
+        <w:numPr>
+          <w:ilvl w:val="0"/>
+          <w:numId w:val="2"/>
+        </w:numPr>
+        <w:spacing w:after="40"/>
       </w:pPr>
       <w:r>
         <w:rPr>
           <w:b/>
           <w:bCs/>
         </w:rPr>
+        <w:t xml:space="preserve">Encoding.</w:t>
+      </w:r>
+      <w:r>
+        <w:t xml:space="preserve"> Files are in cp1252 / Latin-1 encoding. TortoiseMerge artefacts — carriage returns, trailing whitespace, and stray tabs in the changelog — are normalised.</w:t>
+      </w:r>
+    </w:p>
+    <w:p>
+      <w:pPr>
+        <w:pStyle w:val="Heading1"/>
+      </w:pPr>
+      <w:bookmarkStart w:id="9053" w:name="_Toc_cu_53"/>
+      <w:r>
+        <w:t xml:space="preserve">9. Quick reference</w:t>
+      </w:r>
+      <w:bookmarkEnd w:id="9053"/>
+    </w:p>
+    <w:p>
+      <w:pPr>
+        <w:spacing w:after="120"/>
+      </w:pPr>
+      <w:r>
+        <w:rPr>
+          <w:b/>
+          <w:bCs/>
+        </w:rPr>
         <w:t xml:space="preserve">To run a job:</w:t>
       </w:r>
       <w:r>
@@ -8362,7 +8506,7 @@
         <w:rPr>
           <w:rFonts w:ascii="Consolas" w:cs="Consolas" w:eastAsia="Consolas" w:hAnsi="Consolas"/>
         </w:rPr>
-        <w:t xml:space="preserve">CUupdate_1.9.exe</w:t>
+        <w:t xml:space="preserve">CUupdate_2.0.exe</w:t>
       </w:r>
       <w:r>
         <w:t xml:space="preserve">; select the folder that contains </w:t>

</xml_diff>

<commit_message>
docs: record END-bracketed transplant rule (C231); bump 2.0 -> 2.1
CONTEXT §8.24 + ARCHITECTURE execute-path coverage + USER_MANUAL §8.1.5b
and docx rebuild. Version bumped per standing rule (change alters merge output).
</commit_message>
<xml_diff>
--- a/docs/USER_MANUAL.docx
+++ b/docs/USER_MANUAL.docx
@@ -1206,7 +1206,7 @@
               <w:rPr>
                 <w:noProof/>
               </w:rPr>
-              <w:t>9</w:t>
+              <w:t>10</w:t>
             </w:r>
           </w:hyperlink>
         </w:p>
@@ -1342,7 +1342,7 @@
               <w:rPr>
                 <w:noProof/>
               </w:rPr>
-              <w:t>10</w:t>
+              <w:t>11</w:t>
             </w:r>
           </w:hyperlink>
         </w:p>
@@ -1362,7 +1362,7 @@
               <w:rPr>
                 <w:noProof/>
               </w:rPr>
-              <w:t xml:space="preserve">8.1.6 A caption or option change — CARRY (always take the customer value)</w:t>
+              <w:t xml:space="preserve">8.1.5b A code block at the very end of a procedure, with only END; lines around it</w:t>
             </w:r>
           </w:hyperlink>
           <w:r>
@@ -1396,7 +1396,7 @@
               <w:rPr>
                 <w:noProof/>
               </w:rPr>
-              <w:t xml:space="preserve">8.1.7 A field with both a code change and an option change — both are carried</w:t>
+              <w:t xml:space="preserve">8.1.6 A caption or option change — CARRY (always take the customer value)</w:t>
             </w:r>
           </w:hyperlink>
           <w:r>
@@ -1430,7 +1430,7 @@
               <w:rPr>
                 <w:noProof/>
               </w:rPr>
-              <w:t xml:space="preserve">8.1.8 Customer variable declarations — CARRY (keep rather than delete)</w:t>
+              <w:t xml:space="preserve">8.1.7 A field with both a code change and an option change — both are carried</w:t>
             </w:r>
           </w:hyperlink>
           <w:r>
@@ -1444,7 +1444,7 @@
               <w:rPr>
                 <w:noProof/>
               </w:rPr>
-              <w:t>11</w:t>
+              <w:t>12</w:t>
             </w:r>
           </w:hyperlink>
         </w:p>
@@ -1464,7 +1464,7 @@
               <w:rPr>
                 <w:noProof/>
               </w:rPr>
-              <w:t xml:space="preserve">8.1.9 A customer-extended option-string variable — CARRY</w:t>
+              <w:t xml:space="preserve">8.1.8 Customer variable declarations — CARRY (keep rather than delete)</w:t>
             </w:r>
           </w:hyperlink>
           <w:r>
@@ -1498,7 +1498,7 @@
               <w:rPr>
                 <w:noProof/>
               </w:rPr>
-              <w:t xml:space="preserve">8.1.10 Header and changelog bookkeeping (every automatic merge)</w:t>
+              <w:t xml:space="preserve">8.1.9 A customer-extended option-string variable — CARRY</w:t>
             </w:r>
           </w:hyperlink>
           <w:r>
@@ -1532,7 +1532,7 @@
               <w:rPr>
                 <w:noProof/>
               </w:rPr>
-              <w:t xml:space="preserve">8.1.11 Differences in tag spelling are standardised</w:t>
+              <w:t xml:space="preserve">8.1.10 Header and changelog bookkeeping (every automatic merge)</w:t>
             </w:r>
           </w:hyperlink>
           <w:r>
@@ -1542,6 +1542,40 @@
             <w:tab/>
           </w:r>
           <w:hyperlink w:anchor="_Toc_cu_43">
+            <w:r>
+              <w:rPr>
+                <w:noProof/>
+              </w:rPr>
+              <w:t>12</w:t>
+            </w:r>
+          </w:hyperlink>
+        </w:p>
+        <w:p>
+          <w:pPr>
+            <w:tabs>
+              <w:tab w:val="right" w:leader="dot" w:pos="9360"/>
+            </w:tabs>
+            <w:spacing w:after="40"/>
+            <w:ind w:left="720"/>
+            <w:rPr>
+              <w:noProof/>
+            </w:rPr>
+          </w:pPr>
+          <w:hyperlink w:anchor="_Toc_cu_44">
+            <w:r>
+              <w:rPr>
+                <w:noProof/>
+              </w:rPr>
+              <w:t xml:space="preserve">8.1.11 Differences in tag spelling are standardised</w:t>
+            </w:r>
+          </w:hyperlink>
+          <w:r>
+            <w:rPr>
+              <w:noProof/>
+            </w:rPr>
+            <w:tab/>
+          </w:r>
+          <w:hyperlink w:anchor="_Toc_cu_44">
             <w:r>
               <w:rPr>
                 <w:noProof/>
@@ -1561,7 +1595,7 @@
               <w:noProof/>
             </w:rPr>
           </w:pPr>
-          <w:hyperlink w:anchor="_Toc_cu_44">
+          <w:hyperlink w:anchor="_Toc_cu_45">
             <w:r>
               <w:rPr>
                 <w:noProof/>
@@ -1575,12 +1609,12 @@
             </w:rPr>
             <w:tab/>
           </w:r>
-          <w:hyperlink w:anchor="_Toc_cu_44">
-            <w:r>
-              <w:rPr>
-                <w:noProof/>
-              </w:rPr>
-              <w:t>12</w:t>
+          <w:hyperlink w:anchor="_Toc_cu_45">
+            <w:r>
+              <w:rPr>
+                <w:noProof/>
+              </w:rPr>
+              <w:t>13</w:t>
             </w:r>
           </w:hyperlink>
         </w:p>
@@ -1595,7 +1629,7 @@
               <w:noProof/>
             </w:rPr>
           </w:pPr>
-          <w:hyperlink w:anchor="_Toc_cu_45">
+          <w:hyperlink w:anchor="_Toc_cu_46">
             <w:r>
               <w:rPr>
                 <w:noProof/>
@@ -1609,12 +1643,12 @@
             </w:rPr>
             <w:tab/>
           </w:r>
-          <w:hyperlink w:anchor="_Toc_cu_45">
-            <w:r>
-              <w:rPr>
-                <w:noProof/>
-              </w:rPr>
-              <w:t>12</w:t>
+          <w:hyperlink w:anchor="_Toc_cu_46">
+            <w:r>
+              <w:rPr>
+                <w:noProof/>
+              </w:rPr>
+              <w:t>13</w:t>
             </w:r>
           </w:hyperlink>
         </w:p>
@@ -1629,7 +1663,7 @@
               <w:noProof/>
             </w:rPr>
           </w:pPr>
-          <w:hyperlink w:anchor="_Toc_cu_46">
+          <w:hyperlink w:anchor="_Toc_cu_47">
             <w:r>
               <w:rPr>
                 <w:noProof/>
@@ -1643,7 +1677,7 @@
             </w:rPr>
             <w:tab/>
           </w:r>
-          <w:hyperlink w:anchor="_Toc_cu_46">
+          <w:hyperlink w:anchor="_Toc_cu_47">
             <w:r>
               <w:rPr>
                 <w:noProof/>
@@ -1663,7 +1697,7 @@
               <w:noProof/>
             </w:rPr>
           </w:pPr>
-          <w:hyperlink w:anchor="_Toc_cu_47">
+          <w:hyperlink w:anchor="_Toc_cu_48">
             <w:r>
               <w:rPr>
                 <w:noProof/>
@@ -1677,7 +1711,7 @@
             </w:rPr>
             <w:tab/>
           </w:r>
-          <w:hyperlink w:anchor="_Toc_cu_47">
+          <w:hyperlink w:anchor="_Toc_cu_48">
             <w:r>
               <w:rPr>
                 <w:noProof/>
@@ -1697,7 +1731,7 @@
               <w:noProof/>
             </w:rPr>
           </w:pPr>
-          <w:hyperlink w:anchor="_Toc_cu_48">
+          <w:hyperlink w:anchor="_Toc_cu_49">
             <w:r>
               <w:rPr>
                 <w:noProof/>
@@ -1711,7 +1745,7 @@
             </w:rPr>
             <w:tab/>
           </w:r>
-          <w:hyperlink w:anchor="_Toc_cu_48">
+          <w:hyperlink w:anchor="_Toc_cu_49">
             <w:r>
               <w:rPr>
                 <w:noProof/>
@@ -1731,7 +1765,7 @@
               <w:noProof/>
             </w:rPr>
           </w:pPr>
-          <w:hyperlink w:anchor="_Toc_cu_49">
+          <w:hyperlink w:anchor="_Toc_cu_50">
             <w:r>
               <w:rPr>
                 <w:noProof/>
@@ -1745,12 +1779,12 @@
             </w:rPr>
             <w:tab/>
           </w:r>
-          <w:hyperlink w:anchor="_Toc_cu_49">
-            <w:r>
-              <w:rPr>
-                <w:noProof/>
-              </w:rPr>
-              <w:t>13</w:t>
+          <w:hyperlink w:anchor="_Toc_cu_50">
+            <w:r>
+              <w:rPr>
+                <w:noProof/>
+              </w:rPr>
+              <w:t>14</w:t>
             </w:r>
           </w:hyperlink>
         </w:p>
@@ -1765,7 +1799,7 @@
               <w:noProof/>
             </w:rPr>
           </w:pPr>
-          <w:hyperlink w:anchor="_Toc_cu_50">
+          <w:hyperlink w:anchor="_Toc_cu_51">
             <w:r>
               <w:rPr>
                 <w:noProof/>
@@ -1779,12 +1813,12 @@
             </w:rPr>
             <w:tab/>
           </w:r>
-          <w:hyperlink w:anchor="_Toc_cu_50">
-            <w:r>
-              <w:rPr>
-                <w:noProof/>
-              </w:rPr>
-              <w:t>13</w:t>
+          <w:hyperlink w:anchor="_Toc_cu_51">
+            <w:r>
+              <w:rPr>
+                <w:noProof/>
+              </w:rPr>
+              <w:t>14</w:t>
             </w:r>
           </w:hyperlink>
         </w:p>
@@ -1799,7 +1833,7 @@
               <w:noProof/>
             </w:rPr>
           </w:pPr>
-          <w:hyperlink w:anchor="_Toc_cu_51">
+          <w:hyperlink w:anchor="_Toc_cu_52">
             <w:r>
               <w:rPr>
                 <w:noProof/>
@@ -1813,7 +1847,7 @@
             </w:rPr>
             <w:tab/>
           </w:r>
-          <w:hyperlink w:anchor="_Toc_cu_51">
+          <w:hyperlink w:anchor="_Toc_cu_52">
             <w:r>
               <w:rPr>
                 <w:noProof/>
@@ -1833,7 +1867,7 @@
               <w:noProof/>
             </w:rPr>
           </w:pPr>
-          <w:hyperlink w:anchor="_Toc_cu_52">
+          <w:hyperlink w:anchor="_Toc_cu_53">
             <w:r>
               <w:rPr>
                 <w:noProof/>
@@ -1847,7 +1881,7 @@
             </w:rPr>
             <w:tab/>
           </w:r>
-          <w:hyperlink w:anchor="_Toc_cu_52">
+          <w:hyperlink w:anchor="_Toc_cu_53">
             <w:r>
               <w:rPr>
                 <w:noProof/>
@@ -1866,7 +1900,7 @@
               <w:noProof/>
             </w:rPr>
           </w:pPr>
-          <w:hyperlink w:anchor="_Toc_cu_53">
+          <w:hyperlink w:anchor="_Toc_cu_54">
             <w:r>
               <w:rPr>
                 <w:noProof/>
@@ -1880,12 +1914,12 @@
             </w:rPr>
             <w:tab/>
           </w:r>
-          <w:hyperlink w:anchor="_Toc_cu_53">
-            <w:r>
-              <w:rPr>
-                <w:noProof/>
-              </w:rPr>
-              <w:t>14</w:t>
+          <w:hyperlink w:anchor="_Toc_cu_54">
+            <w:r>
+              <w:rPr>
+                <w:noProof/>
+              </w:rPr>
+              <w:t>15</w:t>
             </w:r>
           </w:hyperlink>
         </w:p>
@@ -2221,7 +2255,7 @@
           <w:b/>
           <w:bCs/>
         </w:rPr>
-        <w:t xml:space="preserve">CUupdate_2.0.exe</w:t>
+        <w:t xml:space="preserve">CUupdate_2.1.exe</w:t>
       </w:r>
       <w:r>
         <w:t xml:space="preserve">. The machine it runs on does not need any additional software installed — everything required is contained within the application.</w:t>
@@ -2243,7 +2277,7 @@
         <w:rPr>
           <w:rFonts w:ascii="Consolas" w:cs="Consolas" w:eastAsia="Consolas" w:hAnsi="Consolas"/>
         </w:rPr>
-        <w:t xml:space="preserve">CUupdate_2.0.exe</w:t>
+        <w:t xml:space="preserve">CUupdate_2.1.exe</w:t>
       </w:r>
       <w:r>
         <w:t xml:space="preserve"> to the machine, or run it from where it is stored.</w:t>
@@ -4345,7 +4379,7 @@
         <w:rPr>
           <w:rFonts w:ascii="Consolas" w:cs="Consolas" w:eastAsia="Consolas" w:hAnsi="Consolas"/>
         </w:rPr>
-        <w:t xml:space="preserve">CUupdate_2.0.exe</w:t>
+        <w:t xml:space="preserve">CUupdate_2.1.exe</w:t>
       </w:r>
       <w:r>
         <w:t xml:space="preserve">.</w:t>
@@ -5726,7 +5760,7 @@
         <w:rPr>
           <w:rFonts w:ascii="Consolas" w:cs="Consolas" w:eastAsia="Consolas" w:hAnsi="Consolas"/>
         </w:rPr>
-        <w:t xml:space="preserve">CUupdate_2.0.exe</w:t>
+        <w:t xml:space="preserve">CUupdate_2.1.exe</w:t>
       </w:r>
       <w:r>
         <w:t xml:space="preserve"> file. No part of this is required at run time other than the application itself.</w:t>
@@ -6160,7 +6194,7 @@
         <w:rPr>
           <w:rFonts w:ascii="Consolas" w:cs="Consolas" w:eastAsia="Consolas" w:hAnsi="Consolas"/>
         </w:rPr>
-        <w:t xml:space="preserve">CUupdate_2.0.exe</w:t>
+        <w:t xml:space="preserve">CUupdate_2.1.exe</w:t>
       </w:r>
       <w:r>
         <w:t xml:space="preserve"> file. End users are given the finished application and do not build it themselves.</w:t>
@@ -6580,7 +6614,16 @@
               <w:spacing w:after="20" w:before="20"/>
             </w:pPr>
             <w:r>
-              <w:t xml:space="preserve">code transplant, changelog carry, header bookkeeping (no field rules)</w:t>
+              <w:t xml:space="preserve">code transplant (including blocks at the tail of a procedure, bracketed only by </w:t>
+            </w:r>
+            <w:r>
+              <w:rPr>
+                <w:rFonts w:ascii="Consolas" w:cs="Consolas" w:eastAsia="Consolas" w:hAnsi="Consolas"/>
+              </w:rPr>
+              <w:t xml:space="preserve">END;</w:t>
+            </w:r>
+            <w:r>
+              <w:t xml:space="preserve"> lines), changelog carry, header bookkeeping (no field rules)</w:t>
             </w:r>
           </w:p>
         </w:tc>
@@ -7481,7 +7524,7 @@
       </w:pPr>
       <w:bookmarkStart w:id="9038" w:name="_Toc_cu_38"/>
       <w:r>
-        <w:t xml:space="preserve">8.1.6 A caption or option change — CARRY (always take the customer value)</w:t>
+        <w:t xml:space="preserve">8.1.5b A code block at the very end of a procedure, with only END; lines around it</w:t>
       </w:r>
       <w:bookmarkEnd w:id="9038"/>
     </w:p>
@@ -7490,53 +7533,99 @@
         <w:spacing w:after="120"/>
       </w:pPr>
       <w:r>
-        <w:t xml:space="preserve">On </w:t>
+        <w:t xml:space="preserve">A customer block sometimes sits as the </w:t>
       </w:r>
       <w:r>
         <w:rPr>
           <w:b/>
           <w:bCs/>
         </w:rPr>
-        <w:t xml:space="preserve">any</w:t>
-      </w:r>
-      <w:r>
-        <w:t xml:space="preserve"> difference in </w:t>
-      </w:r>
-      <w:r>
-        <w:rPr>
-          <w:rFonts w:ascii="Consolas" w:cs="Consolas" w:eastAsia="Consolas" w:hAnsi="Consolas"/>
-        </w:rPr>
-        <w:t xml:space="preserve">CaptionML</w:t>
-      </w:r>
-      <w:r>
-        <w:t xml:space="preserve">, </w:t>
-      </w:r>
-      <w:r>
-        <w:rPr>
-          <w:rFonts w:ascii="Consolas" w:cs="Consolas" w:eastAsia="Consolas" w:hAnsi="Consolas"/>
-        </w:rPr>
-        <w:t xml:space="preserve">OptionCaptionML</w:t>
-      </w:r>
-      <w:r>
-        <w:t xml:space="preserve"> or </w:t>
-      </w:r>
-      <w:r>
-        <w:rPr>
-          <w:rFonts w:ascii="Consolas" w:cs="Consolas" w:eastAsia="Consolas" w:hAnsi="Consolas"/>
-        </w:rPr>
-        <w:t xml:space="preserve">OptionString</w:t>
-      </w:r>
-      <w:r>
-        <w:t xml:space="preserve">, the customer value is carried forward. No tag is required. This is low-risk and easy to verify in testing, so it is always taken. The field's </w:t>
-      </w:r>
-      <w:r>
-        <w:rPr>
-          <w:rFonts w:ascii="Consolas" w:cs="Consolas" w:eastAsia="Consolas" w:hAnsi="Consolas"/>
-        </w:rPr>
-        <w:t xml:space="preserve">Description=</w:t>
-      </w:r>
-      <w:r>
-        <w:t xml:space="preserve"> tag list is carried with it, but only when the vendor's tags are a subset of the customer's, so that a vendor-added tag is never lost.</w:t>
+        <w:t xml:space="preserve">last statement of a procedure</w:t>
+      </w:r>
+      <w:r>
+        <w:t xml:space="preserve">, with nothing below it but the </w:t>
+      </w:r>
+      <w:r>
+        <w:rPr>
+          <w:rFonts w:ascii="Consolas" w:cs="Consolas" w:eastAsia="Consolas" w:hAnsi="Consolas"/>
+        </w:rPr>
+        <w:t xml:space="preserve">END;</w:t>
+      </w:r>
+      <w:r>
+        <w:t xml:space="preserve"> lines that close the procedure. These </w:t>
+      </w:r>
+      <w:r>
+        <w:rPr>
+          <w:rFonts w:ascii="Consolas" w:cs="Consolas" w:eastAsia="Consolas" w:hAnsi="Consolas"/>
+        </w:rPr>
+        <w:t xml:space="preserve">END;</w:t>
+      </w:r>
+      <w:r>
+        <w:t xml:space="preserve"> lines are not distinctive — every block in the object ends with them — so they cannot be used as a landmark to position the block. Without a distinctive line below it, an earlier version of the tool could not work out where the block belonged and sent the object to manual review, even though the placement was obvious to a developer reading it.</w:t>
+      </w:r>
+    </w:p>
+    <w:p>
+      <w:pPr>
+        <w:spacing w:after="120"/>
+      </w:pPr>
+      <w:r>
+        <w:t xml:space="preserve">The tool now positions such a block by its </w:t>
+      </w:r>
+      <w:r>
+        <w:rPr>
+          <w:b/>
+          <w:bCs/>
+        </w:rPr>
+        <w:t xml:space="preserve">structure</w:t>
+      </w:r>
+      <w:r>
+        <w:t xml:space="preserve"> rather than by matching a line of text: it counts how many </w:t>
+      </w:r>
+      <w:r>
+        <w:rPr>
+          <w:rFonts w:ascii="Consolas" w:cs="Consolas" w:eastAsia="Consolas" w:hAnsi="Consolas"/>
+        </w:rPr>
+        <w:t xml:space="preserve">END;</w:t>
+      </w:r>
+      <w:r>
+        <w:t xml:space="preserve"> lines sit between the block and the line above it in the customer's object, then steps past the same number of </w:t>
+      </w:r>
+      <w:r>
+        <w:rPr>
+          <w:rFonts w:ascii="Consolas" w:cs="Consolas" w:eastAsia="Consolas" w:hAnsi="Consolas"/>
+        </w:rPr>
+        <w:t xml:space="preserve">END;</w:t>
+      </w:r>
+      <w:r>
+        <w:t xml:space="preserve"> lines in the vendor's object to find the matching spot. Because the object compiles, its </w:t>
+      </w:r>
+      <w:r>
+        <w:rPr>
+          <w:rFonts w:ascii="Consolas" w:cs="Consolas" w:eastAsia="Consolas" w:hAnsi="Consolas"/>
+        </w:rPr>
+        <w:t xml:space="preserve">END;</w:t>
+      </w:r>
+      <w:r>
+        <w:t xml:space="preserve"> nesting is balanced, so this count carries across reliably — and it does </w:t>
+      </w:r>
+      <w:r>
+        <w:rPr>
+          <w:b/>
+          <w:bCs/>
+        </w:rPr>
+        <w:t xml:space="preserve">not</w:t>
+      </w:r>
+      <w:r>
+        <w:t xml:space="preserve"> depend on how the code is indented, which can vary between developers. The block is placed after the correct </w:t>
+      </w:r>
+      <w:r>
+        <w:rPr>
+          <w:rFonts w:ascii="Consolas" w:cs="Consolas" w:eastAsia="Consolas" w:hAnsi="Consolas"/>
+        </w:rPr>
+        <w:t xml:space="preserve">END;</w:t>
+      </w:r>
+      <w:r>
+        <w:t xml:space="preserve">, with its blank-line spacing kept tidy (a blank line is not doubled up where the vendor's code already has one).</w:t>
       </w:r>
     </w:p>
     <w:p>
@@ -7553,10 +7642,101 @@
           <w:i/>
           <w:iCs/>
         </w:rPr>
-        <w:t xml:space="preserve">Validated on Table 36:</w:t>
-      </w:r>
-      <w:r>
-        <w:t xml:space="preserve"> fields 11 and 100, where the customer caption "Customer Order No." differs from the cumulative-update caption "Your Reference". The customer caption is kept.</w:t>
+        <w:t xml:space="preserve">Validated on Codeunit 231 (Gen. Jnl.-Post):</w:t>
+      </w:r>
+      <w:r>
+        <w:t xml:space="preserve"> the customer's Direct Credit customisation includes a </w:t>
+      </w:r>
+      <w:r>
+        <w:rPr>
+          <w:rFonts w:ascii="Consolas" w:cs="Consolas" w:eastAsia="Consolas" w:hAnsi="Consolas"/>
+        </w:rPr>
+        <w:t xml:space="preserve">// Start DC5.00</w:t>
+      </w:r>
+      <w:r>
+        <w:t xml:space="preserve"> block that is the last statement in the </w:t>
+      </w:r>
+      <w:r>
+        <w:rPr>
+          <w:rFonts w:ascii="Consolas" w:cs="Consolas" w:eastAsia="Consolas" w:hAnsi="Consolas"/>
+        </w:rPr>
+        <w:t xml:space="preserve">Code</w:t>
+      </w:r>
+      <w:r>
+        <w:t xml:space="preserve"> procedure, sitting just before the procedure's closing </w:t>
+      </w:r>
+      <w:r>
+        <w:rPr>
+          <w:rFonts w:ascii="Consolas" w:cs="Consolas" w:eastAsia="Consolas" w:hAnsi="Consolas"/>
+        </w:rPr>
+        <w:t xml:space="preserve">END;</w:t>
+      </w:r>
+      <w:r>
+        <w:t xml:space="preserve">. It is now carried into the correct position automatically, exactly matching the hand-merged result. (An earlier version sent the whole object to manual review.)</w:t>
+      </w:r>
+    </w:p>
+    <w:p>
+      <w:pPr>
+        <w:pStyle w:val="Heading3"/>
+      </w:pPr>
+      <w:bookmarkStart w:id="9039" w:name="_Toc_cu_39"/>
+      <w:r>
+        <w:t xml:space="preserve">8.1.6 A caption or option change — CARRY (always take the customer value)</w:t>
+      </w:r>
+      <w:bookmarkEnd w:id="9039"/>
+    </w:p>
+    <w:p>
+      <w:pPr>
+        <w:spacing w:after="120"/>
+      </w:pPr>
+      <w:r>
+        <w:t xml:space="preserve">On </w:t>
+      </w:r>
+      <w:r>
+        <w:rPr>
+          <w:b/>
+          <w:bCs/>
+        </w:rPr>
+        <w:t xml:space="preserve">any</w:t>
+      </w:r>
+      <w:r>
+        <w:t xml:space="preserve"> difference in </w:t>
+      </w:r>
+      <w:r>
+        <w:rPr>
+          <w:rFonts w:ascii="Consolas" w:cs="Consolas" w:eastAsia="Consolas" w:hAnsi="Consolas"/>
+        </w:rPr>
+        <w:t xml:space="preserve">CaptionML</w:t>
+      </w:r>
+      <w:r>
+        <w:t xml:space="preserve">, </w:t>
+      </w:r>
+      <w:r>
+        <w:rPr>
+          <w:rFonts w:ascii="Consolas" w:cs="Consolas" w:eastAsia="Consolas" w:hAnsi="Consolas"/>
+        </w:rPr>
+        <w:t xml:space="preserve">OptionCaptionML</w:t>
+      </w:r>
+      <w:r>
+        <w:t xml:space="preserve"> or </w:t>
+      </w:r>
+      <w:r>
+        <w:rPr>
+          <w:rFonts w:ascii="Consolas" w:cs="Consolas" w:eastAsia="Consolas" w:hAnsi="Consolas"/>
+        </w:rPr>
+        <w:t xml:space="preserve">OptionString</w:t>
+      </w:r>
+      <w:r>
+        <w:t xml:space="preserve">, the customer value is carried forward. No tag is required. This is low-risk and easy to verify in testing, so it is always taken. The field's </w:t>
+      </w:r>
+      <w:r>
+        <w:rPr>
+          <w:rFonts w:ascii="Consolas" w:cs="Consolas" w:eastAsia="Consolas" w:hAnsi="Consolas"/>
+        </w:rPr>
+        <w:t xml:space="preserve">Description=</w:t>
+      </w:r>
+      <w:r>
+        <w:t xml:space="preserve"> tag list is carried with it, but only when the vendor's tags are a subset of the customer's, so that a vendor-added tag is never lost.</w:t>
       </w:r>
     </w:p>
     <w:p>
@@ -7573,48 +7753,10 @@
           <w:i/>
           <w:iCs/>
         </w:rPr>
-        <w:t xml:space="preserve">Validated on Table 77 (Report Selections):</w:t>
-      </w:r>
-      <w:r>
-        <w:t xml:space="preserve"> field 1, "Usage", where the customer had appended Direct Credit options to the option string and option caption. These are carried forward. (An earlier version of the tool incorrectly took the vendor value here.)</w:t>
-      </w:r>
-    </w:p>
-    <w:p>
-      <w:pPr>
-        <w:shd w:fill="FFF6E0" w:val="clear"/>
-        <w:spacing w:after="120" w:before="80"/>
-        <w:ind w:left="360"/>
-      </w:pPr>
-      <w:r>
-        <w:t xml:space="preserve">A non-blocking warning is raised, but the carry still proceeds, if the vendor </w:t>
-      </w:r>
-      <w:r>
-        <w:rPr>
-          <w:b/>
-          <w:bCs/>
-        </w:rPr>
-        <w:t xml:space="preserve">also</w:t>
-      </w:r>
-      <w:r>
-        <w:t xml:space="preserve"> changed the options in the middle of the list (that is, the vendor's option string is not a leading part of the customer's). A mid-list vendor change can shift the option ordinals, so the item is flagged for the developer to check.</w:t>
-      </w:r>
-    </w:p>
-    <w:p>
-      <w:pPr>
-        <w:pStyle w:val="Heading3"/>
-      </w:pPr>
-      <w:bookmarkStart w:id="9039" w:name="_Toc_cu_39"/>
-      <w:r>
-        <w:t xml:space="preserve">8.1.7 A field with both a code change and an option change — both are carried</w:t>
-      </w:r>
-      <w:bookmarkEnd w:id="9039"/>
-    </w:p>
-    <w:p>
-      <w:pPr>
-        <w:spacing w:after="120"/>
-      </w:pPr>
-      <w:r>
-        <w:t xml:space="preserve">A field can have both a customer code block in its trigger and an extended option or caption. These are not treated as alternatives. The tool produces a scorer-routed code item and a caption carry for the same field.</w:t>
+        <w:t xml:space="preserve">Validated on Table 36:</w:t>
+      </w:r>
+      <w:r>
+        <w:t xml:space="preserve"> fields 11 and 100, where the customer caption "Customer Order No." differs from the cumulative-update caption "Your Reference". The customer caption is kept.</w:t>
       </w:r>
     </w:p>
     <w:p>
@@ -7631,10 +7773,30 @@
           <w:i/>
           <w:iCs/>
         </w:rPr>
-        <w:t xml:space="preserve">Validated on Table 80:</w:t>
-      </w:r>
-      <w:r>
-        <w:t xml:space="preserve"> field 9, "Type", had both a CASE branch and an extended option string, option caption and description tag. Both are carried.</w:t>
+        <w:t xml:space="preserve">Validated on Table 77 (Report Selections):</w:t>
+      </w:r>
+      <w:r>
+        <w:t xml:space="preserve"> field 1, "Usage", where the customer had appended Direct Credit options to the option string and option caption. These are carried forward. (An earlier version of the tool incorrectly took the vendor value here.)</w:t>
+      </w:r>
+    </w:p>
+    <w:p>
+      <w:pPr>
+        <w:shd w:fill="FFF6E0" w:val="clear"/>
+        <w:spacing w:after="120" w:before="80"/>
+        <w:ind w:left="360"/>
+      </w:pPr>
+      <w:r>
+        <w:t xml:space="preserve">A non-blocking warning is raised, but the carry still proceeds, if the vendor </w:t>
+      </w:r>
+      <w:r>
+        <w:rPr>
+          <w:b/>
+          <w:bCs/>
+        </w:rPr>
+        <w:t xml:space="preserve">also</w:t>
+      </w:r>
+      <w:r>
+        <w:t xml:space="preserve"> changed the options in the middle of the list (that is, the vendor's option string is not a leading part of the customer's). A mid-list vendor change can shift the option ordinals, so the item is flagged for the developer to check.</w:t>
       </w:r>
     </w:p>
     <w:p>
@@ -7643,7 +7805,7 @@
       </w:pPr>
       <w:bookmarkStart w:id="9040" w:name="_Toc_cu_40"/>
       <w:r>
-        <w:t xml:space="preserve">8.1.8 Customer variable declarations — CARRY (keep rather than delete)</w:t>
+        <w:t xml:space="preserve">8.1.7 A field with both a code change and an option change — both are carried</w:t>
       </w:r>
       <w:bookmarkEnd w:id="9040"/>
     </w:p>
@@ -7652,7 +7814,7 @@
         <w:spacing w:after="120"/>
       </w:pPr>
       <w:r>
-        <w:t xml:space="preserve">A variable declared in the VAR section of A — either the object-level (global) section, or a procedure-level (local) section — but absent from the matching section of B, is carried forward. The justification is compile-safety alone: a variable that is referenced but not declared fails to compile, whereas a variable that is declared but unused is harmless. The tool therefore never drops a declaration. The carry is performed silently and recorded, because it only ever adds. A variable declaration carries no tag, so there is no source information to reason from; the rule is simply to keep it.</w:t>
+        <w:t xml:space="preserve">A field can have both a customer code block in its trigger and an extended option or caption. These are not treated as alternatives. The tool produces a scorer-routed code item and a caption carry for the same field.</w:t>
       </w:r>
     </w:p>
     <w:p>
@@ -7669,19 +7831,10 @@
           <w:i/>
           <w:iCs/>
         </w:rPr>
-        <w:t xml:space="preserve">Validated on Table 81:</w:t>
-      </w:r>
-      <w:r>
-        <w:t xml:space="preserve"> a global variable, </w:t>
-      </w:r>
-      <w:r>
-        <w:rPr>
-          <w:rFonts w:ascii="Consolas" w:cs="Consolas" w:eastAsia="Consolas" w:hAnsi="Consolas"/>
-        </w:rPr>
-        <w:t xml:space="preserve">VendBankAccG</w:t>
-      </w:r>
-      <w:r>
-        <w:t xml:space="preserve">, used by carried code, was being dropped. It is now carried forward so that the merged object compiles.</w:t>
+        <w:t xml:space="preserve">Validated on Table 80:</w:t>
+      </w:r>
+      <w:r>
+        <w:t xml:space="preserve"> field 9, "Type", had both a CASE branch and an extended option string, option caption and description tag. Both are carried.</w:t>
       </w:r>
     </w:p>
     <w:p>
@@ -7690,7 +7843,7 @@
       </w:pPr>
       <w:bookmarkStart w:id="9041" w:name="_Toc_cu_41"/>
       <w:r>
-        <w:t xml:space="preserve">8.1.9 A customer-extended option-string variable — CARRY</w:t>
+        <w:t xml:space="preserve">8.1.8 Customer variable declarations — CARRY (keep rather than delete)</w:t>
       </w:r>
       <w:bookmarkEnd w:id="9041"/>
     </w:p>
@@ -7699,7 +7852,7 @@
         <w:spacing w:after="120"/>
       </w:pPr>
       <w:r>
-        <w:t xml:space="preserve">A variable present in both A and B, where both values are quoted text and the vendor's value is a leading part of the customer's value (that is, the customer appended options), takes the customer's value. A rename or a re-ordering is not a leading part of the value, so it fails this test and is sent to the whole-object manual-review gate; the tool does not guess at it.</w:t>
+        <w:t xml:space="preserve">A variable declared in the VAR section of A — either the object-level (global) section, or a procedure-level (local) section — but absent from the matching section of B, is carried forward. The justification is compile-safety alone: a variable that is referenced but not declared fails to compile, whereas a variable that is declared but unused is harmless. The tool therefore never drops a declaration. The carry is performed silently and recorded, because it only ever adds. A variable declaration carries no tag, so there is no source information to reason from; the rule is simply to keep it.</w:t>
       </w:r>
     </w:p>
     <w:p>
@@ -7716,19 +7869,19 @@
           <w:i/>
           <w:iCs/>
         </w:rPr>
-        <w:t xml:space="preserve">Validated on Page 347:</w:t>
-      </w:r>
-      <w:r>
-        <w:t xml:space="preserve"> the customer's extension of the </w:t>
-      </w:r>
-      <w:r>
-        <w:rPr>
-          <w:rFonts w:ascii="Consolas" w:cs="Consolas" w:eastAsia="Consolas" w:hAnsi="Consolas"/>
-        </w:rPr>
-        <w:t xml:space="preserve">ReportUsage2</w:t>
-      </w:r>
-      <w:r>
-        <w:t xml:space="preserve"> option list is carried forward.</w:t>
+        <w:t xml:space="preserve">Validated on Table 81:</w:t>
+      </w:r>
+      <w:r>
+        <w:t xml:space="preserve"> a global variable, </w:t>
+      </w:r>
+      <w:r>
+        <w:rPr>
+          <w:rFonts w:ascii="Consolas" w:cs="Consolas" w:eastAsia="Consolas" w:hAnsi="Consolas"/>
+        </w:rPr>
+        <w:t xml:space="preserve">VendBankAccG</w:t>
+      </w:r>
+      <w:r>
+        <w:t xml:space="preserve">, used by carried code, was being dropped. It is now carried forward so that the merged object compiles.</w:t>
       </w:r>
     </w:p>
     <w:p>
@@ -7737,7 +7890,7 @@
       </w:pPr>
       <w:bookmarkStart w:id="9042" w:name="_Toc_cu_42"/>
       <w:r>
-        <w:t xml:space="preserve">8.1.10 Header and changelog bookkeeping (every automatic merge)</w:t>
+        <w:t xml:space="preserve">8.1.9 A customer-extended option-string variable — CARRY</w:t>
       </w:r>
       <w:bookmarkEnd w:id="9042"/>
     </w:p>
@@ -7746,7 +7899,7 @@
         <w:spacing w:after="120"/>
       </w:pPr>
       <w:r>
-        <w:t xml:space="preserve">When the tool builds C, it also performs the mechanical bookkeeping a hand merge would:</w:t>
+        <w:t xml:space="preserve">A variable present in both A and B, where both values are quoted text and the vendor's value is a leading part of the customer's value (that is, the customer appended options), takes the customer's value. A rename or a re-ordering is not a leading part of the value, so it fails this test and is sent to the whole-object manual-review gate; the tool does not guess at it.</w:t>
       </w:r>
     </w:p>
     <w:p>
@@ -7760,40 +7913,40 @@
       </w:pPr>
       <w:r>
         <w:rPr>
-          <w:b/>
-          <w:bCs/>
-        </w:rPr>
-        <w:t xml:space="preserve">Header:</w:t>
-      </w:r>
-      <w:r>
-        <w:t xml:space="preserve"> it sets </w:t>
-      </w:r>
-      <w:r>
-        <w:rPr>
-          <w:rFonts w:ascii="Consolas" w:cs="Consolas" w:eastAsia="Consolas" w:hAnsi="Consolas"/>
-        </w:rPr>
-        <w:t xml:space="preserve">Date=</w:t>
-      </w:r>
-      <w:r>
-        <w:t xml:space="preserve"> to the merge date, in the declared database locale; reasserts </w:t>
-      </w:r>
-      <w:r>
-        <w:rPr>
-          <w:rFonts w:ascii="Consolas" w:cs="Consolas" w:eastAsia="Consolas" w:hAnsi="Consolas"/>
-        </w:rPr>
-        <w:t xml:space="preserve">Modified=Yes</w:t>
-      </w:r>
-      <w:r>
-        <w:t xml:space="preserve">; preserves the </w:t>
-      </w:r>
-      <w:r>
-        <w:rPr>
-          <w:rFonts w:ascii="Consolas" w:cs="Consolas" w:eastAsia="Consolas" w:hAnsi="Consolas"/>
-        </w:rPr>
-        <w:t xml:space="preserve">Time</w:t>
-      </w:r>
-      <w:r>
-        <w:t xml:space="preserve"> value from B unchanged; and appends the CU token to the version-list tokens of A (A carries the customer tokens; B is the standard vendor object).</w:t>
+          <w:i/>
+          <w:iCs/>
+        </w:rPr>
+        <w:t xml:space="preserve">Validated on Page 347:</w:t>
+      </w:r>
+      <w:r>
+        <w:t xml:space="preserve"> the customer's extension of the </w:t>
+      </w:r>
+      <w:r>
+        <w:rPr>
+          <w:rFonts w:ascii="Consolas" w:cs="Consolas" w:eastAsia="Consolas" w:hAnsi="Consolas"/>
+        </w:rPr>
+        <w:t xml:space="preserve">ReportUsage2</w:t>
+      </w:r>
+      <w:r>
+        <w:t xml:space="preserve"> option list is carried forward.</w:t>
+      </w:r>
+    </w:p>
+    <w:p>
+      <w:pPr>
+        <w:pStyle w:val="Heading3"/>
+      </w:pPr>
+      <w:bookmarkStart w:id="9043" w:name="_Toc_cu_43"/>
+      <w:r>
+        <w:t xml:space="preserve">8.1.10 Header and changelog bookkeeping (every automatic merge)</w:t>
+      </w:r>
+      <w:bookmarkEnd w:id="9043"/>
+    </w:p>
+    <w:p>
+      <w:pPr>
+        <w:spacing w:after="120"/>
+      </w:pPr>
+      <w:r>
+        <w:t xml:space="preserve">When the tool builds C, it also performs the mechanical bookkeeping a hand merge would:</w:t>
       </w:r>
     </w:p>
     <w:p>
@@ -7810,20 +7963,37 @@
           <w:b/>
           <w:bCs/>
         </w:rPr>
-        <w:t xml:space="preserve">Placement:</w:t>
-      </w:r>
-      <w:r>
-        <w:t xml:space="preserve"> customer content is inserted </w:t>
-      </w:r>
-      <w:r>
-        <w:rPr>
-          <w:b/>
-          <w:bCs/>
-        </w:rPr>
-        <w:t xml:space="preserve">after</w:t>
-      </w:r>
-      <w:r>
-        <w:t xml:space="preserve"> the corresponding vendor content, which matches the established TortoiseMerge habit.</w:t>
+        <w:t xml:space="preserve">Header:</w:t>
+      </w:r>
+      <w:r>
+        <w:t xml:space="preserve"> it sets </w:t>
+      </w:r>
+      <w:r>
+        <w:rPr>
+          <w:rFonts w:ascii="Consolas" w:cs="Consolas" w:eastAsia="Consolas" w:hAnsi="Consolas"/>
+        </w:rPr>
+        <w:t xml:space="preserve">Date=</w:t>
+      </w:r>
+      <w:r>
+        <w:t xml:space="preserve"> to the merge date, in the declared database locale; reasserts </w:t>
+      </w:r>
+      <w:r>
+        <w:rPr>
+          <w:rFonts w:ascii="Consolas" w:cs="Consolas" w:eastAsia="Consolas" w:hAnsi="Consolas"/>
+        </w:rPr>
+        <w:t xml:space="preserve">Modified=Yes</w:t>
+      </w:r>
+      <w:r>
+        <w:t xml:space="preserve">; preserves the </w:t>
+      </w:r>
+      <w:r>
+        <w:rPr>
+          <w:rFonts w:ascii="Consolas" w:cs="Consolas" w:eastAsia="Consolas" w:hAnsi="Consolas"/>
+        </w:rPr>
+        <w:t xml:space="preserve">Time</w:t>
+      </w:r>
+      <w:r>
+        <w:t xml:space="preserve"> value from B unchanged; and appends the CU token to the version-list tokens of A (A carries the customer tokens; B is the standard vendor object).</w:t>
       </w:r>
     </w:p>
     <w:p>
@@ -7840,83 +8010,20 @@
           <w:b/>
           <w:bCs/>
         </w:rPr>
-        <w:t xml:space="preserve">Changelog (documentation trigger):</w:t>
-      </w:r>
-      <w:r>
-        <w:t xml:space="preserve"> the tool keeps B's entries, including the newest vendor entries; then appends the customer entries from A that are not already present in B, matched by exact line, so that this is independent of any tag prefix; then appends a single CU stamp line last, at the standard six-space indent. This is a combined list: it loses neither the vendor's new entries nor the customer's entries.</w:t>
-      </w:r>
-    </w:p>
-    <w:p>
-      <w:pPr>
-        <w:pStyle w:val="Heading3"/>
-      </w:pPr>
-      <w:bookmarkStart w:id="9043" w:name="_Toc_cu_43"/>
-      <w:r>
-        <w:t xml:space="preserve">8.1.11 Differences in tag spelling are standardised</w:t>
-      </w:r>
-      <w:bookmarkEnd w:id="9043"/>
-    </w:p>
-    <w:p>
-      <w:pPr>
-        <w:spacing w:after="120"/>
-      </w:pPr>
-      <w:r>
-        <w:t xml:space="preserve">A difference in tag spelling between the version list and the body (for example, </w:t>
-      </w:r>
-      <w:r>
-        <w:rPr>
-          <w:rFonts w:ascii="Consolas" w:cs="Consolas" w:eastAsia="Consolas" w:hAnsi="Consolas"/>
-        </w:rPr>
-        <w:t xml:space="preserve">WBL-009</w:t>
-      </w:r>
-      <w:r>
-        <w:t xml:space="preserve"> in the body against </w:t>
-      </w:r>
-      <w:r>
-        <w:rPr>
-          <w:rFonts w:ascii="Consolas" w:cs="Consolas" w:eastAsia="Consolas" w:hAnsi="Consolas"/>
-        </w:rPr>
-        <w:t xml:space="preserve">WBL009</w:t>
-      </w:r>
-      <w:r>
-        <w:t xml:space="preserve"> in the version list) is matched without regard to hyphens or full stops, and the </w:t>
+        <w:t xml:space="preserve">Placement:</w:t>
+      </w:r>
+      <w:r>
+        <w:t xml:space="preserve"> customer content is inserted </w:t>
       </w:r>
       <w:r>
         <w:rPr>
           <w:b/>
           <w:bCs/>
         </w:rPr>
-        <w:t xml:space="preserve">version-list spelling is treated as the standard form</w:t>
-      </w:r>
-      <w:r>
-        <w:t xml:space="preserve">. The difference is flagged, and the merged object is written with the standard tag, so that the next upgrade reads a clean tag. A plain </w:t>
-      </w:r>
-      <w:r>
-        <w:rPr>
-          <w:rFonts w:ascii="Consolas" w:cs="Consolas" w:eastAsia="Consolas" w:hAnsi="Consolas"/>
-        </w:rPr>
-        <w:t xml:space="preserve">WBL</w:t>
-      </w:r>
-      <w:r>
-        <w:t xml:space="preserve"> with no identifier is left as it is; the tool never invents an identifier.</w:t>
-      </w:r>
-    </w:p>
-    <w:p>
-      <w:pPr>
-        <w:pStyle w:val="Heading2"/>
-      </w:pPr>
-      <w:bookmarkStart w:id="9044" w:name="_Toc_cu_44"/>
-      <w:r>
-        <w:t xml:space="preserve">8.2 Codeunit</w:t>
-      </w:r>
-      <w:bookmarkEnd w:id="9044"/>
-    </w:p>
-    <w:p>
-      <w:pPr>
-        <w:spacing w:after="120"/>
-      </w:pPr>
-      <w:r>
-        <w:t xml:space="preserve">A codeunit contains code only. It has no field nodes, so the field-graft, caption and option rules do not apply; they are explicitly disabled, so that they can never be applied wrongly. What runs is:</w:t>
+        <w:t xml:space="preserve">after</w:t>
+      </w:r>
+      <w:r>
+        <w:t xml:space="preserve"> the corresponding vendor content, which matches the established TortoiseMerge habit.</w:t>
       </w:r>
     </w:p>
     <w:p>
@@ -7933,10 +8040,83 @@
           <w:b/>
           <w:bCs/>
         </w:rPr>
-        <w:t xml:space="preserve">Customer code blocks</w:t>
-      </w:r>
-      <w:r>
-        <w:t xml:space="preserve"> — passed to the scorer, exactly as in section 8.1.4 (pure addition, vanilla modification or vanilla suppression; CARRY or MANUAL according to whether the insertion point survives).</w:t>
+        <w:t xml:space="preserve">Changelog (documentation trigger):</w:t>
+      </w:r>
+      <w:r>
+        <w:t xml:space="preserve"> the tool keeps B's entries, including the newest vendor entries; then appends the customer entries from A that are not already present in B, matched by exact line, so that this is independent of any tag prefix; then appends a single CU stamp line last, at the standard six-space indent. This is a combined list: it loses neither the vendor's new entries nor the customer's entries.</w:t>
+      </w:r>
+    </w:p>
+    <w:p>
+      <w:pPr>
+        <w:pStyle w:val="Heading3"/>
+      </w:pPr>
+      <w:bookmarkStart w:id="9044" w:name="_Toc_cu_44"/>
+      <w:r>
+        <w:t xml:space="preserve">8.1.11 Differences in tag spelling are standardised</w:t>
+      </w:r>
+      <w:bookmarkEnd w:id="9044"/>
+    </w:p>
+    <w:p>
+      <w:pPr>
+        <w:spacing w:after="120"/>
+      </w:pPr>
+      <w:r>
+        <w:t xml:space="preserve">A difference in tag spelling between the version list and the body (for example, </w:t>
+      </w:r>
+      <w:r>
+        <w:rPr>
+          <w:rFonts w:ascii="Consolas" w:cs="Consolas" w:eastAsia="Consolas" w:hAnsi="Consolas"/>
+        </w:rPr>
+        <w:t xml:space="preserve">WBL-009</w:t>
+      </w:r>
+      <w:r>
+        <w:t xml:space="preserve"> in the body against </w:t>
+      </w:r>
+      <w:r>
+        <w:rPr>
+          <w:rFonts w:ascii="Consolas" w:cs="Consolas" w:eastAsia="Consolas" w:hAnsi="Consolas"/>
+        </w:rPr>
+        <w:t xml:space="preserve">WBL009</w:t>
+      </w:r>
+      <w:r>
+        <w:t xml:space="preserve"> in the version list) is matched without regard to hyphens or full stops, and the </w:t>
+      </w:r>
+      <w:r>
+        <w:rPr>
+          <w:b/>
+          <w:bCs/>
+        </w:rPr>
+        <w:t xml:space="preserve">version-list spelling is treated as the standard form</w:t>
+      </w:r>
+      <w:r>
+        <w:t xml:space="preserve">. The difference is flagged, and the merged object is written with the standard tag, so that the next upgrade reads a clean tag. A plain </w:t>
+      </w:r>
+      <w:r>
+        <w:rPr>
+          <w:rFonts w:ascii="Consolas" w:cs="Consolas" w:eastAsia="Consolas" w:hAnsi="Consolas"/>
+        </w:rPr>
+        <w:t xml:space="preserve">WBL</w:t>
+      </w:r>
+      <w:r>
+        <w:t xml:space="preserve"> with no identifier is left as it is; the tool never invents an identifier.</w:t>
+      </w:r>
+    </w:p>
+    <w:p>
+      <w:pPr>
+        <w:pStyle w:val="Heading2"/>
+      </w:pPr>
+      <w:bookmarkStart w:id="9045" w:name="_Toc_cu_45"/>
+      <w:r>
+        <w:t xml:space="preserve">8.2 Codeunit</w:t>
+      </w:r>
+      <w:bookmarkEnd w:id="9045"/>
+    </w:p>
+    <w:p>
+      <w:pPr>
+        <w:spacing w:after="120"/>
+      </w:pPr>
+      <w:r>
+        <w:t xml:space="preserve">A codeunit contains code only. It has no field nodes, so the field-graft, caption and option rules do not apply; they are explicitly disabled, so that they can never be applied wrongly. What runs is:</w:t>
       </w:r>
     </w:p>
     <w:p>
@@ -7953,10 +8133,10 @@
           <w:b/>
           <w:bCs/>
         </w:rPr>
-        <w:t xml:space="preserve">Customer variable declarations</w:t>
-      </w:r>
-      <w:r>
-        <w:t xml:space="preserve"> — carried, as in section 8.1.7.</w:t>
+        <w:t xml:space="preserve">Customer code blocks</w:t>
+      </w:r>
+      <w:r>
+        <w:t xml:space="preserve"> — passed to the scorer, exactly as in section 8.1.4 (pure addition, vanilla modification or vanilla suppression; CARRY or MANUAL according to whether the insertion point survives).</w:t>
       </w:r>
     </w:p>
     <w:p>
@@ -7973,10 +8153,10 @@
           <w:b/>
           <w:bCs/>
         </w:rPr>
-        <w:t xml:space="preserve">Changelog carry and header bookkeeping</w:t>
-      </w:r>
-      <w:r>
-        <w:t xml:space="preserve"> — as in section 8.1.9.</w:t>
+        <w:t xml:space="preserve">Customer variable declarations</w:t>
+      </w:r>
+      <w:r>
+        <w:t xml:space="preserve"> — carried, as in section 8.1.7.</w:t>
       </w:r>
     </w:p>
     <w:p>
@@ -7993,10 +8173,10 @@
           <w:b/>
           <w:bCs/>
         </w:rPr>
-        <w:t xml:space="preserve">An untagged region where A differs from B</w:t>
-      </w:r>
-      <w:r>
-        <w:t xml:space="preserve"> — TAKE B. For code objects, tag discipline is reliable, so an untagged code difference is most likely the vendor's own change. This is the one remaining case where vendor content is taken without an explicit signal; it is accepted deliberately, and is confined to code objects, where tag discipline holds. It does not apply to pages or reports.</w:t>
+        <w:t xml:space="preserve">Changelog carry and header bookkeeping</w:t>
+      </w:r>
+      <w:r>
+        <w:t xml:space="preserve"> — as in section 8.1.9.</w:t>
       </w:r>
     </w:p>
     <w:p>
@@ -8010,49 +8190,13 @@
       </w:pPr>
       <w:r>
         <w:rPr>
-          <w:i/>
-          <w:iCs/>
-        </w:rPr>
-        <w:t xml:space="preserve">Validated on Codeunit 80 (Sales-Post):</w:t>
-      </w:r>
-      <w:r>
-        <w:t xml:space="preserve"> customer vanilla modifications are sent to manual review; the vendor's own tag defects, present identically in A and B, are tolerated rather than stopped on.</w:t>
-      </w:r>
-    </w:p>
-    <w:p>
-      <w:pPr>
-        <w:pStyle w:val="Heading2"/>
-      </w:pPr>
-      <w:bookmarkStart w:id="9045" w:name="_Toc_cu_45"/>
-      <w:r>
-        <w:t xml:space="preserve">8.3 Page</w:t>
-      </w:r>
-      <w:bookmarkEnd w:id="9045"/>
-    </w:p>
-    <w:p>
-      <w:pPr>
-        <w:spacing w:after="120"/>
-      </w:pPr>
-      <w:r>
-        <w:t xml:space="preserve">A page is a structure-bearing object: it consists of a tree of controls, captions and layout, and is often untagged, because there is frequently no natural place for an inline code tag. The absence of tags is therefore never read as "unchanged"; the tool works from the structural comparison and the changelog. The page handler is validated: it merges confident cases automatically and sends uncertain ones to manual review.</w:t>
-      </w:r>
-    </w:p>
-    <w:p>
-      <w:pPr>
-        <w:pStyle w:val="Heading3"/>
-      </w:pPr>
-      <w:bookmarkStart w:id="9046" w:name="_Toc_cu_46"/>
-      <w:r>
-        <w:t xml:space="preserve">8.3.1 A control added by the customer — CARRY (graft)</w:t>
-      </w:r>
-      <w:bookmarkEnd w:id="9046"/>
-    </w:p>
-    <w:p>
-      <w:pPr>
-        <w:spacing w:after="120"/>
-      </w:pPr>
-      <w:r>
-        <w:t xml:space="preserve">A control present in A, absent from B, and justified either by a changelog entry that names it or by a customer tag, is grafted into the controls of B after the control that still exists in B. This is structurally the same as a table field graft, with page spacing (pages separate sibling controls with a blank line).</w:t>
+          <w:b/>
+          <w:bCs/>
+        </w:rPr>
+        <w:t xml:space="preserve">An untagged region where A differs from B</w:t>
+      </w:r>
+      <w:r>
+        <w:t xml:space="preserve"> — TAKE B. For code objects, tag discipline is reliable, so an untagged code difference is most likely the vendor's own change. This is the one remaining case where vendor content is taken without an explicit signal; it is accepted deliberately, and is confined to code objects, where tag discipline holds. It does not apply to pages or reports.</w:t>
       </w:r>
     </w:p>
     <w:p>
@@ -8069,10 +8213,46 @@
           <w:i/>
           <w:iCs/>
         </w:rPr>
-        <w:t xml:space="preserve">Validated on Page 14:</w:t>
-      </w:r>
-      <w:r>
-        <w:t xml:space="preserve"> the customer added an "E-Mail" control, justified only by the changelog entry "Added E-Mail field", with no tag on the control itself. It is grafted after its anchor, the "Phone No." control, identically to the hand merge.</w:t>
+        <w:t xml:space="preserve">Validated on Codeunit 80 (Sales-Post):</w:t>
+      </w:r>
+      <w:r>
+        <w:t xml:space="preserve"> customer vanilla modifications are sent to manual review; the vendor's own tag defects, present identically in A and B, are tolerated rather than stopped on.</w:t>
+      </w:r>
+    </w:p>
+    <w:p>
+      <w:pPr>
+        <w:pStyle w:val="Heading2"/>
+      </w:pPr>
+      <w:bookmarkStart w:id="9046" w:name="_Toc_cu_46"/>
+      <w:r>
+        <w:t xml:space="preserve">8.3 Page</w:t>
+      </w:r>
+      <w:bookmarkEnd w:id="9046"/>
+    </w:p>
+    <w:p>
+      <w:pPr>
+        <w:spacing w:after="120"/>
+      </w:pPr>
+      <w:r>
+        <w:t xml:space="preserve">A page is a structure-bearing object: it consists of a tree of controls, captions and layout, and is often untagged, because there is frequently no natural place for an inline code tag. The absence of tags is therefore never read as "unchanged"; the tool works from the structural comparison and the changelog. The page handler is validated: it merges confident cases automatically and sends uncertain ones to manual review.</w:t>
+      </w:r>
+    </w:p>
+    <w:p>
+      <w:pPr>
+        <w:pStyle w:val="Heading3"/>
+      </w:pPr>
+      <w:bookmarkStart w:id="9047" w:name="_Toc_cu_47"/>
+      <w:r>
+        <w:t xml:space="preserve">8.3.1 A control added by the customer — CARRY (graft)</w:t>
+      </w:r>
+      <w:bookmarkEnd w:id="9047"/>
+    </w:p>
+    <w:p>
+      <w:pPr>
+        <w:spacing w:after="120"/>
+      </w:pPr>
+      <w:r>
+        <w:t xml:space="preserve">A control present in A, absent from B, and justified either by a changelog entry that names it or by a customer tag, is grafted into the controls of B after the control that still exists in B. This is structurally the same as a table field graft, with page spacing (pages separate sibling controls with a blank line).</w:t>
       </w:r>
     </w:p>
     <w:p>
@@ -8089,28 +8269,10 @@
           <w:i/>
           <w:iCs/>
         </w:rPr>
-        <w:t xml:space="preserve">Validated on Page 21 (tagged version):</w:t>
-      </w:r>
-      <w:r>
-        <w:t xml:space="preserve"> the four customer FactBoxes, carrying a customer tag, merge automatically as confident grafts, in the correct order even when several share one anchor.</w:t>
-      </w:r>
-    </w:p>
-    <w:p>
-      <w:pPr>
-        <w:pStyle w:val="Heading3"/>
-      </w:pPr>
-      <w:bookmarkStart w:id="9047" w:name="_Toc_cu_47"/>
-      <w:r>
-        <w:t xml:space="preserve">8.3.2 A vendor caption rename — TAKE B (do not carry the outdated customer caption)</w:t>
-      </w:r>
-      <w:bookmarkEnd w:id="9047"/>
-    </w:p>
-    <w:p>
-      <w:pPr>
-        <w:spacing w:after="120"/>
-      </w:pPr>
-      <w:r>
-        <w:t xml:space="preserve">If a caption or option difference exists, and B carries a vendor tag that A does not, the change is vendor-driven: the vendor renamed it. The tool takes the vendor value, and does not carry the customer's now-outdated value. This guard prevents the table-era rule of always carrying the customer caption from overwriting a vendor rename.</w:t>
+        <w:t xml:space="preserve">Validated on Page 14:</w:t>
+      </w:r>
+      <w:r>
+        <w:t xml:space="preserve"> the customer added an "E-Mail" control, justified only by the changelog entry "Added E-Mail field", with no tag on the control itself. It is grafted after its anchor, the "Phone No." control, identically to the hand merge.</w:t>
       </w:r>
     </w:p>
     <w:p>
@@ -8127,10 +8289,10 @@
           <w:i/>
           <w:iCs/>
         </w:rPr>
-        <w:t xml:space="preserve">Validated on Page 21:</w:t>
-      </w:r>
-      <w:r>
-        <w:t xml:space="preserve"> controls where the vendor renamed "Quick Customer" to "New Quick Customer" and added a new vendor tag in B. The vendor value is taken.</w:t>
+        <w:t xml:space="preserve">Validated on Page 21 (tagged version):</w:t>
+      </w:r>
+      <w:r>
+        <w:t xml:space="preserve"> the four customer FactBoxes, carrying a customer tag, merge automatically as confident grafts, in the correct order even when several share one anchor.</w:t>
       </w:r>
     </w:p>
     <w:p>
@@ -8139,7 +8301,7 @@
       </w:pPr>
       <w:bookmarkStart w:id="9048" w:name="_Toc_cu_48"/>
       <w:r>
-        <w:t xml:space="preserve">8.3.3 A control present only in A, carrying only a vendor tag — MANUAL</w:t>
+        <w:t xml:space="preserve">8.3.2 A vendor caption rename — TAKE B (do not carry the outdated customer caption)</w:t>
       </w:r>
       <w:bookmarkEnd w:id="9048"/>
     </w:p>
@@ -8148,17 +8310,7 @@
         <w:spacing w:after="120"/>
       </w:pPr>
       <w:r>
-        <w:t xml:space="preserve">A control present only in A that carries </w:t>
-      </w:r>
-      <w:r>
-        <w:rPr>
-          <w:b/>
-          <w:bCs/>
-        </w:rPr>
-        <w:t xml:space="preserve">only</w:t>
-      </w:r>
-      <w:r>
-        <w:t xml:space="preserve"> a vendor description tag is ambiguous: it could be a genuine vendor deletion, or a customer-added control that happens to carry a vendor tag. From the control alone, the tool cannot tell which, so it sends the object to manual review rather than risk dropping a customer control.</w:t>
+        <w:t xml:space="preserve">If a caption or option difference exists, and B carries a vendor tag that A does not, the change is vendor-driven: the vendor renamed it. The tool takes the vendor value, and does not carry the customer's now-outdated value. This guard prevents the table-era rule of always carrying the customer caption from overwriting a vendor rename.</w:t>
       </w:r>
     </w:p>
     <w:p>
@@ -8178,7 +8330,7 @@
         <w:t xml:space="preserve">Validated on Page 21:</w:t>
       </w:r>
       <w:r>
-        <w:t xml:space="preserve"> FactBoxes recorded under a customer changelog entry but each carrying a vendor description tag are sent to manual review. When the same FactBoxes are given a customer tag (the tagged version of the page), the same object merges automatically, as in section 8.3.1. The customer tag is what resolves the ambiguity.</w:t>
+        <w:t xml:space="preserve"> controls where the vendor renamed "Quick Customer" to "New Quick Customer" and added a new vendor tag in B. The vendor value is taken.</w:t>
       </w:r>
     </w:p>
     <w:p>
@@ -8187,7 +8339,7 @@
       </w:pPr>
       <w:bookmarkStart w:id="9049" w:name="_Toc_cu_49"/>
       <w:r>
-        <w:t xml:space="preserve">8.3.4 A customer change to a property on a shared control — MANUAL</w:t>
+        <w:t xml:space="preserve">8.3.3 A control present only in A, carrying only a vendor tag — MANUAL</w:t>
       </w:r>
       <w:bookmarkEnd w:id="9049"/>
     </w:p>
@@ -8196,21 +8348,17 @@
         <w:spacing w:after="120"/>
       </w:pPr>
       <w:r>
-        <w:t xml:space="preserve">A customer change to a property on a control that exists in both A and B — for example, changing</w:t>
-      </w:r>
-    </w:p>
-    <w:p>
-      <w:pPr>
-        <w:spacing w:after="120"/>
-      </w:pPr>
-      <w:r>
-        <w:rPr>
-          <w:rFonts w:ascii="Consolas" w:cs="Consolas" w:eastAsia="Consolas" w:hAnsi="Consolas"/>
-        </w:rPr>
-        <w:t xml:space="preserve">Visible</w:t>
-      </w:r>
-      <w:r>
-        <w:t xml:space="preserve"> — is a modification, not a clean addition, and is sent to manual review.</w:t>
+        <w:t xml:space="preserve">A control present only in A that carries </w:t>
+      </w:r>
+      <w:r>
+        <w:rPr>
+          <w:b/>
+          <w:bCs/>
+        </w:rPr>
+        <w:t xml:space="preserve">only</w:t>
+      </w:r>
+      <w:r>
+        <w:t xml:space="preserve"> a vendor description tag is ambiguous: it could be a genuine vendor deletion, or a customer-added control that happens to carry a vendor tag. From the control alone, the tool cannot tell which, so it sends the object to manual review rather than risk dropping a customer control.</w:t>
       </w:r>
     </w:p>
     <w:p>
@@ -8227,11 +8375,34 @@
           <w:i/>
           <w:iCs/>
         </w:rPr>
-        <w:t xml:space="preserve">Validated on Page 5025440:</w:t>
-      </w:r>
-      <w:r>
-        <w:t xml:space="preserve"> the customer changed </w:t>
-      </w:r>
+        <w:t xml:space="preserve">Validated on Page 21:</w:t>
+      </w:r>
+      <w:r>
+        <w:t xml:space="preserve"> FactBoxes recorded under a customer changelog entry but each carrying a vendor description tag are sent to manual review. When the same FactBoxes are given a customer tag (the tagged version of the page), the same object merges automatically, as in section 8.3.1. The customer tag is what resolves the ambiguity.</w:t>
+      </w:r>
+    </w:p>
+    <w:p>
+      <w:pPr>
+        <w:pStyle w:val="Heading3"/>
+      </w:pPr>
+      <w:bookmarkStart w:id="9050" w:name="_Toc_cu_50"/>
+      <w:r>
+        <w:t xml:space="preserve">8.3.4 A customer change to a property on a shared control — MANUAL</w:t>
+      </w:r>
+      <w:bookmarkEnd w:id="9050"/>
+    </w:p>
+    <w:p>
+      <w:pPr>
+        <w:spacing w:after="120"/>
+      </w:pPr>
+      <w:r>
+        <w:t xml:space="preserve">A customer change to a property on a control that exists in both A and B — for example, changing</w:t>
+      </w:r>
+    </w:p>
+    <w:p>
+      <w:pPr>
+        <w:spacing w:after="120"/>
+      </w:pPr>
       <w:r>
         <w:rPr>
           <w:rFonts w:ascii="Consolas" w:cs="Consolas" w:eastAsia="Consolas" w:hAnsi="Consolas"/>
@@ -8239,97 +8410,8 @@
         <w:t xml:space="preserve">Visible</w:t>
       </w:r>
       <w:r>
-        <w:t xml:space="preserve"> from </w:t>
-      </w:r>
-      <w:r>
-        <w:rPr>
-          <w:rFonts w:ascii="Consolas" w:cs="Consolas" w:eastAsia="Consolas" w:hAnsi="Consolas"/>
-        </w:rPr>
-        <w:t xml:space="preserve">FALSE</w:t>
-      </w:r>
-      <w:r>
-        <w:t xml:space="preserve"> to </w:t>
-      </w:r>
-      <w:r>
-        <w:rPr>
-          <w:rFonts w:ascii="Consolas" w:cs="Consolas" w:eastAsia="Consolas" w:hAnsi="Consolas"/>
-        </w:rPr>
-        <w:t xml:space="preserve">true</w:t>
-      </w:r>
-      <w:r>
-        <w:t xml:space="preserve"> on a shared control. The object is sent to manual review.</w:t>
-      </w:r>
-    </w:p>
-    <w:p>
-      <w:pPr>
-        <w:pStyle w:val="Heading3"/>
-      </w:pPr>
-      <w:bookmarkStart w:id="9050" w:name="_Toc_cu_50"/>
-      <w:r>
-        <w:t xml:space="preserve">8.3.5 Caption capture on a page stops at the closing brace</w:t>
-      </w:r>
-      <w:bookmarkEnd w:id="9050"/>
-    </w:p>
-    <w:p>
-      <w:pPr>
-        <w:spacing w:after="120"/>
-      </w:pPr>
-      <w:r>
-        <w:t xml:space="preserve">On a page, a single-value caption can be the last property before the control's closing brace, with no trailing semicolon (for example, </w:t>
-      </w:r>
-      <w:r>
-        <w:rPr>
-          <w:rFonts w:ascii="Consolas" w:cs="Consolas" w:eastAsia="Consolas" w:hAnsi="Consolas"/>
-        </w:rPr>
-        <w:t xml:space="preserve">CaptionML=ENU=General }</w:t>
-      </w:r>
-      <w:r>
-        <w:t xml:space="preserve">). The tool stops reading the caption value at the brace as well as at the semicolon, so that the brace is not read as part of the value. (A table caption always ends at a semicolon, so this applies to pages only.)</w:t>
-      </w:r>
-    </w:p>
-    <w:p>
-      <w:pPr>
-        <w:spacing w:after="120"/>
-      </w:pPr>
-      <w:r>
-        <w:t xml:space="preserve">The page handler also performs the variable-declaration carry (sections 8.1.7 and 8.1.8) and the changelog and header bookkeeping (section 8.1.9).</w:t>
-      </w:r>
-    </w:p>
-    <w:p>
-      <w:pPr>
-        <w:pStyle w:val="Heading2"/>
-      </w:pPr>
-      <w:bookmarkStart w:id="9051" w:name="_Toc_cu_51"/>
-      <w:r>
-        <w:t xml:space="preserve">8.4 Report and XMLport</w:t>
-      </w:r>
-      <w:bookmarkEnd w:id="9051"/>
-    </w:p>
-    <w:p>
-      <w:pPr>
-        <w:spacing w:after="120"/>
-      </w:pPr>
-      <w:r>
-        <w:t xml:space="preserve">Both report and XMLport objects are recognised but not yet validated. The whole object is sent to manual review before any rule runs. The report describes this in plain language ("object type not yet auto-merged by the tool — manual merge").</w:t>
-      </w:r>
-    </w:p>
-    <w:p>
-      <w:pPr>
-        <w:spacing w:after="120"/>
-      </w:pPr>
-      <w:r>
-        <w:t xml:space="preserve">This is deliberately safe. It means that there is no path by which a report can be merged incompletely. In particular, the RDLC layout case — for example, a report whose change is "Add header and footer", where the change is held in a layout block that the comparison does not read — is covered by the whole-object gate, not missed. A report or XMLport object will be merged automatically only once its handler is built and validated against a real object.</w:t>
-      </w:r>
-    </w:p>
-    <w:p>
-      <w:pPr>
-        <w:pStyle w:val="Heading2"/>
-      </w:pPr>
-      <w:bookmarkStart w:id="9052" w:name="_Toc_cu_52"/>
-      <w:r>
-        <w:t xml:space="preserve">8.5 Rules that apply to all object types</w:t>
-      </w:r>
-      <w:bookmarkEnd w:id="9052"/>
+        <w:t xml:space="preserve"> — is a modification, not a clean addition, and is sent to manual review.</w:t>
+      </w:r>
     </w:p>
     <w:p>
       <w:pPr>
@@ -8342,23 +8424,112 @@
       </w:pPr>
       <w:r>
         <w:rPr>
-          <w:b/>
-          <w:bCs/>
-        </w:rPr>
-        <w:t xml:space="preserve">Killme objects are retired.</w:t>
-      </w:r>
-      <w:r>
-        <w:t xml:space="preserve"> An object whose name contains the word </w:t>
-      </w:r>
-      <w:r>
-        <w:rPr>
-          <w:rFonts w:ascii="Consolas" w:cs="Consolas" w:eastAsia="Consolas" w:hAnsi="Consolas"/>
-        </w:rPr>
-        <w:t xml:space="preserve">kill</w:t>
-      </w:r>
-      <w:r>
-        <w:t xml:space="preserve"> is retired and is never written to the merged set. It is identified by its name, not by its version list or body tags.</w:t>
-      </w:r>
+          <w:i/>
+          <w:iCs/>
+        </w:rPr>
+        <w:t xml:space="preserve">Validated on Page 5025440:</w:t>
+      </w:r>
+      <w:r>
+        <w:t xml:space="preserve"> the customer changed </w:t>
+      </w:r>
+      <w:r>
+        <w:rPr>
+          <w:rFonts w:ascii="Consolas" w:cs="Consolas" w:eastAsia="Consolas" w:hAnsi="Consolas"/>
+        </w:rPr>
+        <w:t xml:space="preserve">Visible</w:t>
+      </w:r>
+      <w:r>
+        <w:t xml:space="preserve"> from </w:t>
+      </w:r>
+      <w:r>
+        <w:rPr>
+          <w:rFonts w:ascii="Consolas" w:cs="Consolas" w:eastAsia="Consolas" w:hAnsi="Consolas"/>
+        </w:rPr>
+        <w:t xml:space="preserve">FALSE</w:t>
+      </w:r>
+      <w:r>
+        <w:t xml:space="preserve"> to </w:t>
+      </w:r>
+      <w:r>
+        <w:rPr>
+          <w:rFonts w:ascii="Consolas" w:cs="Consolas" w:eastAsia="Consolas" w:hAnsi="Consolas"/>
+        </w:rPr>
+        <w:t xml:space="preserve">true</w:t>
+      </w:r>
+      <w:r>
+        <w:t xml:space="preserve"> on a shared control. The object is sent to manual review.</w:t>
+      </w:r>
+    </w:p>
+    <w:p>
+      <w:pPr>
+        <w:pStyle w:val="Heading3"/>
+      </w:pPr>
+      <w:bookmarkStart w:id="9051" w:name="_Toc_cu_51"/>
+      <w:r>
+        <w:t xml:space="preserve">8.3.5 Caption capture on a page stops at the closing brace</w:t>
+      </w:r>
+      <w:bookmarkEnd w:id="9051"/>
+    </w:p>
+    <w:p>
+      <w:pPr>
+        <w:spacing w:after="120"/>
+      </w:pPr>
+      <w:r>
+        <w:t xml:space="preserve">On a page, a single-value caption can be the last property before the control's closing brace, with no trailing semicolon (for example, </w:t>
+      </w:r>
+      <w:r>
+        <w:rPr>
+          <w:rFonts w:ascii="Consolas" w:cs="Consolas" w:eastAsia="Consolas" w:hAnsi="Consolas"/>
+        </w:rPr>
+        <w:t xml:space="preserve">CaptionML=ENU=General }</w:t>
+      </w:r>
+      <w:r>
+        <w:t xml:space="preserve">). The tool stops reading the caption value at the brace as well as at the semicolon, so that the brace is not read as part of the value. (A table caption always ends at a semicolon, so this applies to pages only.)</w:t>
+      </w:r>
+    </w:p>
+    <w:p>
+      <w:pPr>
+        <w:spacing w:after="120"/>
+      </w:pPr>
+      <w:r>
+        <w:t xml:space="preserve">The page handler also performs the variable-declaration carry (sections 8.1.7 and 8.1.8) and the changelog and header bookkeeping (section 8.1.9).</w:t>
+      </w:r>
+    </w:p>
+    <w:p>
+      <w:pPr>
+        <w:pStyle w:val="Heading2"/>
+      </w:pPr>
+      <w:bookmarkStart w:id="9052" w:name="_Toc_cu_52"/>
+      <w:r>
+        <w:t xml:space="preserve">8.4 Report and XMLport</w:t>
+      </w:r>
+      <w:bookmarkEnd w:id="9052"/>
+    </w:p>
+    <w:p>
+      <w:pPr>
+        <w:spacing w:after="120"/>
+      </w:pPr>
+      <w:r>
+        <w:t xml:space="preserve">Both report and XMLport objects are recognised but not yet validated. The whole object is sent to manual review before any rule runs. The report describes this in plain language ("object type not yet auto-merged by the tool — manual merge").</w:t>
+      </w:r>
+    </w:p>
+    <w:p>
+      <w:pPr>
+        <w:spacing w:after="120"/>
+      </w:pPr>
+      <w:r>
+        <w:t xml:space="preserve">This is deliberately safe. It means that there is no path by which a report can be merged incompletely. In particular, the RDLC layout case — for example, a report whose change is "Add header and footer", where the change is held in a layout block that the comparison does not read — is covered by the whole-object gate, not missed. A report or XMLport object will be merged automatically only once its handler is built and validated against a real object.</w:t>
+      </w:r>
+    </w:p>
+    <w:p>
+      <w:pPr>
+        <w:pStyle w:val="Heading2"/>
+      </w:pPr>
+      <w:bookmarkStart w:id="9053" w:name="_Toc_cu_53"/>
+      <w:r>
+        <w:t xml:space="preserve">8.5 Rules that apply to all object types</w:t>
+      </w:r>
+      <w:bookmarkEnd w:id="9053"/>
     </w:p>
     <w:p>
       <w:pPr>
@@ -8374,10 +8545,19 @@
           <w:b/>
           <w:bCs/>
         </w:rPr>
-        <w:t xml:space="preserve">Modified = No means take B.</w:t>
-      </w:r>
-      <w:r>
-        <w:t xml:space="preserve"> If the header of A records that the customer never modified the object, the vendor object is taken.</w:t>
+        <w:t xml:space="preserve">Killme objects are retired.</w:t>
+      </w:r>
+      <w:r>
+        <w:t xml:space="preserve"> An object whose name contains the word </w:t>
+      </w:r>
+      <w:r>
+        <w:rPr>
+          <w:rFonts w:ascii="Consolas" w:cs="Consolas" w:eastAsia="Consolas" w:hAnsi="Consolas"/>
+        </w:rPr>
+        <w:t xml:space="preserve">kill</w:t>
+      </w:r>
+      <w:r>
+        <w:t xml:space="preserve"> is retired and is never written to the merged set. It is identified by its name, not by its version list or body tags.</w:t>
       </w:r>
     </w:p>
     <w:p>
@@ -8394,10 +8574,10 @@
           <w:b/>
           <w:bCs/>
         </w:rPr>
-        <w:t xml:space="preserve">An identical object means take B.</w:t>
-      </w:r>
-      <w:r>
-        <w:t xml:space="preserve"> After the header bookkeeping, whitespace, line endings and language layer are normalised, if A is identical to B, there is nothing to carry.</w:t>
+        <w:t xml:space="preserve">Modified = No means take B.</w:t>
+      </w:r>
+      <w:r>
+        <w:t xml:space="preserve"> If the header of A records that the customer never modified the object, the vendor object is taken.</w:t>
       </w:r>
     </w:p>
     <w:p>
@@ -8414,19 +8594,10 @@
           <w:b/>
           <w:bCs/>
         </w:rPr>
-        <w:t xml:space="preserve">Integrity is assessed by layer.</w:t>
-      </w:r>
-      <w:r>
-        <w:t xml:space="preserve"> A malformed tag in a customer block stops the merge, because the block cannot be transplanted safely. A malformed tag in a vendor block is a warning only, because incadea ships its own tag defects (for example </w:t>
-      </w:r>
-      <w:r>
-        <w:rPr>
-          <w:rFonts w:ascii="Consolas" w:cs="Consolas" w:eastAsia="Consolas" w:hAnsi="Consolas"/>
-        </w:rPr>
-        <w:t xml:space="preserve">// Srop PA035804</w:t>
-      </w:r>
-      <w:r>
-        <w:t xml:space="preserve">) identically in A and B, and the tool must not stop on the vendor's own errors.</w:t>
+        <w:t xml:space="preserve">An identical object means take B.</w:t>
+      </w:r>
+      <w:r>
+        <w:t xml:space="preserve"> After the header bookkeeping, whitespace, line endings and language layer are normalised, if A is identical to B, there is nothing to carry.</w:t>
       </w:r>
     </w:p>
     <w:p>
@@ -8443,19 +8614,19 @@
           <w:b/>
           <w:bCs/>
         </w:rPr>
-        <w:t xml:space="preserve">Transplant is verbatim.</w:t>
-      </w:r>
-      <w:r>
-        <w:t xml:space="preserve"> Customer blocks are inserted exactly as written, including their original indentation; the tool does not re-indent them. (A hand merge sometimes re-indents an inner </w:t>
-      </w:r>
-      <w:r>
-        <w:rPr>
-          <w:rFonts w:ascii="Consolas" w:cs="Consolas" w:eastAsia="Consolas" w:hAnsi="Consolas"/>
-        </w:rPr>
-        <w:t xml:space="preserve">END;</w:t>
-      </w:r>
-      <w:r>
-        <w:t xml:space="preserve">; the tool's verbatim form still compiles, and can be tidied later.)</w:t>
+        <w:t xml:space="preserve">Integrity is assessed by layer.</w:t>
+      </w:r>
+      <w:r>
+        <w:t xml:space="preserve"> A malformed tag in a customer block stops the merge, because the block cannot be transplanted safely. A malformed tag in a vendor block is a warning only, because incadea ships its own tag defects (for example </w:t>
+      </w:r>
+      <w:r>
+        <w:rPr>
+          <w:rFonts w:ascii="Consolas" w:cs="Consolas" w:eastAsia="Consolas" w:hAnsi="Consolas"/>
+        </w:rPr>
+        <w:t xml:space="preserve">// Srop PA035804</w:t>
+      </w:r>
+      <w:r>
+        <w:t xml:space="preserve">) identically in A and B, and the tool must not stop on the vendor's own errors.</w:t>
       </w:r>
     </w:p>
     <w:p>
@@ -8472,31 +8643,60 @@
           <w:b/>
           <w:bCs/>
         </w:rPr>
-        <w:t xml:space="preserve">Encoding.</w:t>
-      </w:r>
-      <w:r>
-        <w:t xml:space="preserve"> Files are in cp1252 / Latin-1 encoding. TortoiseMerge artefacts — carriage returns, trailing whitespace, and stray tabs in the changelog — are normalised.</w:t>
-      </w:r>
-    </w:p>
-    <w:p>
-      <w:pPr>
-        <w:pStyle w:val="Heading1"/>
-      </w:pPr>
-      <w:bookmarkStart w:id="9053" w:name="_Toc_cu_53"/>
-      <w:r>
-        <w:t xml:space="preserve">9. Quick reference</w:t>
-      </w:r>
-      <w:bookmarkEnd w:id="9053"/>
-    </w:p>
-    <w:p>
-      <w:pPr>
-        <w:spacing w:after="120"/>
+        <w:t xml:space="preserve">Transplant is verbatim.</w:t>
+      </w:r>
+      <w:r>
+        <w:t xml:space="preserve"> Customer blocks are inserted exactly as written, including their original indentation; the tool does not re-indent them. (A hand merge sometimes re-indents an inner </w:t>
+      </w:r>
+      <w:r>
+        <w:rPr>
+          <w:rFonts w:ascii="Consolas" w:cs="Consolas" w:eastAsia="Consolas" w:hAnsi="Consolas"/>
+        </w:rPr>
+        <w:t xml:space="preserve">END;</w:t>
+      </w:r>
+      <w:r>
+        <w:t xml:space="preserve">; the tool's verbatim form still compiles, and can be tidied later.)</w:t>
+      </w:r>
+    </w:p>
+    <w:p>
+      <w:pPr>
+        <w:pStyle w:val="ListParagraph"/>
+        <w:numPr>
+          <w:ilvl w:val="0"/>
+          <w:numId w:val="2"/>
+        </w:numPr>
+        <w:spacing w:after="40"/>
       </w:pPr>
       <w:r>
         <w:rPr>
           <w:b/>
           <w:bCs/>
         </w:rPr>
+        <w:t xml:space="preserve">Encoding.</w:t>
+      </w:r>
+      <w:r>
+        <w:t xml:space="preserve"> Files are in cp1252 / Latin-1 encoding. TortoiseMerge artefacts — carriage returns, trailing whitespace, and stray tabs in the changelog — are normalised.</w:t>
+      </w:r>
+    </w:p>
+    <w:p>
+      <w:pPr>
+        <w:pStyle w:val="Heading1"/>
+      </w:pPr>
+      <w:bookmarkStart w:id="9054" w:name="_Toc_cu_54"/>
+      <w:r>
+        <w:t xml:space="preserve">9. Quick reference</w:t>
+      </w:r>
+      <w:bookmarkEnd w:id="9054"/>
+    </w:p>
+    <w:p>
+      <w:pPr>
+        <w:spacing w:after="120"/>
+      </w:pPr>
+      <w:r>
+        <w:rPr>
+          <w:b/>
+          <w:bCs/>
+        </w:rPr>
         <w:t xml:space="preserve">To run a job:</w:t>
       </w:r>
       <w:r>
@@ -8506,7 +8706,7 @@
         <w:rPr>
           <w:rFonts w:ascii="Consolas" w:cs="Consolas" w:eastAsia="Consolas" w:hAnsi="Consolas"/>
         </w:rPr>
-        <w:t xml:space="preserve">CUupdate_2.0.exe</w:t>
+        <w:t xml:space="preserve">CUupdate_2.1.exe</w:t>
       </w:r>
       <w:r>
         <w:t xml:space="preserve">; select the folder that contains </w:t>

</xml_diff>

<commit_message>
Docs + v2.3 for no-CU-change: CONTEXT 8.26, ARCHITECTURE 5a, manual
Version 2.2 -> 2.3 (CUupdate_2.3.exe). ARCHITECTURE: no-CU-change as
pipeline step 4 + 5a (attribution contract, both traps). CONTEXT 8.26
session log. USER_MANUAL .md + rebuilt .docx (NoCuChangesDetected outcome,
summary line).
</commit_message>
<xml_diff>
--- a/docs/USER_MANUAL.docx
+++ b/docs/USER_MANUAL.docx
@@ -801,7 +801,7 @@
               <w:rPr>
                 <w:noProof/>
               </w:rPr>
-              <w:t>6</w:t>
+              <w:t>7</w:t>
             </w:r>
           </w:hyperlink>
         </w:p>
@@ -970,7 +970,7 @@
               <w:rPr>
                 <w:noProof/>
               </w:rPr>
-              <w:t>7</w:t>
+              <w:t>8</w:t>
             </w:r>
           </w:hyperlink>
         </w:p>
@@ -1004,7 +1004,7 @@
               <w:rPr>
                 <w:noProof/>
               </w:rPr>
-              <w:t>7</w:t>
+              <w:t>8</w:t>
             </w:r>
           </w:hyperlink>
         </w:p>
@@ -1037,7 +1037,7 @@
               <w:rPr>
                 <w:noProof/>
               </w:rPr>
-              <w:t>7</w:t>
+              <w:t>8</w:t>
             </w:r>
           </w:hyperlink>
         </w:p>
@@ -1104,7 +1104,7 @@
               <w:rPr>
                 <w:noProof/>
               </w:rPr>
-              <w:t>8</w:t>
+              <w:t>9</w:t>
             </w:r>
           </w:hyperlink>
         </w:p>
@@ -1138,7 +1138,7 @@
               <w:rPr>
                 <w:noProof/>
               </w:rPr>
-              <w:t>9</w:t>
+              <w:t>10</w:t>
             </w:r>
           </w:hyperlink>
         </w:p>
@@ -1172,7 +1172,7 @@
               <w:rPr>
                 <w:noProof/>
               </w:rPr>
-              <w:t>9</w:t>
+              <w:t>10</w:t>
             </w:r>
           </w:hyperlink>
         </w:p>
@@ -1308,7 +1308,7 @@
               <w:rPr>
                 <w:noProof/>
               </w:rPr>
-              <w:t>10</w:t>
+              <w:t>11</w:t>
             </w:r>
           </w:hyperlink>
         </w:p>
@@ -1410,7 +1410,7 @@
               <w:rPr>
                 <w:noProof/>
               </w:rPr>
-              <w:t>11</w:t>
+              <w:t>12</w:t>
             </w:r>
           </w:hyperlink>
         </w:p>
@@ -1478,7 +1478,7 @@
               <w:rPr>
                 <w:noProof/>
               </w:rPr>
-              <w:t>12</w:t>
+              <w:t>13</w:t>
             </w:r>
           </w:hyperlink>
         </w:p>
@@ -1512,7 +1512,7 @@
               <w:rPr>
                 <w:noProof/>
               </w:rPr>
-              <w:t>12</w:t>
+              <w:t>13</w:t>
             </w:r>
           </w:hyperlink>
         </w:p>
@@ -1648,7 +1648,7 @@
               <w:rPr>
                 <w:noProof/>
               </w:rPr>
-              <w:t>13</w:t>
+              <w:t>14</w:t>
             </w:r>
           </w:hyperlink>
         </w:p>
@@ -1682,7 +1682,7 @@
               <w:rPr>
                 <w:noProof/>
               </w:rPr>
-              <w:t>13</w:t>
+              <w:t>14</w:t>
             </w:r>
           </w:hyperlink>
         </w:p>
@@ -1818,7 +1818,7 @@
               <w:rPr>
                 <w:noProof/>
               </w:rPr>
-              <w:t>14</w:t>
+              <w:t>15</w:t>
             </w:r>
           </w:hyperlink>
         </w:p>
@@ -1852,7 +1852,7 @@
               <w:rPr>
                 <w:noProof/>
               </w:rPr>
-              <w:t>14</w:t>
+              <w:t>15</w:t>
             </w:r>
           </w:hyperlink>
         </w:p>
@@ -1953,7 +1953,7 @@
               <w:rPr>
                 <w:noProof/>
               </w:rPr>
-              <w:t>15</w:t>
+              <w:t>16</w:t>
             </w:r>
           </w:hyperlink>
         </w:p>
@@ -2289,7 +2289,7 @@
           <w:b/>
           <w:bCs/>
         </w:rPr>
-        <w:t xml:space="preserve">CUupdate_2.2.exe</w:t>
+        <w:t xml:space="preserve">CUupdate_2.3.exe</w:t>
       </w:r>
       <w:r>
         <w:t xml:space="preserve">. The machine it runs on does not need any additional software installed — everything required is contained within the application.</w:t>
@@ -2311,7 +2311,7 @@
         <w:rPr>
           <w:rFonts w:ascii="Consolas" w:cs="Consolas" w:eastAsia="Consolas" w:hAnsi="Consolas"/>
         </w:rPr>
-        <w:t xml:space="preserve">CUupdate_2.2.exe</w:t>
+        <w:t xml:space="preserve">CUupdate_2.3.exe</w:t>
       </w:r>
       <w:r>
         <w:t xml:space="preserve"> to the machine, or run it from where it is stored.</w:t>
@@ -4413,7 +4413,7 @@
         <w:rPr>
           <w:rFonts w:ascii="Consolas" w:cs="Consolas" w:eastAsia="Consolas" w:hAnsi="Consolas"/>
         </w:rPr>
-        <w:t xml:space="preserve">CUupdate_2.2.exe</w:t>
+        <w:t xml:space="preserve">CUupdate_2.3.exe</w:t>
       </w:r>
       <w:r>
         <w:t xml:space="preserve">.</w:t>
@@ -4759,7 +4759,7 @@
         <w:rPr>
           <w:rFonts w:ascii="Consolas" w:cs="Consolas" w:eastAsia="Consolas" w:hAnsi="Consolas"/>
         </w:rPr>
-        <w:t xml:space="preserve">--- N auto-merged, M left for manual review ---</w:t>
+        <w:t xml:space="preserve">--- N auto-merged, K no CU change, M left for manual review ---</w:t>
       </w:r>
       <w:r>
         <w:t xml:space="preserve">.</w:t>
@@ -5257,7 +5257,7 @@
                 <w:b/>
                 <w:bCs/>
               </w:rPr>
-              <w:t xml:space="preserve">Manual review</w:t>
+              <w:t xml:space="preserve">No CU change</w:t>
             </w:r>
           </w:p>
         </w:tc>
@@ -5282,13 +5282,32 @@
               <w:spacing w:after="20" w:before="20"/>
             </w:pPr>
             <w:r>
-              <w:t xml:space="preserve">The A and B files are left in place in </w:t>
+              <w:t xml:space="preserve">The vendor made no change to the object in this CU, so no merge is needed. The A file is copied </w:t>
+            </w:r>
+            <w:r>
+              <w:rPr>
+                <w:b/>
+                <w:bCs/>
+              </w:rPr>
+              <w:t xml:space="preserve">unchanged</w:t>
+            </w:r>
+            <w:r>
+              <w:t xml:space="preserve"> (no stamp, no edit) to </w:t>
             </w:r>
             <w:r>
               <w:rPr>
                 <w:rFonts w:ascii="Consolas" w:cs="Consolas" w:eastAsia="Consolas" w:hAnsi="Consolas"/>
               </w:rPr>
-              <w:t xml:space="preserve">A\</w:t>
+              <w:t xml:space="preserve">&lt;job&gt;\NoCuChangesDetected\&lt;Type&gt;\</w:t>
+            </w:r>
+            <w:r>
+              <w:t xml:space="preserve">. The two source files are moved out of the worklist to </w:t>
+            </w:r>
+            <w:r>
+              <w:rPr>
+                <w:rFonts w:ascii="Consolas" w:cs="Consolas" w:eastAsia="Consolas" w:hAnsi="Consolas"/>
+              </w:rPr>
+              <w:t xml:space="preserve">&lt;job&gt;\AnoCuChange\&lt;Type&gt;\</w:t>
             </w:r>
             <w:r>
               <w:t xml:space="preserve"> and </w:t>
@@ -5297,10 +5316,19 @@
               <w:rPr>
                 <w:rFonts w:ascii="Consolas" w:cs="Consolas" w:eastAsia="Consolas" w:hAnsi="Consolas"/>
               </w:rPr>
-              <w:t xml:space="preserve">B\</w:t>
-            </w:r>
-            <w:r>
-              <w:t xml:space="preserve">.</w:t>
+              <w:t xml:space="preserve">&lt;job&gt;\BnoCuChange\&lt;Type&gt;\</w:t>
+            </w:r>
+            <w:r>
+              <w:t xml:space="preserve">, each renamed with an </w:t>
+            </w:r>
+            <w:r>
+              <w:rPr>
+                <w:rFonts w:ascii="Consolas" w:cs="Consolas" w:eastAsia="Consolas" w:hAnsi="Consolas"/>
+              </w:rPr>
+              <w:t xml:space="preserve">Unchanged_</w:t>
+            </w:r>
+            <w:r>
+              <w:t xml:space="preserve"> prefix.</w:t>
             </w:r>
           </w:p>
         </w:tc>
@@ -5334,7 +5362,7 @@
                 <w:b/>
                 <w:bCs/>
               </w:rPr>
-              <w:t xml:space="preserve">Error or unmatched</w:t>
+              <w:t xml:space="preserve">Manual review</w:t>
             </w:r>
           </w:p>
         </w:tc>
@@ -5359,6 +5387,83 @@
               <w:spacing w:after="20" w:before="20"/>
             </w:pPr>
             <w:r>
+              <w:t xml:space="preserve">The A and B files are left in place in </w:t>
+            </w:r>
+            <w:r>
+              <w:rPr>
+                <w:rFonts w:ascii="Consolas" w:cs="Consolas" w:eastAsia="Consolas" w:hAnsi="Consolas"/>
+              </w:rPr>
+              <w:t xml:space="preserve">A\</w:t>
+            </w:r>
+            <w:r>
+              <w:t xml:space="preserve"> and </w:t>
+            </w:r>
+            <w:r>
+              <w:rPr>
+                <w:rFonts w:ascii="Consolas" w:cs="Consolas" w:eastAsia="Consolas" w:hAnsi="Consolas"/>
+              </w:rPr>
+              <w:t xml:space="preserve">B\</w:t>
+            </w:r>
+            <w:r>
+              <w:t xml:space="preserve">.</w:t>
+            </w:r>
+          </w:p>
+        </w:tc>
+      </w:tr>
+      <w:tr>
+        <w:trPr>
+          <w:tblHeader w:val="false"/>
+        </w:trPr>
+        <w:tc>
+          <w:tcPr>
+            <w:tcW w:type="dxa" w:w="4680"/>
+            <w:tcBorders>
+              <w:top w:val="single" w:color="BFBFBF" w:sz="1"/>
+              <w:left w:val="single" w:color="BFBFBF" w:sz="1"/>
+              <w:bottom w:val="single" w:color="BFBFBF" w:sz="1"/>
+              <w:right w:val="single" w:color="BFBFBF" w:sz="1"/>
+            </w:tcBorders>
+            <w:tcMar>
+              <w:top w:type="dxa" w:w="60"/>
+              <w:left w:type="dxa" w:w="120"/>
+              <w:bottom w:type="dxa" w:w="60"/>
+              <w:right w:type="dxa" w:w="120"/>
+            </w:tcMar>
+          </w:tcPr>
+          <w:p>
+            <w:pPr>
+              <w:spacing w:after="20" w:before="20"/>
+            </w:pPr>
+            <w:r>
+              <w:rPr>
+                <w:b/>
+                <w:bCs/>
+              </w:rPr>
+              <w:t xml:space="preserve">Error or unmatched</w:t>
+            </w:r>
+          </w:p>
+        </w:tc>
+        <w:tc>
+          <w:tcPr>
+            <w:tcW w:type="dxa" w:w="4680"/>
+            <w:tcBorders>
+              <w:top w:val="single" w:color="BFBFBF" w:sz="1"/>
+              <w:left w:val="single" w:color="BFBFBF" w:sz="1"/>
+              <w:bottom w:val="single" w:color="BFBFBF" w:sz="1"/>
+              <w:right w:val="single" w:color="BFBFBF" w:sz="1"/>
+            </w:tcBorders>
+            <w:tcMar>
+              <w:top w:type="dxa" w:w="60"/>
+              <w:left w:type="dxa" w:w="120"/>
+              <w:bottom w:type="dxa" w:w="60"/>
+              <w:right w:type="dxa" w:w="120"/>
+            </w:tcMar>
+          </w:tcPr>
+          <w:p>
+            <w:pPr>
+              <w:spacing w:after="20" w:before="20"/>
+            </w:pPr>
+            <w:r>
               <w:t xml:space="preserve">The files are left in place and listed in the report. One faulty object never stops the batch.</w:t>
             </w:r>
           </w:p>
@@ -5415,7 +5520,65 @@
         <w:t xml:space="preserve"> is exactly the manual TortoiseMerge worklist</w:t>
       </w:r>
       <w:r>
-        <w:t xml:space="preserve">. Everything that merged automatically has been moved aside.</w:t>
+        <w:t xml:space="preserve">. Everything that merged automatically — or that needed no merge because the vendor did not touch it — has been moved aside.</w:t>
+      </w:r>
+    </w:p>
+    <w:p>
+      <w:pPr>
+        <w:spacing w:after="120"/>
+      </w:pPr>
+      <w:r>
+        <w:rPr>
+          <w:b/>
+          <w:bCs/>
+        </w:rPr>
+        <w:t xml:space="preserve">About "No CU change".</w:t>
+      </w:r>
+      <w:r>
+        <w:t xml:space="preserve"> Not every object needs merging. When the vendor ships a CU, many objects are unchanged from the version the customer originally customised; for those, the customer's object is already correct and there is nothing to carry forward. The tool recognises this by checking whether </w:t>
+      </w:r>
+      <w:r>
+        <w:rPr>
+          <w:b/>
+          <w:bCs/>
+        </w:rPr>
+        <w:t xml:space="preserve">every</w:t>
+      </w:r>
+      <w:r>
+        <w:t xml:space="preserve"> difference between A and B is explained by the customer's own tags and markers (a tagged</w:t>
+      </w:r>
+    </w:p>
+    <w:p>
+      <w:pPr>
+        <w:spacing w:after="120"/>
+      </w:pPr>
+      <w:r>
+        <w:rPr>
+          <w:rFonts w:ascii="Consolas" w:cs="Consolas" w:eastAsia="Consolas" w:hAnsi="Consolas"/>
+        </w:rPr>
+        <w:t xml:space="preserve">Start..Stop</w:t>
+      </w:r>
+      <w:r>
+        <w:t xml:space="preserve"> block, a </w:t>
+      </w:r>
+      <w:r>
+        <w:rPr>
+          <w:rFonts w:ascii="Consolas" w:cs="Consolas" w:eastAsia="Consolas" w:hAnsi="Consolas"/>
+        </w:rPr>
+        <w:t xml:space="preserve">//</w:t>
+      </w:r>
+      <w:r>
+        <w:t xml:space="preserve">-tagged line, or a customer-added variable). If so — and only if so — it treats the object as "no CU change" and copies A across untouched, saving the manual check that would otherwise confirm "nothing to do". If </w:t>
+      </w:r>
+      <w:r>
+        <w:rPr>
+          <w:b/>
+          <w:bCs/>
+        </w:rPr>
+        <w:t xml:space="preserve">any</w:t>
+      </w:r>
+      <w:r>
+        <w:t xml:space="preserve"> difference cannot be explained as a customer change, the tool assumes the vendor changed something and sends the object down the normal merge path instead, so this can never cause a real vendor change to be skipped.</w:t>
       </w:r>
     </w:p>
     <w:p>
@@ -5794,7 +5957,7 @@
         <w:rPr>
           <w:rFonts w:ascii="Consolas" w:cs="Consolas" w:eastAsia="Consolas" w:hAnsi="Consolas"/>
         </w:rPr>
-        <w:t xml:space="preserve">CUupdate_2.2.exe</w:t>
+        <w:t xml:space="preserve">CUupdate_2.3.exe</w:t>
       </w:r>
       <w:r>
         <w:t xml:space="preserve"> file. No part of this is required at run time other than the application itself.</w:t>
@@ -6228,7 +6391,7 @@
         <w:rPr>
           <w:rFonts w:ascii="Consolas" w:cs="Consolas" w:eastAsia="Consolas" w:hAnsi="Consolas"/>
         </w:rPr>
-        <w:t xml:space="preserve">CUupdate_2.2.exe</w:t>
+        <w:t xml:space="preserve">CUupdate_2.3.exe</w:t>
       </w:r>
       <w:r>
         <w:t xml:space="preserve"> file. End users are given the finished application and do not build it themselves.</w:t>
@@ -8949,7 +9112,7 @@
         <w:rPr>
           <w:rFonts w:ascii="Consolas" w:cs="Consolas" w:eastAsia="Consolas" w:hAnsi="Consolas"/>
         </w:rPr>
-        <w:t xml:space="preserve">CUupdate_2.2.exe</w:t>
+        <w:t xml:space="preserve">CUupdate_2.3.exe</w:t>
       </w:r>
       <w:r>
         <w:t xml:space="preserve">; select the folder that contains </w:t>

</xml_diff>

<commit_message>
Manual: remove binary merge/manual framing left by no-CU-change
Audit pass for logical consistency with the new third outcome. Fix 1.2
('every merge involves three objects' -> 'where a merge is produced'),
4.2 and 5.1 (merge-or-manual binaries now name the no-merge case), 5.4
(tags also drive no-CU-change recognition), 8.0 + 9 cross-references.
Rebuilt docx.
</commit_message>
<xml_diff>
--- a/docs/USER_MANUAL.docx
+++ b/docs/USER_MANUAL.docx
@@ -936,7 +936,7 @@
               <w:rPr>
                 <w:noProof/>
               </w:rPr>
-              <w:t>7</w:t>
+              <w:t>8</w:t>
             </w:r>
           </w:hyperlink>
         </w:p>
@@ -1274,7 +1274,7 @@
               <w:rPr>
                 <w:noProof/>
               </w:rPr>
-              <w:t>10</w:t>
+              <w:t>11</w:t>
             </w:r>
           </w:hyperlink>
         </w:p>
@@ -1376,7 +1376,7 @@
               <w:rPr>
                 <w:noProof/>
               </w:rPr>
-              <w:t>11</w:t>
+              <w:t>12</w:t>
             </w:r>
           </w:hyperlink>
         </w:p>
@@ -1614,7 +1614,7 @@
               <w:rPr>
                 <w:noProof/>
               </w:rPr>
-              <w:t>13</w:t>
+              <w:t>14</w:t>
             </w:r>
           </w:hyperlink>
         </w:p>
@@ -1784,7 +1784,7 @@
               <w:rPr>
                 <w:noProof/>
               </w:rPr>
-              <w:t>14</w:t>
+              <w:t>15</w:t>
             </w:r>
           </w:hyperlink>
         </w:p>
@@ -2088,7 +2088,7 @@
         <w:spacing w:after="120"/>
       </w:pPr>
       <w:r>
-        <w:t xml:space="preserve">Every merge involves three objects:</w:t>
+        <w:t xml:space="preserve">Where a merge is produced, it involves three objects:</w:t>
       </w:r>
     </w:p>
     <w:p>
@@ -2157,6 +2157,14 @@
       </w:pPr>
       <w:r>
         <w:t xml:space="preserve">C is not simply "B with a few changes." A and B are equal inputs. The tool finds where each piece of customer content belongs in B, takes that content from A, and writes both into C. B itself is never altered — it is one of two read-only inputs.</w:t>
+      </w:r>
+    </w:p>
+    <w:p>
+      <w:pPr>
+        <w:spacing w:after="120"/>
+      </w:pPr>
+      <w:r>
+        <w:t xml:space="preserve">A merge is not always required. When the vendor made no change to an object in this CU, the customer's object A is already correct and no C is produced — see "No CU change" in section 5.2.</w:t>
       </w:r>
     </w:p>
     <w:p>
@@ -4719,7 +4727,20 @@
         <w:spacing w:after="40"/>
       </w:pPr>
       <w:r>
-        <w:t xml:space="preserve">Compares A and B, classifies every difference, and decides for each object whether it can be merged automatically or must go to manual review.</w:t>
+        <w:t xml:space="preserve">Compares A and B and classifies every difference, deciding for each object whether it needs no merge at all (the vendor changed nothing), can be merged automatically, or must go to manual review.</w:t>
+      </w:r>
+    </w:p>
+    <w:p>
+      <w:pPr>
+        <w:pStyle w:val="ListParagraph"/>
+        <w:numPr>
+          <w:ilvl w:val="0"/>
+          <w:numId w:val="5"/>
+        </w:numPr>
+        <w:spacing w:after="40"/>
+      </w:pPr>
+      <w:r>
+        <w:t xml:space="preserve">For each object the vendor did not change, copies A across unchanged and moves the source files aside (see "No CU change" in section 5.2).</w:t>
       </w:r>
     </w:p>
     <w:p>
@@ -5048,7 +5069,7 @@
         <w:t xml:space="preserve">without writing or moving any files</w:t>
       </w:r>
       <w:r>
-        <w:t xml:space="preserve">. Use it to preview a job: it shows which objects will be merged automatically and which will be left for manual review, before anything is changed. When the preview is satisfactory, remove the tick and run the merge.</w:t>
+        <w:t xml:space="preserve">. Use it to preview a job: it shows which objects need no merge, which will be merged automatically, and which will be left for manual review, before anything is changed. When the preview is satisfactory, remove the tick and run the merge.</w:t>
       </w:r>
     </w:p>
     <w:p>
@@ -5779,7 +5800,7 @@
         <w:spacing w:after="120"/>
       </w:pPr>
       <w:r>
-        <w:t xml:space="preserve">The first line of the report (section 4.4) shows the customer tags the tool determined from the version lists. The version list is the curated, authoritative source for these tags, so this is the correct set in normal use. The customer tags affect only whether a customer </w:t>
+        <w:t xml:space="preserve">The first line of the report (section 4.4) shows the customer tags the tool determined from the version lists. The version list is the curated, authoritative source for these tags, so this is the correct set in normal use. The customer tags affect whether a customer </w:t>
       </w:r>
       <w:r>
         <w:rPr>
@@ -5789,7 +5810,17 @@
         <w:t xml:space="preserve">code block</w:t>
       </w:r>
       <w:r>
-        <w:t xml:space="preserve"> is recognised; caption, option, field and changelog carries do not depend on them. The report records the tags used so that the run is documented and auditable.</w:t>
+        <w:t xml:space="preserve"> is recognised during a merge, and also whether an object is recognised as needing </w:t>
+      </w:r>
+      <w:r>
+        <w:rPr>
+          <w:b/>
+          <w:bCs/>
+        </w:rPr>
+        <w:t xml:space="preserve">no merge</w:t>
+      </w:r>
+      <w:r>
+        <w:t xml:space="preserve"> at all (section 5.2 — that test attributes each difference to the customer's tags and markers); caption, option, field and changelog carries do not depend on them. The report records the tags used so that the run is documented and auditable.</w:t>
       </w:r>
     </w:p>
     <w:p>
@@ -7113,6 +7144,24 @@
     </w:p>
     <w:p>
       <w:pPr>
+        <w:spacing w:after="120"/>
+      </w:pPr>
+      <w:r>
+        <w:t xml:space="preserve">Before any per-type rule runs, the tool also applies the </w:t>
+      </w:r>
+      <w:r>
+        <w:rPr>
+          <w:b/>
+          <w:bCs/>
+        </w:rPr>
+        <w:t xml:space="preserve">no-CU-change</w:t>
+      </w:r>
+      <w:r>
+        <w:t xml:space="preserve"> check (section 5.2): for any type, if every difference between A and B is attributable to the customer's own tags and markers, the vendor changed nothing and the object is set aside as "no CU change" rather than merged. This is a short-circuit, not a per-type rule — it changes none of the rules below; it only decides that they need not run for that object.</w:t>
+      </w:r>
+    </w:p>
+    <w:p>
+      <w:pPr>
         <w:pStyle w:val="Heading2"/>
       </w:pPr>
       <w:bookmarkStart w:id="9031" w:name="_Toc_cu_31"/>
@@ -9187,8 +9236,22 @@
         <w:t xml:space="preserve">Merged\</w:t>
       </w:r>
       <w:r>
-        <w:t xml:space="preserve"> folder holds the completed objects; whatever remains in </w:t>
-      </w:r>
+        <w:t xml:space="preserve"> folder holds the completed objects; the </w:t>
+      </w:r>
+      <w:r>
+        <w:rPr>
+          <w:rFonts w:ascii="Consolas" w:cs="Consolas" w:eastAsia="Consolas" w:hAnsi="Consolas"/>
+        </w:rPr>
+        <w:t xml:space="preserve">NoCuChangesDetected\</w:t>
+      </w:r>
+      <w:r>
+        <w:t xml:space="preserve"> folder holds objects the vendor did not change (A copied across unchanged); whatever remains in</w:t>
+      </w:r>
+    </w:p>
+    <w:p>
+      <w:pPr>
+        <w:spacing w:after="120"/>
+      </w:pPr>
       <w:r>
         <w:rPr>
           <w:rFonts w:ascii="Consolas" w:cs="Consolas" w:eastAsia="Consolas" w:hAnsi="Consolas"/>
@@ -9196,13 +9259,8 @@
         <w:t xml:space="preserve">A\</w:t>
       </w:r>
       <w:r>
-        <w:t xml:space="preserve"> and</w:t>
-      </w:r>
-    </w:p>
-    <w:p>
-      <w:pPr>
-        <w:spacing w:after="120"/>
-      </w:pPr>
+        <w:t xml:space="preserve"> and </w:t>
+      </w:r>
       <w:r>
         <w:rPr>
           <w:rFonts w:ascii="Consolas" w:cs="Consolas" w:eastAsia="Consolas" w:hAnsi="Consolas"/>

</xml_diff>

<commit_message>
No-CU-change category 5: customer-token-anywhere + token-shape addendum (C10); v2.4
C10's customer work is whole appended procedures (Evaluate_WBL,
TryEvaluateDate_WBL, a '---- WBL ----' separator) carrying the WBL token
in live code - no //markers, no Start..Stop block, so categories 1-4
missed it. New category 5: a customer token anywhere as a bounded unit is
customer-attributed; in a PROCEDURE header it attributes the whole proc
span. Token shape is a global per-job addendum to the version list
(digits-optional WBL vs digits-required AP), exposed as GUI 'Prefixes
needing digits' + --cust-digits. AP digit-bounding prevents matching
inside words (Mapping/Application). Fires C10; C1201/C231/C232 still fire;
T14/T36/T77/P14/P347 still merge. Version 2.3 -> 2.4. Docs + manual
updated. Suite green.
</commit_message>
<xml_diff>
--- a/docs/USER_MANUAL.docx
+++ b/docs/USER_MANUAL.docx
@@ -676,6 +676,7 @@
               <w:tab w:val="right" w:leader="dot" w:pos="9360"/>
             </w:tabs>
             <w:spacing w:after="40"/>
+            <w:ind w:left="360"/>
             <w:rPr>
               <w:noProof/>
             </w:rPr>
@@ -685,7 +686,7 @@
               <w:rPr>
                 <w:noProof/>
               </w:rPr>
-              <w:t xml:space="preserve">5. Reading the results</w:t>
+              <w:t xml:space="preserve">4.5 Prefixes that need trailing digits</w:t>
             </w:r>
           </w:hyperlink>
           <w:r>
@@ -695,6 +696,39 @@
             <w:tab/>
           </w:r>
           <w:hyperlink w:anchor="_Toc_cu_18">
+            <w:r>
+              <w:rPr>
+                <w:noProof/>
+              </w:rPr>
+              <w:t>6</w:t>
+            </w:r>
+          </w:hyperlink>
+        </w:p>
+        <w:p>
+          <w:pPr>
+            <w:tabs>
+              <w:tab w:val="right" w:leader="dot" w:pos="9360"/>
+            </w:tabs>
+            <w:spacing w:after="40"/>
+            <w:rPr>
+              <w:noProof/>
+            </w:rPr>
+          </w:pPr>
+          <w:hyperlink w:anchor="_Toc_cu_19">
+            <w:r>
+              <w:rPr>
+                <w:noProof/>
+              </w:rPr>
+              <w:t xml:space="preserve">5. Reading the results</w:t>
+            </w:r>
+          </w:hyperlink>
+          <w:r>
+            <w:rPr>
+              <w:noProof/>
+            </w:rPr>
+            <w:tab/>
+          </w:r>
+          <w:hyperlink w:anchor="_Toc_cu_19">
             <w:r>
               <w:rPr>
                 <w:noProof/>
@@ -714,7 +748,7 @@
               <w:noProof/>
             </w:rPr>
           </w:pPr>
-          <w:hyperlink w:anchor="_Toc_cu_19">
+          <w:hyperlink w:anchor="_Toc_cu_20">
             <w:r>
               <w:rPr>
                 <w:noProof/>
@@ -728,7 +762,7 @@
             </w:rPr>
             <w:tab/>
           </w:r>
-          <w:hyperlink w:anchor="_Toc_cu_19">
+          <w:hyperlink w:anchor="_Toc_cu_20">
             <w:r>
               <w:rPr>
                 <w:noProof/>
@@ -748,7 +782,7 @@
               <w:noProof/>
             </w:rPr>
           </w:pPr>
-          <w:hyperlink w:anchor="_Toc_cu_20">
+          <w:hyperlink w:anchor="_Toc_cu_21">
             <w:r>
               <w:rPr>
                 <w:noProof/>
@@ -762,7 +796,7 @@
             </w:rPr>
             <w:tab/>
           </w:r>
-          <w:hyperlink w:anchor="_Toc_cu_20">
+          <w:hyperlink w:anchor="_Toc_cu_21">
             <w:r>
               <w:rPr>
                 <w:noProof/>
@@ -782,7 +816,7 @@
               <w:noProof/>
             </w:rPr>
           </w:pPr>
-          <w:hyperlink w:anchor="_Toc_cu_21">
+          <w:hyperlink w:anchor="_Toc_cu_22">
             <w:r>
               <w:rPr>
                 <w:noProof/>
@@ -796,7 +830,7 @@
             </w:rPr>
             <w:tab/>
           </w:r>
-          <w:hyperlink w:anchor="_Toc_cu_21">
+          <w:hyperlink w:anchor="_Toc_cu_22">
             <w:r>
               <w:rPr>
                 <w:noProof/>
@@ -816,7 +850,7 @@
               <w:noProof/>
             </w:rPr>
           </w:pPr>
-          <w:hyperlink w:anchor="_Toc_cu_22">
+          <w:hyperlink w:anchor="_Toc_cu_23">
             <w:r>
               <w:rPr>
                 <w:noProof/>
@@ -830,12 +864,12 @@
             </w:rPr>
             <w:tab/>
           </w:r>
-          <w:hyperlink w:anchor="_Toc_cu_22">
-            <w:r>
-              <w:rPr>
-                <w:noProof/>
-              </w:rPr>
-              <w:t>7</w:t>
+          <w:hyperlink w:anchor="_Toc_cu_23">
+            <w:r>
+              <w:rPr>
+                <w:noProof/>
+              </w:rPr>
+              <w:t>8</w:t>
             </w:r>
           </w:hyperlink>
         </w:p>
@@ -849,7 +883,7 @@
               <w:noProof/>
             </w:rPr>
           </w:pPr>
-          <w:hyperlink w:anchor="_Toc_cu_23">
+          <w:hyperlink w:anchor="_Toc_cu_24">
             <w:r>
               <w:rPr>
                 <w:noProof/>
@@ -863,12 +897,12 @@
             </w:rPr>
             <w:tab/>
           </w:r>
-          <w:hyperlink w:anchor="_Toc_cu_23">
-            <w:r>
-              <w:rPr>
-                <w:noProof/>
-              </w:rPr>
-              <w:t>7</w:t>
+          <w:hyperlink w:anchor="_Toc_cu_24">
+            <w:r>
+              <w:rPr>
+                <w:noProof/>
+              </w:rPr>
+              <w:t>8</w:t>
             </w:r>
           </w:hyperlink>
         </w:p>
@@ -883,7 +917,7 @@
               <w:noProof/>
             </w:rPr>
           </w:pPr>
-          <w:hyperlink w:anchor="_Toc_cu_24">
+          <w:hyperlink w:anchor="_Toc_cu_25">
             <w:r>
               <w:rPr>
                 <w:noProof/>
@@ -897,12 +931,12 @@
             </w:rPr>
             <w:tab/>
           </w:r>
-          <w:hyperlink w:anchor="_Toc_cu_24">
-            <w:r>
-              <w:rPr>
-                <w:noProof/>
-              </w:rPr>
-              <w:t>7</w:t>
+          <w:hyperlink w:anchor="_Toc_cu_25">
+            <w:r>
+              <w:rPr>
+                <w:noProof/>
+              </w:rPr>
+              <w:t>8</w:t>
             </w:r>
           </w:hyperlink>
         </w:p>
@@ -917,7 +951,7 @@
               <w:noProof/>
             </w:rPr>
           </w:pPr>
-          <w:hyperlink w:anchor="_Toc_cu_25">
+          <w:hyperlink w:anchor="_Toc_cu_26">
             <w:r>
               <w:rPr>
                 <w:noProof/>
@@ -931,7 +965,7 @@
             </w:rPr>
             <w:tab/>
           </w:r>
-          <w:hyperlink w:anchor="_Toc_cu_25">
+          <w:hyperlink w:anchor="_Toc_cu_26">
             <w:r>
               <w:rPr>
                 <w:noProof/>
@@ -951,7 +985,7 @@
               <w:noProof/>
             </w:rPr>
           </w:pPr>
-          <w:hyperlink w:anchor="_Toc_cu_26">
+          <w:hyperlink w:anchor="_Toc_cu_27">
             <w:r>
               <w:rPr>
                 <w:noProof/>
@@ -965,7 +999,7 @@
             </w:rPr>
             <w:tab/>
           </w:r>
-          <w:hyperlink w:anchor="_Toc_cu_26">
+          <w:hyperlink w:anchor="_Toc_cu_27">
             <w:r>
               <w:rPr>
                 <w:noProof/>
@@ -985,7 +1019,7 @@
               <w:noProof/>
             </w:rPr>
           </w:pPr>
-          <w:hyperlink w:anchor="_Toc_cu_27">
+          <w:hyperlink w:anchor="_Toc_cu_28">
             <w:r>
               <w:rPr>
                 <w:noProof/>
@@ -999,7 +1033,7 @@
             </w:rPr>
             <w:tab/>
           </w:r>
-          <w:hyperlink w:anchor="_Toc_cu_27">
+          <w:hyperlink w:anchor="_Toc_cu_28">
             <w:r>
               <w:rPr>
                 <w:noProof/>
@@ -1018,7 +1052,7 @@
               <w:noProof/>
             </w:rPr>
           </w:pPr>
-          <w:hyperlink w:anchor="_Toc_cu_28">
+          <w:hyperlink w:anchor="_Toc_cu_29">
             <w:r>
               <w:rPr>
                 <w:noProof/>
@@ -1032,7 +1066,7 @@
             </w:rPr>
             <w:tab/>
           </w:r>
-          <w:hyperlink w:anchor="_Toc_cu_28">
+          <w:hyperlink w:anchor="_Toc_cu_29">
             <w:r>
               <w:rPr>
                 <w:noProof/>
@@ -1051,7 +1085,7 @@
               <w:noProof/>
             </w:rPr>
           </w:pPr>
-          <w:hyperlink w:anchor="_Toc_cu_29">
+          <w:hyperlink w:anchor="_Toc_cu_30">
             <w:r>
               <w:rPr>
                 <w:noProof/>
@@ -1065,12 +1099,12 @@
             </w:rPr>
             <w:tab/>
           </w:r>
-          <w:hyperlink w:anchor="_Toc_cu_29">
-            <w:r>
-              <w:rPr>
-                <w:noProof/>
-              </w:rPr>
-              <w:t>8</w:t>
+          <w:hyperlink w:anchor="_Toc_cu_30">
+            <w:r>
+              <w:rPr>
+                <w:noProof/>
+              </w:rPr>
+              <w:t>9</w:t>
             </w:r>
           </w:hyperlink>
         </w:p>
@@ -1085,7 +1119,7 @@
               <w:noProof/>
             </w:rPr>
           </w:pPr>
-          <w:hyperlink w:anchor="_Toc_cu_30">
+          <w:hyperlink w:anchor="_Toc_cu_31">
             <w:r>
               <w:rPr>
                 <w:noProof/>
@@ -1099,7 +1133,7 @@
             </w:rPr>
             <w:tab/>
           </w:r>
-          <w:hyperlink w:anchor="_Toc_cu_30">
+          <w:hyperlink w:anchor="_Toc_cu_31">
             <w:r>
               <w:rPr>
                 <w:noProof/>
@@ -1119,7 +1153,7 @@
               <w:noProof/>
             </w:rPr>
           </w:pPr>
-          <w:hyperlink w:anchor="_Toc_cu_31">
+          <w:hyperlink w:anchor="_Toc_cu_32">
             <w:r>
               <w:rPr>
                 <w:noProof/>
@@ -1133,7 +1167,7 @@
             </w:rPr>
             <w:tab/>
           </w:r>
-          <w:hyperlink w:anchor="_Toc_cu_31">
+          <w:hyperlink w:anchor="_Toc_cu_32">
             <w:r>
               <w:rPr>
                 <w:noProof/>
@@ -1153,7 +1187,7 @@
               <w:noProof/>
             </w:rPr>
           </w:pPr>
-          <w:hyperlink w:anchor="_Toc_cu_32">
+          <w:hyperlink w:anchor="_Toc_cu_33">
             <w:r>
               <w:rPr>
                 <w:noProof/>
@@ -1167,7 +1201,7 @@
             </w:rPr>
             <w:tab/>
           </w:r>
-          <w:hyperlink w:anchor="_Toc_cu_32">
+          <w:hyperlink w:anchor="_Toc_cu_33">
             <w:r>
               <w:rPr>
                 <w:noProof/>
@@ -1187,7 +1221,7 @@
               <w:noProof/>
             </w:rPr>
           </w:pPr>
-          <w:hyperlink w:anchor="_Toc_cu_33">
+          <w:hyperlink w:anchor="_Toc_cu_34">
             <w:r>
               <w:rPr>
                 <w:noProof/>
@@ -1201,12 +1235,12 @@
             </w:rPr>
             <w:tab/>
           </w:r>
-          <w:hyperlink w:anchor="_Toc_cu_33">
-            <w:r>
-              <w:rPr>
-                <w:noProof/>
-              </w:rPr>
-              <w:t>10</w:t>
+          <w:hyperlink w:anchor="_Toc_cu_34">
+            <w:r>
+              <w:rPr>
+                <w:noProof/>
+              </w:rPr>
+              <w:t>11</w:t>
             </w:r>
           </w:hyperlink>
         </w:p>
@@ -1221,7 +1255,7 @@
               <w:noProof/>
             </w:rPr>
           </w:pPr>
-          <w:hyperlink w:anchor="_Toc_cu_34">
+          <w:hyperlink w:anchor="_Toc_cu_35">
             <w:r>
               <w:rPr>
                 <w:noProof/>
@@ -1235,12 +1269,12 @@
             </w:rPr>
             <w:tab/>
           </w:r>
-          <w:hyperlink w:anchor="_Toc_cu_34">
-            <w:r>
-              <w:rPr>
-                <w:noProof/>
-              </w:rPr>
-              <w:t>10</w:t>
+          <w:hyperlink w:anchor="_Toc_cu_35">
+            <w:r>
+              <w:rPr>
+                <w:noProof/>
+              </w:rPr>
+              <w:t>11</w:t>
             </w:r>
           </w:hyperlink>
         </w:p>
@@ -1255,7 +1289,7 @@
               <w:noProof/>
             </w:rPr>
           </w:pPr>
-          <w:hyperlink w:anchor="_Toc_cu_35">
+          <w:hyperlink w:anchor="_Toc_cu_36">
             <w:r>
               <w:rPr>
                 <w:noProof/>
@@ -1269,7 +1303,7 @@
             </w:rPr>
             <w:tab/>
           </w:r>
-          <w:hyperlink w:anchor="_Toc_cu_35">
+          <w:hyperlink w:anchor="_Toc_cu_36">
             <w:r>
               <w:rPr>
                 <w:noProof/>
@@ -1289,7 +1323,7 @@
               <w:noProof/>
             </w:rPr>
           </w:pPr>
-          <w:hyperlink w:anchor="_Toc_cu_36">
+          <w:hyperlink w:anchor="_Toc_cu_37">
             <w:r>
               <w:rPr>
                 <w:noProof/>
@@ -1303,7 +1337,7 @@
             </w:rPr>
             <w:tab/>
           </w:r>
-          <w:hyperlink w:anchor="_Toc_cu_36">
+          <w:hyperlink w:anchor="_Toc_cu_37">
             <w:r>
               <w:rPr>
                 <w:noProof/>
@@ -1323,7 +1357,7 @@
               <w:noProof/>
             </w:rPr>
           </w:pPr>
-          <w:hyperlink w:anchor="_Toc_cu_37">
+          <w:hyperlink w:anchor="_Toc_cu_38">
             <w:r>
               <w:rPr>
                 <w:noProof/>
@@ -1337,12 +1371,12 @@
             </w:rPr>
             <w:tab/>
           </w:r>
-          <w:hyperlink w:anchor="_Toc_cu_37">
-            <w:r>
-              <w:rPr>
-                <w:noProof/>
-              </w:rPr>
-              <w:t>11</w:t>
+          <w:hyperlink w:anchor="_Toc_cu_38">
+            <w:r>
+              <w:rPr>
+                <w:noProof/>
+              </w:rPr>
+              <w:t>12</w:t>
             </w:r>
           </w:hyperlink>
         </w:p>
@@ -1357,7 +1391,7 @@
               <w:noProof/>
             </w:rPr>
           </w:pPr>
-          <w:hyperlink w:anchor="_Toc_cu_38">
+          <w:hyperlink w:anchor="_Toc_cu_39">
             <w:r>
               <w:rPr>
                 <w:noProof/>
@@ -1371,7 +1405,7 @@
             </w:rPr>
             <w:tab/>
           </w:r>
-          <w:hyperlink w:anchor="_Toc_cu_38">
+          <w:hyperlink w:anchor="_Toc_cu_39">
             <w:r>
               <w:rPr>
                 <w:noProof/>
@@ -1391,7 +1425,7 @@
               <w:noProof/>
             </w:rPr>
           </w:pPr>
-          <w:hyperlink w:anchor="_Toc_cu_39">
+          <w:hyperlink w:anchor="_Toc_cu_40">
             <w:r>
               <w:rPr>
                 <w:noProof/>
@@ -1405,12 +1439,12 @@
             </w:rPr>
             <w:tab/>
           </w:r>
-          <w:hyperlink w:anchor="_Toc_cu_39">
-            <w:r>
-              <w:rPr>
-                <w:noProof/>
-              </w:rPr>
-              <w:t>12</w:t>
+          <w:hyperlink w:anchor="_Toc_cu_40">
+            <w:r>
+              <w:rPr>
+                <w:noProof/>
+              </w:rPr>
+              <w:t>13</w:t>
             </w:r>
           </w:hyperlink>
         </w:p>
@@ -1425,7 +1459,7 @@
               <w:noProof/>
             </w:rPr>
           </w:pPr>
-          <w:hyperlink w:anchor="_Toc_cu_40">
+          <w:hyperlink w:anchor="_Toc_cu_41">
             <w:r>
               <w:rPr>
                 <w:noProof/>
@@ -1439,12 +1473,12 @@
             </w:rPr>
             <w:tab/>
           </w:r>
-          <w:hyperlink w:anchor="_Toc_cu_40">
-            <w:r>
-              <w:rPr>
-                <w:noProof/>
-              </w:rPr>
-              <w:t>12</w:t>
+          <w:hyperlink w:anchor="_Toc_cu_41">
+            <w:r>
+              <w:rPr>
+                <w:noProof/>
+              </w:rPr>
+              <w:t>13</w:t>
             </w:r>
           </w:hyperlink>
         </w:p>
@@ -1459,7 +1493,7 @@
               <w:noProof/>
             </w:rPr>
           </w:pPr>
-          <w:hyperlink w:anchor="_Toc_cu_41">
+          <w:hyperlink w:anchor="_Toc_cu_42">
             <w:r>
               <w:rPr>
                 <w:noProof/>
@@ -1473,7 +1507,7 @@
             </w:rPr>
             <w:tab/>
           </w:r>
-          <w:hyperlink w:anchor="_Toc_cu_41">
+          <w:hyperlink w:anchor="_Toc_cu_42">
             <w:r>
               <w:rPr>
                 <w:noProof/>
@@ -1493,7 +1527,7 @@
               <w:noProof/>
             </w:rPr>
           </w:pPr>
-          <w:hyperlink w:anchor="_Toc_cu_42">
+          <w:hyperlink w:anchor="_Toc_cu_43">
             <w:r>
               <w:rPr>
                 <w:noProof/>
@@ -1507,7 +1541,7 @@
             </w:rPr>
             <w:tab/>
           </w:r>
-          <w:hyperlink w:anchor="_Toc_cu_42">
+          <w:hyperlink w:anchor="_Toc_cu_43">
             <w:r>
               <w:rPr>
                 <w:noProof/>
@@ -1527,7 +1561,7 @@
               <w:noProof/>
             </w:rPr>
           </w:pPr>
-          <w:hyperlink w:anchor="_Toc_cu_43">
+          <w:hyperlink w:anchor="_Toc_cu_44">
             <w:r>
               <w:rPr>
                 <w:noProof/>
@@ -1541,12 +1575,12 @@
             </w:rPr>
             <w:tab/>
           </w:r>
-          <w:hyperlink w:anchor="_Toc_cu_43">
-            <w:r>
-              <w:rPr>
-                <w:noProof/>
-              </w:rPr>
-              <w:t>13</w:t>
+          <w:hyperlink w:anchor="_Toc_cu_44">
+            <w:r>
+              <w:rPr>
+                <w:noProof/>
+              </w:rPr>
+              <w:t>14</w:t>
             </w:r>
           </w:hyperlink>
         </w:p>
@@ -1561,7 +1595,7 @@
               <w:noProof/>
             </w:rPr>
           </w:pPr>
-          <w:hyperlink w:anchor="_Toc_cu_44">
+          <w:hyperlink w:anchor="_Toc_cu_45">
             <w:r>
               <w:rPr>
                 <w:noProof/>
@@ -1575,12 +1609,12 @@
             </w:rPr>
             <w:tab/>
           </w:r>
-          <w:hyperlink w:anchor="_Toc_cu_44">
-            <w:r>
-              <w:rPr>
-                <w:noProof/>
-              </w:rPr>
-              <w:t>13</w:t>
+          <w:hyperlink w:anchor="_Toc_cu_45">
+            <w:r>
+              <w:rPr>
+                <w:noProof/>
+              </w:rPr>
+              <w:t>14</w:t>
             </w:r>
           </w:hyperlink>
         </w:p>
@@ -1595,7 +1629,7 @@
               <w:noProof/>
             </w:rPr>
           </w:pPr>
-          <w:hyperlink w:anchor="_Toc_cu_45">
+          <w:hyperlink w:anchor="_Toc_cu_46">
             <w:r>
               <w:rPr>
                 <w:noProof/>
@@ -1609,7 +1643,7 @@
             </w:rPr>
             <w:tab/>
           </w:r>
-          <w:hyperlink w:anchor="_Toc_cu_45">
+          <w:hyperlink w:anchor="_Toc_cu_46">
             <w:r>
               <w:rPr>
                 <w:noProof/>
@@ -1629,7 +1663,7 @@
               <w:noProof/>
             </w:rPr>
           </w:pPr>
-          <w:hyperlink w:anchor="_Toc_cu_46">
+          <w:hyperlink w:anchor="_Toc_cu_47">
             <w:r>
               <w:rPr>
                 <w:noProof/>
@@ -1643,7 +1677,7 @@
             </w:rPr>
             <w:tab/>
           </w:r>
-          <w:hyperlink w:anchor="_Toc_cu_46">
+          <w:hyperlink w:anchor="_Toc_cu_47">
             <w:r>
               <w:rPr>
                 <w:noProof/>
@@ -1663,7 +1697,7 @@
               <w:noProof/>
             </w:rPr>
           </w:pPr>
-          <w:hyperlink w:anchor="_Toc_cu_47">
+          <w:hyperlink w:anchor="_Toc_cu_48">
             <w:r>
               <w:rPr>
                 <w:noProof/>
@@ -1677,12 +1711,12 @@
             </w:rPr>
             <w:tab/>
           </w:r>
-          <w:hyperlink w:anchor="_Toc_cu_47">
-            <w:r>
-              <w:rPr>
-                <w:noProof/>
-              </w:rPr>
-              <w:t>14</w:t>
+          <w:hyperlink w:anchor="_Toc_cu_48">
+            <w:r>
+              <w:rPr>
+                <w:noProof/>
+              </w:rPr>
+              <w:t>15</w:t>
             </w:r>
           </w:hyperlink>
         </w:p>
@@ -1697,7 +1731,7 @@
               <w:noProof/>
             </w:rPr>
           </w:pPr>
-          <w:hyperlink w:anchor="_Toc_cu_48">
+          <w:hyperlink w:anchor="_Toc_cu_49">
             <w:r>
               <w:rPr>
                 <w:noProof/>
@@ -1711,12 +1745,12 @@
             </w:rPr>
             <w:tab/>
           </w:r>
-          <w:hyperlink w:anchor="_Toc_cu_48">
-            <w:r>
-              <w:rPr>
-                <w:noProof/>
-              </w:rPr>
-              <w:t>14</w:t>
+          <w:hyperlink w:anchor="_Toc_cu_49">
+            <w:r>
+              <w:rPr>
+                <w:noProof/>
+              </w:rPr>
+              <w:t>15</w:t>
             </w:r>
           </w:hyperlink>
         </w:p>
@@ -1731,7 +1765,7 @@
               <w:noProof/>
             </w:rPr>
           </w:pPr>
-          <w:hyperlink w:anchor="_Toc_cu_49">
+          <w:hyperlink w:anchor="_Toc_cu_50">
             <w:r>
               <w:rPr>
                 <w:noProof/>
@@ -1745,12 +1779,12 @@
             </w:rPr>
             <w:tab/>
           </w:r>
-          <w:hyperlink w:anchor="_Toc_cu_49">
-            <w:r>
-              <w:rPr>
-                <w:noProof/>
-              </w:rPr>
-              <w:t>14</w:t>
+          <w:hyperlink w:anchor="_Toc_cu_50">
+            <w:r>
+              <w:rPr>
+                <w:noProof/>
+              </w:rPr>
+              <w:t>15</w:t>
             </w:r>
           </w:hyperlink>
         </w:p>
@@ -1765,7 +1799,7 @@
               <w:noProof/>
             </w:rPr>
           </w:pPr>
-          <w:hyperlink w:anchor="_Toc_cu_50">
+          <w:hyperlink w:anchor="_Toc_cu_51">
             <w:r>
               <w:rPr>
                 <w:noProof/>
@@ -1779,7 +1813,7 @@
             </w:rPr>
             <w:tab/>
           </w:r>
-          <w:hyperlink w:anchor="_Toc_cu_50">
+          <w:hyperlink w:anchor="_Toc_cu_51">
             <w:r>
               <w:rPr>
                 <w:noProof/>
@@ -1799,7 +1833,7 @@
               <w:noProof/>
             </w:rPr>
           </w:pPr>
-          <w:hyperlink w:anchor="_Toc_cu_51">
+          <w:hyperlink w:anchor="_Toc_cu_52">
             <w:r>
               <w:rPr>
                 <w:noProof/>
@@ -1813,7 +1847,7 @@
             </w:rPr>
             <w:tab/>
           </w:r>
-          <w:hyperlink w:anchor="_Toc_cu_51">
+          <w:hyperlink w:anchor="_Toc_cu_52">
             <w:r>
               <w:rPr>
                 <w:noProof/>
@@ -1833,7 +1867,7 @@
               <w:noProof/>
             </w:rPr>
           </w:pPr>
-          <w:hyperlink w:anchor="_Toc_cu_52">
+          <w:hyperlink w:anchor="_Toc_cu_53">
             <w:r>
               <w:rPr>
                 <w:noProof/>
@@ -1847,7 +1881,7 @@
             </w:rPr>
             <w:tab/>
           </w:r>
-          <w:hyperlink w:anchor="_Toc_cu_52">
+          <w:hyperlink w:anchor="_Toc_cu_53">
             <w:r>
               <w:rPr>
                 <w:noProof/>
@@ -1867,7 +1901,7 @@
               <w:noProof/>
             </w:rPr>
           </w:pPr>
-          <w:hyperlink w:anchor="_Toc_cu_53">
+          <w:hyperlink w:anchor="_Toc_cu_54">
             <w:r>
               <w:rPr>
                 <w:noProof/>
@@ -1881,12 +1915,12 @@
             </w:rPr>
             <w:tab/>
           </w:r>
-          <w:hyperlink w:anchor="_Toc_cu_53">
-            <w:r>
-              <w:rPr>
-                <w:noProof/>
-              </w:rPr>
-              <w:t>15</w:t>
+          <w:hyperlink w:anchor="_Toc_cu_54">
+            <w:r>
+              <w:rPr>
+                <w:noProof/>
+              </w:rPr>
+              <w:t>16</w:t>
             </w:r>
           </w:hyperlink>
         </w:p>
@@ -1901,7 +1935,7 @@
               <w:noProof/>
             </w:rPr>
           </w:pPr>
-          <w:hyperlink w:anchor="_Toc_cu_54">
+          <w:hyperlink w:anchor="_Toc_cu_55">
             <w:r>
               <w:rPr>
                 <w:noProof/>
@@ -1915,12 +1949,12 @@
             </w:rPr>
             <w:tab/>
           </w:r>
-          <w:hyperlink w:anchor="_Toc_cu_54">
-            <w:r>
-              <w:rPr>
-                <w:noProof/>
-              </w:rPr>
-              <w:t>15</w:t>
+          <w:hyperlink w:anchor="_Toc_cu_55">
+            <w:r>
+              <w:rPr>
+                <w:noProof/>
+              </w:rPr>
+              <w:t>16</w:t>
             </w:r>
           </w:hyperlink>
         </w:p>
@@ -1934,7 +1968,7 @@
               <w:noProof/>
             </w:rPr>
           </w:pPr>
-          <w:hyperlink w:anchor="_Toc_cu_55">
+          <w:hyperlink w:anchor="_Toc_cu_56">
             <w:r>
               <w:rPr>
                 <w:noProof/>
@@ -1948,7 +1982,7 @@
             </w:rPr>
             <w:tab/>
           </w:r>
-          <w:hyperlink w:anchor="_Toc_cu_55">
+          <w:hyperlink w:anchor="_Toc_cu_56">
             <w:r>
               <w:rPr>
                 <w:noProof/>
@@ -2297,7 +2331,7 @@
           <w:b/>
           <w:bCs/>
         </w:rPr>
-        <w:t xml:space="preserve">CUupdate_2.3.exe</w:t>
+        <w:t xml:space="preserve">CUupdate_2.4.exe</w:t>
       </w:r>
       <w:r>
         <w:t xml:space="preserve">. The machine it runs on does not need any additional software installed — everything required is contained within the application.</w:t>
@@ -2319,7 +2353,7 @@
         <w:rPr>
           <w:rFonts w:ascii="Consolas" w:cs="Consolas" w:eastAsia="Consolas" w:hAnsi="Consolas"/>
         </w:rPr>
-        <w:t xml:space="preserve">CUupdate_2.3.exe</w:t>
+        <w:t xml:space="preserve">CUupdate_2.4.exe</w:t>
       </w:r>
       <w:r>
         <w:t xml:space="preserve"> to the machine, or run it from where it is stored.</w:t>
@@ -2929,6 +2963,74 @@
             </w:r>
             <w:r>
               <w:t xml:space="preserve">. See section 4.3.</w:t>
+            </w:r>
+          </w:p>
+        </w:tc>
+      </w:tr>
+      <w:tr>
+        <w:trPr>
+          <w:tblHeader w:val="false"/>
+        </w:trPr>
+        <w:tc>
+          <w:tcPr>
+            <w:tcW w:type="dxa" w:w="4680"/>
+            <w:tcBorders>
+              <w:top w:val="single" w:color="BFBFBF" w:sz="1"/>
+              <w:left w:val="single" w:color="BFBFBF" w:sz="1"/>
+              <w:bottom w:val="single" w:color="BFBFBF" w:sz="1"/>
+              <w:right w:val="single" w:color="BFBFBF" w:sz="1"/>
+            </w:tcBorders>
+            <w:tcMar>
+              <w:top w:type="dxa" w:w="60"/>
+              <w:left w:type="dxa" w:w="120"/>
+              <w:bottom w:type="dxa" w:w="60"/>
+              <w:right w:type="dxa" w:w="120"/>
+            </w:tcMar>
+          </w:tcPr>
+          <w:p>
+            <w:pPr>
+              <w:spacing w:after="20" w:before="20"/>
+            </w:pPr>
+            <w:r>
+              <w:rPr>
+                <w:b/>
+                <w:bCs/>
+              </w:rPr>
+              <w:t xml:space="preserve">Prefixes needing digits</w:t>
+            </w:r>
+          </w:p>
+        </w:tc>
+        <w:tc>
+          <w:tcPr>
+            <w:tcW w:type="dxa" w:w="4680"/>
+            <w:tcBorders>
+              <w:top w:val="single" w:color="BFBFBF" w:sz="1"/>
+              <w:left w:val="single" w:color="BFBFBF" w:sz="1"/>
+              <w:bottom w:val="single" w:color="BFBFBF" w:sz="1"/>
+              <w:right w:val="single" w:color="BFBFBF" w:sz="1"/>
+            </w:tcBorders>
+            <w:tcMar>
+              <w:top w:type="dxa" w:w="60"/>
+              <w:left w:type="dxa" w:w="120"/>
+              <w:bottom w:type="dxa" w:w="60"/>
+              <w:right w:type="dxa" w:w="120"/>
+            </w:tcMar>
+          </w:tcPr>
+          <w:p>
+            <w:pPr>
+              <w:spacing w:after="20" w:before="20"/>
+            </w:pPr>
+            <w:r>
+              <w:t xml:space="preserve">Optional. Comma-separated list of customer prefixes that should only be treated as a customer tag when followed by digits, for example </w:t>
+            </w:r>
+            <w:r>
+              <w:rPr>
+                <w:rFonts w:ascii="Consolas" w:cs="Consolas" w:eastAsia="Consolas" w:hAnsi="Consolas"/>
+              </w:rPr>
+              <w:t xml:space="preserve">AP</w:t>
+            </w:r>
+            <w:r>
+              <w:t xml:space="preserve">. Leave blank if not needed. See section 4.5.</w:t>
             </w:r>
           </w:p>
         </w:tc>
@@ -4421,7 +4523,7 @@
         <w:rPr>
           <w:rFonts w:ascii="Consolas" w:cs="Consolas" w:eastAsia="Consolas" w:hAnsi="Consolas"/>
         </w:rPr>
-        <w:t xml:space="preserve">CUupdate_2.3.exe</w:t>
+        <w:t xml:space="preserve">CUupdate_2.4.exe</w:t>
       </w:r>
       <w:r>
         <w:t xml:space="preserve">.</w:t>
@@ -4605,6 +4707,38 @@
       </w:r>
       <w:r>
         <w:t xml:space="preserve"> to match the customer database. See section 4.3.</w:t>
+      </w:r>
+    </w:p>
+    <w:p>
+      <w:pPr>
+        <w:pStyle w:val="ListParagraph"/>
+        <w:numPr>
+          <w:ilvl w:val="0"/>
+          <w:numId w:val="4"/>
+        </w:numPr>
+        <w:spacing w:after="40"/>
+      </w:pPr>
+      <w:r>
+        <w:t xml:space="preserve">If this customer has a short prefix that needs trailing digits (for example </w:t>
+      </w:r>
+      <w:r>
+        <w:rPr>
+          <w:rFonts w:ascii="Consolas" w:cs="Consolas" w:eastAsia="Consolas" w:hAnsi="Consolas"/>
+        </w:rPr>
+        <w:t xml:space="preserve">AP</w:t>
+      </w:r>
+      <w:r>
+        <w:t xml:space="preserve">), enter it in </w:t>
+      </w:r>
+      <w:r>
+        <w:rPr>
+          <w:b/>
+          <w:bCs/>
+        </w:rPr>
+        <w:t xml:space="preserve">Prefixes needing digits</w:t>
+      </w:r>
+      <w:r>
+        <w:t xml:space="preserve">. Otherwise leave it blank. See section 4.5.</w:t>
       </w:r>
     </w:p>
     <w:p>
@@ -5026,46 +5160,220 @@
     </w:p>
     <w:p>
       <w:pPr>
-        <w:pStyle w:val="Heading1"/>
+        <w:pStyle w:val="Heading2"/>
       </w:pPr>
       <w:bookmarkStart w:id="9018" w:name="_Toc_cu_18"/>
       <w:r>
-        <w:t xml:space="preserve">5. Reading the results</w:t>
+        <w:t xml:space="preserve">4.5 Prefixes that need trailing digits</w:t>
       </w:r>
       <w:bookmarkEnd w:id="9018"/>
     </w:p>
     <w:p>
       <w:pPr>
-        <w:pStyle w:val="Heading2"/>
-      </w:pPr>
-      <w:bookmarkStart w:id="9019" w:name="_Toc_cu_19"/>
-      <w:r>
-        <w:t xml:space="preserve">5.1 Use Dry run first</w:t>
-      </w:r>
-      <w:bookmarkEnd w:id="9019"/>
-    </w:p>
-    <w:p>
-      <w:pPr>
         <w:spacing w:after="120"/>
       </w:pPr>
       <w:r>
-        <w:t xml:space="preserve">The </w:t>
+        <w:t xml:space="preserve">This optional field controls </w:t>
       </w:r>
       <w:r>
         <w:rPr>
           <w:b/>
           <w:bCs/>
         </w:rPr>
-        <w:t xml:space="preserve">Dry run</w:t>
-      </w:r>
-      <w:r>
-        <w:t xml:space="preserve"> option classifies every object and prints the full report </w:t>
+        <w:t xml:space="preserve">how a customer prefix is recognised in the body of an object</w:t>
+      </w:r>
+      <w:r>
+        <w:t xml:space="preserve">, and works together with the automatic tags from section 4.4. It is a global setting for the job — an addendum to the version list. The version list still decides </w:t>
+      </w:r>
+      <w:r>
+        <w:rPr>
+          <w:i/>
+          <w:iCs/>
+        </w:rPr>
+        <w:t xml:space="preserve">which</w:t>
+      </w:r>
+      <w:r>
+        <w:t xml:space="preserve"> customer prefixes are in play; this field tells the tool </w:t>
+      </w:r>
+      <w:r>
+        <w:rPr>
+          <w:i/>
+          <w:iCs/>
+        </w:rPr>
+        <w:t xml:space="preserve">what each one looks like</w:t>
+      </w:r>
+      <w:r>
+        <w:t xml:space="preserve"> so it can be found wherever it appears.</w:t>
+      </w:r>
+    </w:p>
+    <w:p>
+      <w:pPr>
+        <w:spacing w:after="120"/>
+      </w:pPr>
+      <w:r>
+        <w:t xml:space="preserve">Most customer prefixes are safe to recognise on their own. </w:t>
+      </w:r>
+      <w:r>
+        <w:rPr>
+          <w:rFonts w:ascii="Consolas" w:cs="Consolas" w:eastAsia="Consolas" w:hAnsi="Consolas"/>
+        </w:rPr>
+        <w:t xml:space="preserve">WBL</w:t>
+      </w:r>
+      <w:r>
+        <w:t xml:space="preserve">, for example, is a letter combination that never occurs inside an ordinary word, so the tool can treat any appearance of</w:t>
+      </w:r>
+    </w:p>
+    <w:p>
+      <w:pPr>
+        <w:spacing w:after="120"/>
+      </w:pPr>
+      <w:r>
+        <w:rPr>
+          <w:rFonts w:ascii="Consolas" w:cs="Consolas" w:eastAsia="Consolas" w:hAnsi="Consolas"/>
+        </w:rPr>
+        <w:t xml:space="preserve">WBL</w:t>
+      </w:r>
+      <w:r>
+        <w:t xml:space="preserve"> — in a procedure name such as </w:t>
+      </w:r>
+      <w:r>
+        <w:rPr>
+          <w:rFonts w:ascii="Consolas" w:cs="Consolas" w:eastAsia="Consolas" w:hAnsi="Consolas"/>
+        </w:rPr>
+        <w:t xml:space="preserve">Evaluate_WBL</w:t>
+      </w:r>
+      <w:r>
+        <w:t xml:space="preserve">, in a comment, or as a tag — as customer-owned.</w:t>
+      </w:r>
+    </w:p>
+    <w:p>
+      <w:pPr>
+        <w:spacing w:after="120"/>
+      </w:pPr>
+      <w:r>
+        <w:t xml:space="preserve">A few prefixes are short enough that they </w:t>
+      </w:r>
+      <w:r>
+        <w:rPr>
+          <w:i/>
+          <w:iCs/>
+        </w:rPr>
+        <w:t xml:space="preserve">would</w:t>
+      </w:r>
+      <w:r>
+        <w:t xml:space="preserve"> appear inside ordinary words. </w:t>
+      </w:r>
+      <w:r>
+        <w:rPr>
+          <w:rFonts w:ascii="Consolas" w:cs="Consolas" w:eastAsia="Consolas" w:hAnsi="Consolas"/>
+        </w:rPr>
+        <w:t xml:space="preserve">AP</w:t>
+      </w:r>
+      <w:r>
+        <w:t xml:space="preserve">, for instance, occurs inside </w:t>
+      </w:r>
+      <w:r>
+        <w:rPr>
+          <w:rFonts w:ascii="Consolas" w:cs="Consolas" w:eastAsia="Consolas" w:hAnsi="Consolas"/>
+        </w:rPr>
+        <w:t xml:space="preserve">Mapping</w:t>
+      </w:r>
+      <w:r>
+        <w:t xml:space="preserve"> and </w:t>
+      </w:r>
+      <w:r>
+        <w:rPr>
+          <w:rFonts w:ascii="Consolas" w:cs="Consolas" w:eastAsia="Consolas" w:hAnsi="Consolas"/>
+        </w:rPr>
+        <w:t xml:space="preserve">Application</w:t>
+      </w:r>
+      <w:r>
+        <w:t xml:space="preserve">. For these, enter the prefix in this field. The tool will then treat the prefix as a customer tag </w:t>
       </w:r>
       <w:r>
         <w:rPr>
           <w:b/>
           <w:bCs/>
         </w:rPr>
+        <w:t xml:space="preserve">only when it is followed by digits</w:t>
+      </w:r>
+      <w:r>
+        <w:t xml:space="preserve"> (for example</w:t>
+      </w:r>
+    </w:p>
+    <w:p>
+      <w:pPr>
+        <w:spacing w:after="120"/>
+      </w:pPr>
+      <w:r>
+        <w:rPr>
+          <w:rFonts w:ascii="Consolas" w:cs="Consolas" w:eastAsia="Consolas" w:hAnsi="Consolas"/>
+        </w:rPr>
+        <w:t xml:space="preserve">AP001662</w:t>
+      </w:r>
+      <w:r>
+        <w:t xml:space="preserve">, </w:t>
+      </w:r>
+      <w:r>
+        <w:rPr>
+          <w:rFonts w:ascii="Consolas" w:cs="Consolas" w:eastAsia="Consolas" w:hAnsi="Consolas"/>
+        </w:rPr>
+        <w:t xml:space="preserve">AP_001662</w:t>
+      </w:r>
+      <w:r>
+        <w:t xml:space="preserve">), and never when it appears inside a word. List several prefixes separated by commas. Leave the field blank if no prefix needs this.</w:t>
+      </w:r>
+    </w:p>
+    <w:p>
+      <w:pPr>
+        <w:spacing w:after="120"/>
+      </w:pPr>
+      <w:r>
+        <w:t xml:space="preserve">This recognition is what allows an object whose only changes are customer-added code — for example a customer's own procedures appended to a codeunit — to be identified as needing no merge (section 5.2), even when that code carries no explicit tag comments.</w:t>
+      </w:r>
+    </w:p>
+    <w:p>
+      <w:pPr>
+        <w:pStyle w:val="Heading1"/>
+      </w:pPr>
+      <w:bookmarkStart w:id="9019" w:name="_Toc_cu_19"/>
+      <w:r>
+        <w:t xml:space="preserve">5. Reading the results</w:t>
+      </w:r>
+      <w:bookmarkEnd w:id="9019"/>
+    </w:p>
+    <w:p>
+      <w:pPr>
+        <w:pStyle w:val="Heading2"/>
+      </w:pPr>
+      <w:bookmarkStart w:id="9020" w:name="_Toc_cu_20"/>
+      <w:r>
+        <w:t xml:space="preserve">5.1 Use Dry run first</w:t>
+      </w:r>
+      <w:bookmarkEnd w:id="9020"/>
+    </w:p>
+    <w:p>
+      <w:pPr>
+        <w:spacing w:after="120"/>
+      </w:pPr>
+      <w:r>
+        <w:t xml:space="preserve">The </w:t>
+      </w:r>
+      <w:r>
+        <w:rPr>
+          <w:b/>
+          <w:bCs/>
+        </w:rPr>
+        <w:t xml:space="preserve">Dry run</w:t>
+      </w:r>
+      <w:r>
+        <w:t xml:space="preserve"> option classifies every object and prints the full report </w:t>
+      </w:r>
+      <w:r>
+        <w:rPr>
+          <w:b/>
+          <w:bCs/>
+        </w:rPr>
         <w:t xml:space="preserve">without writing or moving any files</w:t>
       </w:r>
       <w:r>
@@ -5076,11 +5384,11 @@
       <w:pPr>
         <w:pStyle w:val="Heading2"/>
       </w:pPr>
-      <w:bookmarkStart w:id="9020" w:name="_Toc_cu_20"/>
+      <w:bookmarkStart w:id="9021" w:name="_Toc_cu_21"/>
       <w:r>
         <w:t xml:space="preserve">5.2 Where the files go after a merge</w:t>
       </w:r>
-      <w:bookmarkEnd w:id="9020"/>
+      <w:bookmarkEnd w:id="9021"/>
     </w:p>
     <w:tbl>
       <w:tblPr>
@@ -5668,11 +5976,11 @@
       <w:pPr>
         <w:pStyle w:val="Heading2"/>
       </w:pPr>
-      <w:bookmarkStart w:id="9021" w:name="_Toc_cu_21"/>
+      <w:bookmarkStart w:id="9022" w:name="_Toc_cu_22"/>
       <w:r>
         <w:t xml:space="preserve">5.3 The manual-review report</w:t>
       </w:r>
-      <w:bookmarkEnd w:id="9021"/>
+      <w:bookmarkEnd w:id="9022"/>
     </w:p>
     <w:p>
       <w:pPr>
@@ -5789,11 +6097,11 @@
       <w:pPr>
         <w:pStyle w:val="Heading2"/>
       </w:pPr>
-      <w:bookmarkStart w:id="9022" w:name="_Toc_cu_22"/>
+      <w:bookmarkStart w:id="9023" w:name="_Toc_cu_23"/>
       <w:r>
         <w:t xml:space="preserve">5.4 What the report tells you about the customer tags</w:t>
       </w:r>
-      <w:bookmarkEnd w:id="9022"/>
+      <w:bookmarkEnd w:id="9023"/>
     </w:p>
     <w:p>
       <w:pPr>
@@ -5827,21 +6135,21 @@
       <w:pPr>
         <w:pStyle w:val="Heading1"/>
       </w:pPr>
-      <w:bookmarkStart w:id="9023" w:name="_Toc_cu_23"/>
+      <w:bookmarkStart w:id="9024" w:name="_Toc_cu_24"/>
       <w:r>
         <w:t xml:space="preserve">6. After the merge</w:t>
       </w:r>
-      <w:bookmarkEnd w:id="9023"/>
+      <w:bookmarkEnd w:id="9024"/>
     </w:p>
     <w:p>
       <w:pPr>
         <w:pStyle w:val="Heading2"/>
       </w:pPr>
-      <w:bookmarkStart w:id="9024" w:name="_Toc_cu_24"/>
+      <w:bookmarkStart w:id="9025" w:name="_Toc_cu_25"/>
       <w:r>
         <w:t xml:space="preserve">6.1 The automatically merged objects</w:t>
       </w:r>
-      <w:bookmarkEnd w:id="9024"/>
+      <w:bookmarkEnd w:id="9025"/>
     </w:p>
     <w:p>
       <w:pPr>
@@ -5864,11 +6172,11 @@
       <w:pPr>
         <w:pStyle w:val="Heading2"/>
       </w:pPr>
-      <w:bookmarkStart w:id="9025" w:name="_Toc_cu_25"/>
+      <w:bookmarkStart w:id="9026" w:name="_Toc_cu_26"/>
       <w:r>
         <w:t xml:space="preserve">6.2 The manual objects</w:t>
       </w:r>
-      <w:bookmarkEnd w:id="9025"/>
+      <w:bookmarkEnd w:id="9026"/>
     </w:p>
     <w:p>
       <w:pPr>
@@ -5900,11 +6208,11 @@
       <w:pPr>
         <w:pStyle w:val="Heading2"/>
       </w:pPr>
-      <w:bookmarkStart w:id="9026" w:name="_Toc_cu_26"/>
+      <w:bookmarkStart w:id="9027" w:name="_Toc_cu_27"/>
       <w:r>
         <w:t xml:space="preserve">6.3 Join the objects by type</w:t>
       </w:r>
-      <w:bookmarkEnd w:id="9026"/>
+      <w:bookmarkEnd w:id="9027"/>
     </w:p>
     <w:p>
       <w:pPr>
@@ -5918,11 +6226,11 @@
       <w:pPr>
         <w:pStyle w:val="Heading2"/>
       </w:pPr>
-      <w:bookmarkStart w:id="9027" w:name="_Toc_cu_27"/>
+      <w:bookmarkStart w:id="9028" w:name="_Toc_cu_28"/>
       <w:r>
         <w:t xml:space="preserve">6.4 Re-apply the language layer, then compile</w:t>
       </w:r>
-      <w:bookmarkEnd w:id="9027"/>
+      <w:bookmarkEnd w:id="9028"/>
     </w:p>
     <w:p>
       <w:pPr>
@@ -5963,11 +6271,11 @@
       <w:pPr>
         <w:pStyle w:val="Heading1"/>
       </w:pPr>
-      <w:bookmarkStart w:id="9028" w:name="_Toc_cu_28"/>
+      <w:bookmarkStart w:id="9029" w:name="_Toc_cu_29"/>
       <w:r>
         <w:t xml:space="preserve">7. Inside the application</w:t>
       </w:r>
-      <w:bookmarkEnd w:id="9028"/>
+      <w:bookmarkEnd w:id="9029"/>
     </w:p>
     <w:p>
       <w:pPr>
@@ -5988,7 +6296,7 @@
         <w:rPr>
           <w:rFonts w:ascii="Consolas" w:cs="Consolas" w:eastAsia="Consolas" w:hAnsi="Consolas"/>
         </w:rPr>
-        <w:t xml:space="preserve">CUupdate_2.3.exe</w:t>
+        <w:t xml:space="preserve">CUupdate_2.4.exe</w:t>
       </w:r>
       <w:r>
         <w:t xml:space="preserve"> file. No part of this is required at run time other than the application itself.</w:t>
@@ -6422,7 +6730,7 @@
         <w:rPr>
           <w:rFonts w:ascii="Consolas" w:cs="Consolas" w:eastAsia="Consolas" w:hAnsi="Consolas"/>
         </w:rPr>
-        <w:t xml:space="preserve">CUupdate_2.3.exe</w:t>
+        <w:t xml:space="preserve">CUupdate_2.4.exe</w:t>
       </w:r>
       <w:r>
         <w:t xml:space="preserve"> file. End users are given the finished application and do not build it themselves.</w:t>
@@ -6432,11 +6740,11 @@
       <w:pPr>
         <w:pStyle w:val="Heading1"/>
       </w:pPr>
-      <w:bookmarkStart w:id="9029" w:name="_Toc_cu_29"/>
+      <w:bookmarkStart w:id="9030" w:name="_Toc_cu_30"/>
       <w:r>
         <w:t xml:space="preserve">8. Rules Index by object type</w:t>
       </w:r>
-      <w:bookmarkEnd w:id="9029"/>
+      <w:bookmarkEnd w:id="9030"/>
     </w:p>
     <w:p>
       <w:pPr>
@@ -6536,11 +6844,11 @@
       <w:pPr>
         <w:pStyle w:val="Heading2"/>
       </w:pPr>
-      <w:bookmarkStart w:id="9030" w:name="_Toc_cu_30"/>
+      <w:bookmarkStart w:id="9031" w:name="_Toc_cu_31"/>
       <w:r>
         <w:t xml:space="preserve">8.0 Object-type dispatch (all object types)</w:t>
       </w:r>
-      <w:bookmarkEnd w:id="9030"/>
+      <w:bookmarkEnd w:id="9031"/>
     </w:p>
     <w:p>
       <w:pPr>
@@ -7164,11 +7472,11 @@
       <w:pPr>
         <w:pStyle w:val="Heading2"/>
       </w:pPr>
-      <w:bookmarkStart w:id="9031" w:name="_Toc_cu_31"/>
+      <w:bookmarkStart w:id="9032" w:name="_Toc_cu_32"/>
       <w:r>
         <w:t xml:space="preserve">8.1 Table</w:t>
       </w:r>
-      <w:bookmarkEnd w:id="9031"/>
+      <w:bookmarkEnd w:id="9032"/>
     </w:p>
     <w:p>
       <w:pPr>
@@ -7182,11 +7490,11 @@
       <w:pPr>
         <w:pStyle w:val="Heading3"/>
       </w:pPr>
-      <w:bookmarkStart w:id="9032" w:name="_Toc_cu_32"/>
+      <w:bookmarkStart w:id="9033" w:name="_Toc_cu_33"/>
       <w:r>
         <w:t xml:space="preserve">8.1.1 Customer field added to a vendor table — CARRY (field graft)</w:t>
       </w:r>
-      <w:bookmarkEnd w:id="9032"/>
+      <w:bookmarkEnd w:id="9033"/>
     </w:p>
     <w:p>
       <w:pPr>
@@ -7297,11 +7605,11 @@
       <w:pPr>
         <w:pStyle w:val="Heading3"/>
       </w:pPr>
-      <w:bookmarkStart w:id="9033" w:name="_Toc_cu_33"/>
+      <w:bookmarkStart w:id="9034" w:name="_Toc_cu_34"/>
       <w:r>
         <w:t xml:space="preserve">8.1.2 A whole customer procedure added to a vendor table — CARRY (procedure graft)</w:t>
       </w:r>
-      <w:bookmarkEnd w:id="9033"/>
+      <w:bookmarkEnd w:id="9034"/>
     </w:p>
     <w:p>
       <w:pPr>
@@ -7380,11 +7688,11 @@
       <w:pPr>
         <w:pStyle w:val="Heading3"/>
       </w:pPr>
-      <w:bookmarkStart w:id="9034" w:name="_Toc_cu_34"/>
+      <w:bookmarkStart w:id="9035" w:name="_Toc_cu_35"/>
       <w:r>
         <w:t xml:space="preserve">8.1.3 A changelog entry takes priority over a misleading vendor tag — CARRY</w:t>
       </w:r>
-      <w:bookmarkEnd w:id="9034"/>
+      <w:bookmarkEnd w:id="9035"/>
     </w:p>
     <w:p>
       <w:pPr>
@@ -7427,11 +7735,11 @@
       <w:pPr>
         <w:pStyle w:val="Heading3"/>
       </w:pPr>
-      <w:bookmarkStart w:id="9035" w:name="_Toc_cu_35"/>
+      <w:bookmarkStart w:id="9036" w:name="_Toc_cu_36"/>
       <w:r>
         <w:t xml:space="preserve">8.1.4 A whole field, present only in A, with no tag and no changelog entry — MANUAL</w:t>
       </w:r>
-      <w:bookmarkEnd w:id="9035"/>
+      <w:bookmarkEnd w:id="9036"/>
     </w:p>
     <w:p>
       <w:pPr>
@@ -7465,11 +7773,11 @@
       <w:pPr>
         <w:pStyle w:val="Heading3"/>
       </w:pPr>
-      <w:bookmarkStart w:id="9036" w:name="_Toc_cu_36"/>
+      <w:bookmarkStart w:id="9037" w:name="_Toc_cu_37"/>
       <w:r>
         <w:t xml:space="preserve">8.1.5 A customer code block inside a changed shared field or trigger — the scorer decides</w:t>
       </w:r>
-      <w:bookmarkEnd w:id="9036"/>
+      <w:bookmarkEnd w:id="9037"/>
     </w:p>
     <w:p>
       <w:pPr>
@@ -7658,11 +7966,11 @@
       <w:pPr>
         <w:pStyle w:val="Heading3"/>
       </w:pPr>
-      <w:bookmarkStart w:id="9037" w:name="_Toc_cu_37"/>
+      <w:bookmarkStart w:id="9038" w:name="_Toc_cu_38"/>
       <w:r>
         <w:t xml:space="preserve">8.1.5a A carried code block lands in its own procedure, even when the anchor text repeats</w:t>
       </w:r>
-      <w:bookmarkEnd w:id="9037"/>
+      <w:bookmarkEnd w:id="9038"/>
     </w:p>
     <w:p>
       <w:pPr>
@@ -7768,11 +8076,11 @@
       <w:pPr>
         <w:pStyle w:val="Heading3"/>
       </w:pPr>
-      <w:bookmarkStart w:id="9038" w:name="_Toc_cu_38"/>
+      <w:bookmarkStart w:id="9039" w:name="_Toc_cu_39"/>
       <w:r>
         <w:t xml:space="preserve">8.1.5b A code block at the very end of a procedure, with only END; lines around it</w:t>
       </w:r>
-      <w:bookmarkEnd w:id="9038"/>
+      <w:bookmarkEnd w:id="9039"/>
     </w:p>
     <w:p>
       <w:pPr>
@@ -7925,11 +8233,11 @@
       <w:pPr>
         <w:pStyle w:val="Heading3"/>
       </w:pPr>
-      <w:bookmarkStart w:id="9039" w:name="_Toc_cu_39"/>
+      <w:bookmarkStart w:id="9040" w:name="_Toc_cu_40"/>
       <w:r>
         <w:t xml:space="preserve">8.1.5c A code block that sits just outside a block of code, not inside it</w:t>
       </w:r>
-      <w:bookmarkEnd w:id="9039"/>
+      <w:bookmarkEnd w:id="9040"/>
     </w:p>
     <w:p>
       <w:pPr>
@@ -8134,11 +8442,11 @@
       <w:pPr>
         <w:pStyle w:val="Heading3"/>
       </w:pPr>
-      <w:bookmarkStart w:id="9040" w:name="_Toc_cu_40"/>
+      <w:bookmarkStart w:id="9041" w:name="_Toc_cu_41"/>
       <w:r>
         <w:t xml:space="preserve">8.1.6 A caption or option change — CARRY (always take the customer value)</w:t>
       </w:r>
-      <w:bookmarkEnd w:id="9040"/>
+      <w:bookmarkEnd w:id="9041"/>
     </w:p>
     <w:p>
       <w:pPr>
@@ -8258,11 +8566,11 @@
       <w:pPr>
         <w:pStyle w:val="Heading3"/>
       </w:pPr>
-      <w:bookmarkStart w:id="9041" w:name="_Toc_cu_41"/>
+      <w:bookmarkStart w:id="9042" w:name="_Toc_cu_42"/>
       <w:r>
         <w:t xml:space="preserve">8.1.7 A field with both a code change and an option change — both are carried</w:t>
       </w:r>
-      <w:bookmarkEnd w:id="9041"/>
+      <w:bookmarkEnd w:id="9042"/>
     </w:p>
     <w:p>
       <w:pPr>
@@ -8296,11 +8604,11 @@
       <w:pPr>
         <w:pStyle w:val="Heading3"/>
       </w:pPr>
-      <w:bookmarkStart w:id="9042" w:name="_Toc_cu_42"/>
+      <w:bookmarkStart w:id="9043" w:name="_Toc_cu_43"/>
       <w:r>
         <w:t xml:space="preserve">8.1.8 Customer variable declarations — CARRY (keep rather than delete)</w:t>
       </w:r>
-      <w:bookmarkEnd w:id="9042"/>
+      <w:bookmarkEnd w:id="9043"/>
     </w:p>
     <w:p>
       <w:pPr>
@@ -8343,11 +8651,11 @@
       <w:pPr>
         <w:pStyle w:val="Heading3"/>
       </w:pPr>
-      <w:bookmarkStart w:id="9043" w:name="_Toc_cu_43"/>
+      <w:bookmarkStart w:id="9044" w:name="_Toc_cu_44"/>
       <w:r>
         <w:t xml:space="preserve">8.1.9 A customer-extended option-string variable — CARRY</w:t>
       </w:r>
-      <w:bookmarkEnd w:id="9043"/>
+      <w:bookmarkEnd w:id="9044"/>
     </w:p>
     <w:p>
       <w:pPr>
@@ -8390,11 +8698,11 @@
       <w:pPr>
         <w:pStyle w:val="Heading3"/>
       </w:pPr>
-      <w:bookmarkStart w:id="9044" w:name="_Toc_cu_44"/>
+      <w:bookmarkStart w:id="9045" w:name="_Toc_cu_45"/>
       <w:r>
         <w:t xml:space="preserve">8.1.10 Header and changelog bookkeeping (every automatic merge)</w:t>
       </w:r>
-      <w:bookmarkEnd w:id="9044"/>
+      <w:bookmarkEnd w:id="9045"/>
     </w:p>
     <w:p>
       <w:pPr>
@@ -8505,11 +8813,11 @@
       <w:pPr>
         <w:pStyle w:val="Heading3"/>
       </w:pPr>
-      <w:bookmarkStart w:id="9045" w:name="_Toc_cu_45"/>
+      <w:bookmarkStart w:id="9046" w:name="_Toc_cu_46"/>
       <w:r>
         <w:t xml:space="preserve">8.1.11 Differences in tag spelling are standardised</w:t>
       </w:r>
-      <w:bookmarkEnd w:id="9045"/>
+      <w:bookmarkEnd w:id="9046"/>
     </w:p>
     <w:p>
       <w:pPr>
@@ -8560,11 +8868,11 @@
       <w:pPr>
         <w:pStyle w:val="Heading2"/>
       </w:pPr>
-      <w:bookmarkStart w:id="9046" w:name="_Toc_cu_46"/>
+      <w:bookmarkStart w:id="9047" w:name="_Toc_cu_47"/>
       <w:r>
         <w:t xml:space="preserve">8.2 Codeunit</w:t>
       </w:r>
-      <w:bookmarkEnd w:id="9046"/>
+      <w:bookmarkEnd w:id="9047"/>
     </w:p>
     <w:p>
       <w:pPr>
@@ -8678,11 +8986,11 @@
       <w:pPr>
         <w:pStyle w:val="Heading2"/>
       </w:pPr>
-      <w:bookmarkStart w:id="9047" w:name="_Toc_cu_47"/>
+      <w:bookmarkStart w:id="9048" w:name="_Toc_cu_48"/>
       <w:r>
         <w:t xml:space="preserve">8.3 Page</w:t>
       </w:r>
-      <w:bookmarkEnd w:id="9047"/>
+      <w:bookmarkEnd w:id="9048"/>
     </w:p>
     <w:p>
       <w:pPr>
@@ -8696,11 +9004,11 @@
       <w:pPr>
         <w:pStyle w:val="Heading3"/>
       </w:pPr>
-      <w:bookmarkStart w:id="9048" w:name="_Toc_cu_48"/>
+      <w:bookmarkStart w:id="9049" w:name="_Toc_cu_49"/>
       <w:r>
         <w:t xml:space="preserve">8.3.1 A control added by the customer — CARRY (graft)</w:t>
       </w:r>
-      <w:bookmarkEnd w:id="9048"/>
+      <w:bookmarkEnd w:id="9049"/>
     </w:p>
     <w:p>
       <w:pPr>
@@ -8754,11 +9062,11 @@
       <w:pPr>
         <w:pStyle w:val="Heading3"/>
       </w:pPr>
-      <w:bookmarkStart w:id="9049" w:name="_Toc_cu_49"/>
+      <w:bookmarkStart w:id="9050" w:name="_Toc_cu_50"/>
       <w:r>
         <w:t xml:space="preserve">8.3.2 A vendor caption rename — TAKE B (do not carry the outdated customer caption)</w:t>
       </w:r>
-      <w:bookmarkEnd w:id="9049"/>
+      <w:bookmarkEnd w:id="9050"/>
     </w:p>
     <w:p>
       <w:pPr>
@@ -8792,11 +9100,11 @@
       <w:pPr>
         <w:pStyle w:val="Heading3"/>
       </w:pPr>
-      <w:bookmarkStart w:id="9050" w:name="_Toc_cu_50"/>
+      <w:bookmarkStart w:id="9051" w:name="_Toc_cu_51"/>
       <w:r>
         <w:t xml:space="preserve">8.3.3 A control present only in A, carrying only a vendor tag — MANUAL</w:t>
       </w:r>
-      <w:bookmarkEnd w:id="9050"/>
+      <w:bookmarkEnd w:id="9051"/>
     </w:p>
     <w:p>
       <w:pPr>
@@ -8840,11 +9148,11 @@
       <w:pPr>
         <w:pStyle w:val="Heading3"/>
       </w:pPr>
-      <w:bookmarkStart w:id="9051" w:name="_Toc_cu_51"/>
+      <w:bookmarkStart w:id="9052" w:name="_Toc_cu_52"/>
       <w:r>
         <w:t xml:space="preserve">8.3.4 A customer change to a property on a shared control — MANUAL</w:t>
       </w:r>
-      <w:bookmarkEnd w:id="9051"/>
+      <w:bookmarkEnd w:id="9052"/>
     </w:p>
     <w:p>
       <w:pPr>
@@ -8919,11 +9227,11 @@
       <w:pPr>
         <w:pStyle w:val="Heading3"/>
       </w:pPr>
-      <w:bookmarkStart w:id="9052" w:name="_Toc_cu_52"/>
+      <w:bookmarkStart w:id="9053" w:name="_Toc_cu_53"/>
       <w:r>
         <w:t xml:space="preserve">8.3.5 Caption capture on a page stops at the closing brace</w:t>
       </w:r>
-      <w:bookmarkEnd w:id="9052"/>
+      <w:bookmarkEnd w:id="9053"/>
     </w:p>
     <w:p>
       <w:pPr>
@@ -8954,11 +9262,11 @@
       <w:pPr>
         <w:pStyle w:val="Heading2"/>
       </w:pPr>
-      <w:bookmarkStart w:id="9053" w:name="_Toc_cu_53"/>
+      <w:bookmarkStart w:id="9054" w:name="_Toc_cu_54"/>
       <w:r>
         <w:t xml:space="preserve">8.4 Report and XMLport</w:t>
       </w:r>
-      <w:bookmarkEnd w:id="9053"/>
+      <w:bookmarkEnd w:id="9054"/>
     </w:p>
     <w:p>
       <w:pPr>
@@ -8980,11 +9288,11 @@
       <w:pPr>
         <w:pStyle w:val="Heading2"/>
       </w:pPr>
-      <w:bookmarkStart w:id="9054" w:name="_Toc_cu_54"/>
+      <w:bookmarkStart w:id="9055" w:name="_Toc_cu_55"/>
       <w:r>
         <w:t xml:space="preserve">8.5 Rules that apply to all object types</w:t>
       </w:r>
-      <w:bookmarkEnd w:id="9054"/>
+      <w:bookmarkEnd w:id="9055"/>
     </w:p>
     <w:p>
       <w:pPr>
@@ -9137,11 +9445,11 @@
       <w:pPr>
         <w:pStyle w:val="Heading1"/>
       </w:pPr>
-      <w:bookmarkStart w:id="9055" w:name="_Toc_cu_55"/>
+      <w:bookmarkStart w:id="9056" w:name="_Toc_cu_56"/>
       <w:r>
         <w:t xml:space="preserve">9. Quick reference</w:t>
       </w:r>
-      <w:bookmarkEnd w:id="9055"/>
+      <w:bookmarkEnd w:id="9056"/>
     </w:p>
     <w:p>
       <w:pPr>
@@ -9161,7 +9469,7 @@
         <w:rPr>
           <w:rFonts w:ascii="Consolas" w:cs="Consolas" w:eastAsia="Consolas" w:hAnsi="Consolas"/>
         </w:rPr>
-        <w:t xml:space="preserve">CUupdate_2.3.exe</w:t>
+        <w:t xml:space="preserve">CUupdate_2.4.exe</w:t>
       </w:r>
       <w:r>
         <w:t xml:space="preserve">; select the folder that contains </w:t>

</xml_diff>